<commit_message>
Use Case Diagrams Complete
</commit_message>
<xml_diff>
--- a/SDS_Communications.docx
+++ b/SDS_Communications.docx
@@ -543,8 +543,16 @@
               <w:rPr>
                 <w:color w:val="000000"/>
               </w:rPr>
-              <w:t>Darien, Victor, Ola, Clarize</w:t>
-            </w:r>
+              <w:t xml:space="preserve">Darien, Victor, Ola, </w:t>
+            </w:r>
+            <w:proofErr w:type="spellStart"/>
+            <w:r>
+              <w:rPr>
+                <w:color w:val="000000"/>
+              </w:rPr>
+              <w:t>Clarize</w:t>
+            </w:r>
+            <w:proofErr w:type="spellEnd"/>
           </w:p>
         </w:tc>
       </w:tr>
@@ -4455,7 +4463,23 @@
           <w:rFonts w:eastAsia="Arial"/>
           <w:color w:val="000000" w:themeColor="text1"/>
         </w:rPr>
-        <w:t>3.1.1.4, 3.1.1.5, 3.1.1.12, 3.1.1.14, 3.1.2.3, 3.2.3, 3.3.10</w:t>
+        <w:t>3.1.1.4, 3.1.1.5, 3.1.1.12, 3.1.</w:t>
+      </w:r>
+      <w:proofErr w:type="gramStart"/>
+      <w:r>
+        <w:rPr>
+          <w:rFonts w:eastAsia="Arial"/>
+          <w:color w:val="000000" w:themeColor="text1"/>
+        </w:rPr>
+        <w:t>1.14</w:t>
+      </w:r>
+      <w:proofErr w:type="gramEnd"/>
+      <w:r>
+        <w:rPr>
+          <w:rFonts w:eastAsia="Arial"/>
+          <w:color w:val="000000" w:themeColor="text1"/>
+        </w:rPr>
+        <w:t>, 3.1.2.3, 3.2.3, 3.3.10</w:t>
       </w:r>
     </w:p>
     <w:p>
@@ -4912,7 +4936,23 @@
           <w:rFonts w:eastAsia="Arial"/>
           <w:color w:val="000000" w:themeColor="text1"/>
         </w:rPr>
-        <w:t>Relevant requirements: 3.1.3.6 , 3.1.1.13, 3.1.2.4, 3.1.2.5, 3.1.3.6, 3.3.6</w:t>
+        <w:t>Relevant requirements: 3.1.3.6 , 3.1.</w:t>
+      </w:r>
+      <w:proofErr w:type="gramStart"/>
+      <w:r>
+        <w:rPr>
+          <w:rFonts w:eastAsia="Arial"/>
+          <w:color w:val="000000" w:themeColor="text1"/>
+        </w:rPr>
+        <w:t>1.13</w:t>
+      </w:r>
+      <w:proofErr w:type="gramEnd"/>
+      <w:r>
+        <w:rPr>
+          <w:rFonts w:eastAsia="Arial"/>
+          <w:color w:val="000000" w:themeColor="text1"/>
+        </w:rPr>
+        <w:t>, 3.1.2.4, 3.1.2.5, 3.1.3.6, 3.3.6</w:t>
       </w:r>
     </w:p>
     <w:p>
@@ -7107,7 +7147,15 @@
         <w:ind w:left="1440"/>
       </w:pPr>
       <w:r>
-        <w:t>Relevant Requirements: 3.1.1.2, 3.1.1.3, 3.1.1.8, 3.1.3.2, 3.1.3.3, 3.1.3.3.1, 3.1.3.3.2, 3.1.3.4, 3.1.3.5, 3.1.4.1.2, 3.1.4.1.1, 3.2.2, 3.3.3.1, 3.3.4</w:t>
+        <w:t>Relevant Requirements: 3.1.1.2, 3.1.1.3, 3.1.1.8, 3.1.3.2, 3.1.3.3, 3.1.3.3</w:t>
+      </w:r>
+      <w:proofErr w:type="gramStart"/>
+      <w:r>
+        <w:t>.1, 3.1.3.3.2, 3.1.3.4</w:t>
+      </w:r>
+      <w:proofErr w:type="gramEnd"/>
+      <w:r>
+        <w:t>, 3.1.3.5, 3.1.4.1.2, 3.1.4.1.1, 3.2.2, 3.3.3.1, 3.3.4</w:t>
       </w:r>
     </w:p>
     <w:p>
@@ -7316,7 +7364,15 @@
         </w:numPr>
       </w:pPr>
       <w:r>
-        <w:t>Server queues a message for offline members</w:t>
+        <w:t xml:space="preserve">Server queues </w:t>
+      </w:r>
+      <w:proofErr w:type="gramStart"/>
+      <w:r>
+        <w:t>a message</w:t>
+      </w:r>
+      <w:proofErr w:type="gramEnd"/>
+      <w:r>
+        <w:t xml:space="preserve"> for offline members</w:t>
       </w:r>
     </w:p>
     <w:p>
@@ -8555,7 +8611,6 @@
       <w:bookmarkStart w:id="22" w:name="_Toc222478439"/>
       <w:bookmarkStart w:id="23" w:name="_Toc223255452"/>
       <w:bookmarkStart w:id="24" w:name="_Toc224291124"/>
-      <w:commentRangeStart w:id="25"/>
       <w:r>
         <w:t>Communications App Use Case Diagram</w:t>
       </w:r>
@@ -8695,7 +8750,7 @@
         <w:rPr>
           <w:noProof/>
         </w:rPr>
-        <w:t>bLPDRnen4BtxLqo9LBK7KYL74aL9ILIj1A5AGa-vcDrPiBfhKzjBoh_lZ6sMZwKqvH3OzRmtRpwTM-UbzKrT2V6CTeKMhg_lbijAvT8heszkG3fuVdWImqgXziTEXwFinAdn2xHi8dDlx1UOkk23lwB1z69pTAU3STVYKWWwGkWDJLqtEl73ZY-cxG-bGxXNScvbtGkwnmdtjMeGxdAsT20jWfmvRsLySHviNoRt4o4-FQCkO8pEoJb-ZXoP-3GoSvWqFhmOJU9pfkDZnY1fymKqfDX5q5JmPte1_HlE3vnLIkFvp5G5368Ab5usdiG4b9OrmgkMv7ifdNipjX22SGIdlmC8iYWvP9IRUgPqY5g8Q4BrsV5mvV6t7ymuv07yGAlAzJ4eWtRL3ImMLmSaz8euChsIbIfWI8zKPIKhrqNFBQ8-n8UNhAA3tqH7AVg7ztlbbfLSmuErnfAMqdIm9tsFqCUCP_gm8AU1twOPo9LKbPnL-9y1F-8Rl2miocBJ1maxW0VjgKt0nPwXttMg_49HFo2VfknmPQUf-2tWLVzgqAu5dVHJwGVmtPgSUlRG9efkhMAReWEBS-N83-Ktz2m1IifjBNs-K7eE1-XtjCYZYMWYBqsZYoFOa_bwGjzOcirMGjHLaSnjCjxTAmvwl4gOvqqcHJseurHtwKugQobP2pEQifE_jiOfuCsCqrRCVxemV4xDDPZ6mwpndiSlgk3vda1ROsOZTig_yrGKRw2YJKCmGLRzRhtfb3bVTS9iMG-2smifBXC32qDRPyafIULA_72skq4SxMOggzHhqCXUfLtJzYeDVAH-evQb6yGtZWbDMRBFBTj-v-mKAWb7dkbZviTKDpbxBvigeJziWQUY7LR68HSXJcFA48SwplOZvRnG_bqeHRe3E2mUpt0pnVgib0mbJNSUhGdAtxXbvLsypngkLOkvmXK9KNh6_KYigI6XjAPEpeNOt9T_evi48SbtYN7cMYwt8MEVRLc9fwKzfes6_qtQOe-7udwAahkYffTXP7Er32hQq3OJ9cuf6FwVuWy0</w:t>
+        <w:t>dLPDRnen4BtxLupIGyc1LhdI52K2GbQ2a2vTJboStO5OMkojxGtbttTixnU1j4aZHG7Fl9atRpwK6sEvjkKkPso9-WKrN5_V5aKkKcw5aiCXS0FBISn6kK1fprb7iuWf-upwRPTW9Z-UMgM_Gc9y8lSdE2HNZ7schp3Y1WthBL5cC4TZ-1QX3z73E5f5u-HsTkdvp2FMcwajB4hh7sQBy3sIuMla8d2TFaD9AKm09ITXf_4YUQmYJbalngqmbfWvNluvdj3pIk0UHi_SmZsPbJvuqsfqxn0y2oRA7jB4encLGb-5XBeWbbn1V-Y4Wa-vaFZbIUKP388CGXQbDS0zLSbt26l9YMR1ZTahdJ56k3xz30a-05y2oKbUgTez2UbbPgpoeLO1UJrgbLAPyAD4VQ3Mqck_os2mrOYI7AytYbgMgbpfx_vj22kUYmny1OnAgOHqNCrnHLN00KoaTKOJFEdphYMzJ2hIZNqjVtbMowHXt19-vNF4_D_K1n2ZBRM4G9g5JhWnQPaxPZxaR04DDQSzQAIanb9ogo0dd2ej8o_dVCoIZ6GZnmhYPUgCLY-wR1CsIioZkkVsK22rd10RfVTSjqYgU1vrTAcMKcCgy8KmbLyhJBrQNN6-MVnj6vtkgXHhkGlWaDa9C-QM4_UZmJV7Kdakj0SKAFfvDB6IrYBLcD7E2vuRHawdnEbt8wgCRddeev0RTIBOzF9CMjhAKyMCQzXQGbKCKA-cMfK5SzxzjbS-VksKXK9FLlbaB1oULhjEkoXG6ezWxhNVYHzNqz8DLtNbpAeTjuIcLBj--eB6mXGvFzHQ6D-GxbqvIvBkJASb1dDCBSboqPRee1UmAMNgBuG3TFal2vgfpS5Jg6jnG--bUcSTDVLg3J2Ze-HIKvnGXf_Qfijj7NGvKnIjAPpEUJlMyPp2rpWTdFss-5LbP7xVyDSCQKgSK4IAvzRTMOkmoTNUX64RqZqBCMYWNzqMUXasSIPQAtrMdZU0aNpftDCF0ElYxxZ8IutlWqB0DWlz8N30FgY_JlCRA3-nxgJyHyPwJ6he3Msk-u_a3m00</w:t>
       </w:r>
     </w:p>
     <w:p>
@@ -8719,38 +8774,21 @@
       </w:r>
     </w:p>
     <w:p>
-      <w:pPr>
-        <w:rPr>
-          <w:noProof/>
-        </w:rPr>
-      </w:pPr>
       <w:hyperlink r:id="rId12" w:history="1">
         <w:r>
           <w:rPr>
             <w:rStyle w:val="Hyperlink"/>
-            <w:noProof/>
           </w:rPr>
-          <w:t>https://img.plantuml.biz/plantuml/svg/bLPDRnen4BtxLqo9LBK7KYL74aL9ILIj1A5AGa-vcDrPiBfhKzjBoh_lZ6sMZwKqvH3OzRmtRpwTM-UbzKrT2V6CTeKMhg_lbijAvT8heszkG3fuVdWImqgXziTEXwFinAdn2xHi8dDlx1UOkk23lwB1z69pTAU3STVYKWWwGkWDJLqtEl73ZY-cxG-bGxXNScvbtGkwnmdtjMeGxdAsT20jWfmvRsLySHviNoRt4o4-FQCkO8pEoJb-ZXoP-3GoSvWqFhmOJU9pfkDZnY1fymKqfDX5q5JmPte1_HlE3vnLIkFvp5G5368Ab5usdiG4b9OrmgkMv7ifdNipjX22SGIdlmC8iYWvP9IRUgPqY5g8Q4BrsV5mvV6t7ymuv07yGAlAzJ4eWtRL3ImMLmSaz8euChsIbIfWI8zKPIKhrqNFBQ8-n8UNhAA3tqH7AVg7ztlbbfLSmuErnfAMqdIm9tsFqCUCP_gm8AU1twOPo9LKbPnL-9y1F-8Rl2miocBJ1maxW0VjgKt0nPwXttMg_49HFo2VfknmPQUf-2tWLVzgqAu5dVHJwGVmtPgSUlRG9efkhMAReWEBS-N83-Ktz2m1IifjBNs-K7eE1-XtjCYZYMWYBqsZYoFOa_bwGjzOcirMGjHLaSnjCjxTAmvwl4gOvqqcHJseurHtwKugQobP2pEQifE_jiOfuCsCqrRCVxemV4xDDPZ6mwpndiSlgk3vda1ROsOZTig_yrGKRw2YJKCmGLRzRhtfb3bVTS9iMG-2smifBXC32qDRPyafIULA_72skq4SxMOggzHhqCXUfLtJzYeDVAH-evQb6yGtZWbDMRBFBTj-v-</w:t>
+          <w:t>https://img.plantuml.biz/plantuml/svg/dLPDRnen4BtxLupIGyc1LhdI52K2GbQ2a2vTJboStO5OMkojxGtbttTixnU1j4aZHG7Fl9atRpwK6sEvjkKkPso9-WKrN5_V5aKkKcw5aiCXS0FBISn6kK1fprb7iuWf-upwRPTW9Z-UMgM_Gc9y8lSdE2HNZ7schp3Y1WthBL5cC4TZ-1QX3z73E5f5u-HsTkdvp2FMcwajB4hh7sQBy3sIuMla8d2TFaD9AKm09ITXf_4YUQmYJbalngqmbfWvNluvdj3pIk0UHi_SmZsPbJvuqsfqxn0y2oRA7jB4encLGb-5XBeWbbn1V-Y4Wa-vaFZbIUKP388CGXQbDS0zLSbt26l9YMR1ZTahdJ56k3xz30a-05y2oKbUgTez2UbbPgpoeLO1UJrgbLAPyAD4VQ3Mqck_os2mrOYI7AytYbgMgbpfx_vj22kUYmny1OnAgOHqNCrnHLN00KoaTKOJFEdphYMzJ2hIZNqjVtbMowHXt19-vNF4_D_K1n2ZBRM4G9g5JhWnQPaxPZxaR04DDQSzQAIanb9ogo0dd2ej8o_dVCoIZ6GZnmhYPUgCLY-wR1CsIioZkkVsK22rd10RfVTSjqYgU1vrTAcMKcCgy8KmbLyhJBrQNN6-MVnj6vtkgXHhkGlWaDa9C-QM4_UZmJV7Kdakj0SKAFfvDB6IrYBLcD7E2vuRHawdnEbt8wgCRddeev0RTIBOzF9CMjhAKyMCQ</w:t>
         </w:r>
         <w:r>
           <w:rPr>
             <w:rStyle w:val="Hyperlink"/>
-            <w:noProof/>
           </w:rPr>
           <w:lastRenderedPageBreak/>
-          <w:t>mKAWb7dkbZviTKDpbxBvigeJziWQUY7LR68HSXJcFA48SwplOZvRnG_bqeHRe3E2mUpt0pnVgib0mbJNSUhGdAtxXbvLsypngkLOkvmXK9KNh6_KYigI6XjAPEpeNOt9T_evi48SbtYN7cMYwt8MEVRLc9fwKzfes6_qtQOe-7udwAahkYffTXP7Er32hQq3OJ9cuf6FwVuWy0</w:t>
+          <w:t>zXQGbKCKA-cMfK5SzxzjbS-VksKXK9FLlbaB1oULhjEkoXG6ezWxhNVYHzNqz8DLtNbpAeTjuIcLBj--eB6mXGvFzHQ6D-GxbqvIvBkJASb1dDCBSboqPRee1UmAMNgBuG3TFal2vgfpS5Jg6jnG--bUcSTDVLg3J2Ze-HIKvnGXf_Qfijj7NGvKnIjAPpEUJlMyPp2rpWTdFss-5LbP7xVyDSCQKgSK4IAvzRTMOkmoTNUX64RqZqBCMYWNzqMUXasSIPQAtrMdZU0aNpftDCF0ElYxxZ8IutlWqB0DWlz8N30FgY_JlCRA3-nxgJyHyPwJ6he3Msk-u_a3m00</w:t>
         </w:r>
       </w:hyperlink>
-      <w:commentRangeEnd w:id="25"/>
-      <w:r>
-        <w:rPr>
-          <w:rStyle w:val="CommentReference"/>
-          <w:noProof/>
-          <w:sz w:val="20"/>
-          <w:szCs w:val="20"/>
-        </w:rPr>
-        <w:commentReference w:id="25"/>
-      </w:r>
     </w:p>
     <w:p>
       <w:pPr>
@@ -8782,11 +8820,11 @@
           <w:numId w:val="3"/>
         </w:numPr>
       </w:pPr>
-      <w:bookmarkStart w:id="26" w:name="_Toc224291125"/>
+      <w:bookmarkStart w:id="25" w:name="_Toc224291125"/>
       <w:r>
         <w:t>Send Message (Individual) Use Case Diagram</w:t>
       </w:r>
-      <w:bookmarkEnd w:id="26"/>
+      <w:bookmarkEnd w:id="25"/>
     </w:p>
     <w:p>
       <w:r>
@@ -8825,7 +8863,7 @@
                     <pic:cNvPicPr/>
                   </pic:nvPicPr>
                   <pic:blipFill>
-                    <a:blip r:embed="rId17"/>
+                    <a:blip r:embed="rId13"/>
                     <a:stretch>
                       <a:fillRect/>
                     </a:stretch>
@@ -8856,23 +8894,20 @@
           <w:numId w:val="3"/>
         </w:numPr>
       </w:pPr>
-      <w:bookmarkStart w:id="27" w:name="_Toc224291126"/>
+      <w:bookmarkStart w:id="26" w:name="_Toc224291126"/>
       <w:r>
         <w:t>Create Group Use Case Diagram</w:t>
       </w:r>
-      <w:bookmarkEnd w:id="27"/>
+      <w:bookmarkEnd w:id="26"/>
     </w:p>
     <w:p/>
     <w:p>
       <w:r>
+        <w:lastRenderedPageBreak/>
         <w:t xml:space="preserve">Encoding for the Use Case: </w:t>
       </w:r>
       <w:r>
-        <w:t>RLBTQi8m5Bu_Jt7mIc6owQM8M69N1aAtrZv0rXmqq2KbIIVkwNSQTTfjDmd9ztj2rZv85xgF1g0azqaEbykaRHjTow2jMQrGUYpJ0aIZoOJ_KB5z0La7wnwnyj6WtyvODRj29KbN7uGqIYiPo0zfSm1Z0-6eAbCK2IyB54MQx5BCYhnwnR58dkPJaKr6CP8F5q7oxeFZ359zEWhfoIykQR6FVy2jtQCsKRdBDpd0</w:t>
-      </w:r>
-      <w:r>
-        <w:lastRenderedPageBreak/>
-        <w:t>M3ZY4fWvsxMJw9W1L3ESJbVzF9mUHs6XPoL0VnUnx0hLqS6VBL0SP61MXipXryAV1dS31ujIAOwPHwiphQ3GESFbtpfo9-WlRnqsshUDF5smWVspDhBHNpJ8Z-gRyrxxm4qD7UzPaQJiqVo9-KK4M9DH_TVu1W00</w:t>
+        <w:t>RLBTQi8m5Bu_Jt7mIc6owQM8M69N1aAtrZv0rXmqq2KbIIVkwNSQTTfjDmd9ztj2rZv85xgF1g0azqaEbykaRHjTow2jMQrGUYpJ0aIZoOJ_KB5z0La7wnwnyj6WtyvODRj29KbN7uGqIYiPo0zfSm1Z0-6eAbCK2IyB54MQx5BCYhnwnR58dkPJaKr6CP8F5q7oxeFZ359zEWhfoIykQR6FVy2jtQCsKRdBDpd0M3ZY4fWvsxMJw9W1L3ESJbVzF9mUHs6XPoL0VnUnx0hLqS6VBL0SP61MXipXryAV1dS31ujIAOwPHwiphQ3GESFbtpfo9-WlRnqsshUDF5smWVspDhBHNpJ8Z-gRyrxxm4qD7UzPaQJiqVo9-KK4M9DH_TVu1W00</w:t>
       </w:r>
     </w:p>
     <w:p/>
@@ -8902,7 +8937,7 @@
                     <pic:cNvPicPr/>
                   </pic:nvPicPr>
                   <pic:blipFill>
-                    <a:blip r:embed="rId18"/>
+                    <a:blip r:embed="rId14"/>
                     <a:stretch>
                       <a:fillRect/>
                     </a:stretch>
@@ -8931,11 +8966,11 @@
           <w:numId w:val="3"/>
         </w:numPr>
       </w:pPr>
-      <w:bookmarkStart w:id="28" w:name="_Toc224291127"/>
+      <w:bookmarkStart w:id="27" w:name="_Toc224291127"/>
       <w:r>
         <w:t>Log In Use Case Diagram</w:t>
       </w:r>
-      <w:bookmarkEnd w:id="28"/>
+      <w:bookmarkEnd w:id="27"/>
     </w:p>
     <w:p/>
     <w:p>
@@ -8977,7 +9012,7 @@
                     <pic:cNvPicPr/>
                   </pic:nvPicPr>
                   <pic:blipFill>
-                    <a:blip r:embed="rId19"/>
+                    <a:blip r:embed="rId15"/>
                     <a:stretch>
                       <a:fillRect/>
                     </a:stretch>
@@ -9007,11 +9042,11 @@
           <w:numId w:val="3"/>
         </w:numPr>
       </w:pPr>
-      <w:bookmarkStart w:id="29" w:name="_Toc224291128"/>
+      <w:bookmarkStart w:id="28" w:name="_Toc224291128"/>
       <w:r>
         <w:t>Log out Use Case Diagram</w:t>
       </w:r>
-      <w:bookmarkEnd w:id="29"/>
+      <w:bookmarkEnd w:id="28"/>
     </w:p>
     <w:p/>
     <w:p>
@@ -9053,7 +9088,7 @@
                     <pic:cNvPicPr/>
                   </pic:nvPicPr>
                   <pic:blipFill>
-                    <a:blip r:embed="rId20">
+                    <a:blip r:embed="rId16">
                       <a:extLst>
                         <a:ext uri="{28A0092B-C50C-407E-A947-70E740481C1C}">
                           <a14:useLocalDpi xmlns:a14="http://schemas.microsoft.com/office/drawing/2010/main"/>
@@ -9089,11 +9124,11 @@
           <w:numId w:val="3"/>
         </w:numPr>
       </w:pPr>
-      <w:bookmarkStart w:id="30" w:name="_Toc224291129"/>
+      <w:bookmarkStart w:id="29" w:name="_Toc224291129"/>
       <w:r>
         <w:t>Search Users Use Case Diagram</w:t>
       </w:r>
-      <w:bookmarkEnd w:id="30"/>
+      <w:bookmarkEnd w:id="29"/>
     </w:p>
     <w:p/>
     <w:p>
@@ -9134,7 +9169,7 @@
                     <pic:cNvPicPr/>
                   </pic:nvPicPr>
                   <pic:blipFill>
-                    <a:blip r:embed="rId21">
+                    <a:blip r:embed="rId17">
                       <a:extLst>
                         <a:ext uri="{28A0092B-C50C-407E-A947-70E740481C1C}">
                           <a14:useLocalDpi xmlns:a14="http://schemas.microsoft.com/office/drawing/2010/main"/>
@@ -9171,10 +9206,7 @@
       </w:pPr>
       <w:r>
         <w:lastRenderedPageBreak/>
-        <w:t>Register</w:t>
-      </w:r>
-      <w:r>
-        <w:t xml:space="preserve"> Users Use Case Diagram</w:t>
+        <w:t>Register Users Use Case Diagram</w:t>
       </w:r>
     </w:p>
     <w:p/>
@@ -9215,7 +9247,7 @@
                     <pic:cNvPicPr preferRelativeResize="0"/>
                   </pic:nvPicPr>
                   <pic:blipFill>
-                    <a:blip r:embed="rId22"/>
+                    <a:blip r:embed="rId18"/>
                     <a:srcRect/>
                     <a:stretch>
                       <a:fillRect/>
@@ -9253,14 +9285,7 @@
           <w:bCs/>
         </w:rPr>
         <w:lastRenderedPageBreak/>
-        <w:t>CA06-RU</w:t>
-      </w:r>
-      <w:r>
-        <w:rPr>
-          <w:b/>
-          <w:bCs/>
-        </w:rPr>
-        <w:t xml:space="preserve"> Code:</w:t>
+        <w:t>CA06-RU Code:</w:t>
       </w:r>
     </w:p>
     <w:p>
@@ -9326,7 +9351,23 @@
     </w:p>
     <w:p>
       <w:r>
-        <w:t>CLI --&gt; REG : User selects\n"Register User"\nand inputs credentials</w:t>
+        <w:t>CLI --&gt; REG : User selects\</w:t>
+      </w:r>
+      <w:proofErr w:type="spellStart"/>
+      <w:r>
+        <w:t>n"Register</w:t>
+      </w:r>
+      <w:proofErr w:type="spellEnd"/>
+      <w:r>
+        <w:t xml:space="preserve"> User"\</w:t>
+      </w:r>
+      <w:proofErr w:type="spellStart"/>
+      <w:r>
+        <w:t>nand</w:t>
+      </w:r>
+      <w:proofErr w:type="spellEnd"/>
+      <w:r>
+        <w:t xml:space="preserve"> inputs credentials</w:t>
       </w:r>
     </w:p>
     <w:p>
@@ -9393,10 +9434,7 @@
         </w:numPr>
       </w:pPr>
       <w:r>
-        <w:t xml:space="preserve">Send Message (Group) </w:t>
-      </w:r>
-      <w:r>
-        <w:t>Use Case Diagram</w:t>
+        <w:t>Send Message (Group) Use Case Diagram</w:t>
       </w:r>
     </w:p>
     <w:p/>
@@ -9469,7 +9507,7 @@
                     <pic:cNvPicPr preferRelativeResize="0"/>
                   </pic:nvPicPr>
                   <pic:blipFill>
-                    <a:blip r:embed="rId23"/>
+                    <a:blip r:embed="rId19"/>
                     <a:srcRect/>
                     <a:stretch>
                       <a:fillRect/>
@@ -9640,7 +9678,15 @@
     </w:p>
     <w:p>
       <w:r>
-        <w:t>CLI --&gt; SM : User selects group chat\nand types message</w:t>
+        <w:t>CLI --&gt; SM : User selects group chat\</w:t>
+      </w:r>
+      <w:proofErr w:type="spellStart"/>
+      <w:r>
+        <w:t>nand</w:t>
+      </w:r>
+      <w:proofErr w:type="spellEnd"/>
+      <w:r>
+        <w:t xml:space="preserve"> types message</w:t>
       </w:r>
     </w:p>
     <w:p>
@@ -9675,7 +9721,15 @@
     </w:p>
     <w:p>
       <w:r>
-        <w:t>LOG .&gt; CLI : Update chatbox / console</w:t>
+        <w:t xml:space="preserve">LOG .&gt; CLI : Update </w:t>
+      </w:r>
+      <w:proofErr w:type="spellStart"/>
+      <w:r>
+        <w:t>chatbox</w:t>
+      </w:r>
+      <w:proofErr w:type="spellEnd"/>
+      <w:r>
+        <w:t xml:space="preserve"> / console</w:t>
       </w:r>
     </w:p>
     <w:p/>
@@ -9735,7 +9789,10 @@
         </w:numPr>
       </w:pPr>
       <w:r>
-        <w:t>Send Message (Group) Use Case Diagram</w:t>
+        <w:t>View Chat History</w:t>
+      </w:r>
+      <w:r>
+        <w:t xml:space="preserve"> Use Case Diagram</w:t>
       </w:r>
     </w:p>
     <w:p>
@@ -9823,7 +9880,7 @@
                     <pic:cNvPicPr preferRelativeResize="0"/>
                   </pic:nvPicPr>
                   <pic:blipFill>
-                    <a:blip r:embed="rId24"/>
+                    <a:blip r:embed="rId20"/>
                     <a:srcRect/>
                     <a:stretch>
                       <a:fillRect/>
@@ -9859,14 +9916,7 @@
           <w:b/>
           <w:bCs/>
         </w:rPr>
-        <w:t>CA08-VCH</w:t>
-      </w:r>
-      <w:r>
-        <w:rPr>
-          <w:b/>
-          <w:bCs/>
-        </w:rPr>
-        <w:t xml:space="preserve"> Code:</w:t>
+        <w:t>CA08-VCH Code:</w:t>
       </w:r>
     </w:p>
     <w:p>
@@ -9910,7 +9960,15 @@
     </w:p>
     <w:p>
       <w:r>
-        <w:t>(Retrieve Stored Messages) as RET</w:t>
+        <w:t>(</w:t>
+      </w:r>
+      <w:proofErr w:type="gramStart"/>
+      <w:r>
+        <w:t>Retrieve</w:t>
+      </w:r>
+      <w:proofErr w:type="gramEnd"/>
+      <w:r>
+        <w:t xml:space="preserve"> Stored Messages) as RET</w:t>
       </w:r>
     </w:p>
     <w:p>
@@ -9952,7 +10010,15 @@
     </w:p>
     <w:p>
       <w:r>
-        <w:t>DM --&gt; CLI : Display scrollable\nchat history</w:t>
+        <w:t>DM --&gt; CLI : Display scrollable\</w:t>
+      </w:r>
+      <w:proofErr w:type="spellStart"/>
+      <w:r>
+        <w:t>nchat</w:t>
+      </w:r>
+      <w:proofErr w:type="spellEnd"/>
+      <w:r>
+        <w:t xml:space="preserve"> history</w:t>
       </w:r>
     </w:p>
     <w:p/>
@@ -9994,7 +10060,10 @@
         </w:numPr>
       </w:pPr>
       <w:r>
-        <w:t>Send Message (Group) Use Case Diagram</w:t>
+        <w:t>Read Chat Logs</w:t>
+      </w:r>
+      <w:r>
+        <w:t xml:space="preserve"> Use Case Diagram</w:t>
       </w:r>
     </w:p>
     <w:p/>
@@ -10068,7 +10137,7 @@
                     <pic:cNvPicPr preferRelativeResize="0"/>
                   </pic:nvPicPr>
                   <pic:blipFill>
-                    <a:blip r:embed="rId25"/>
+                    <a:blip r:embed="rId21"/>
                     <a:srcRect/>
                     <a:stretch>
                       <a:fillRect/>
@@ -10111,14 +10180,7 @@
           <w:b/>
           <w:bCs/>
         </w:rPr>
-        <w:t>CA09-RCL</w:t>
-      </w:r>
-      <w:r>
-        <w:rPr>
-          <w:b/>
-          <w:bCs/>
-        </w:rPr>
-        <w:t xml:space="preserve"> Code:</w:t>
+        <w:t>CA09-RCL Code:</w:t>
       </w:r>
     </w:p>
     <w:p>
@@ -10168,7 +10230,15 @@
     </w:p>
     <w:p>
       <w:r>
-        <w:t>(Retrieve Log Files) as RET</w:t>
+        <w:t>(</w:t>
+      </w:r>
+      <w:proofErr w:type="gramStart"/>
+      <w:r>
+        <w:t>Retrieve</w:t>
+      </w:r>
+      <w:proofErr w:type="gramEnd"/>
+      <w:r>
+        <w:t xml:space="preserve"> Log Files) as RET</w:t>
       </w:r>
     </w:p>
     <w:p>
@@ -10195,7 +10265,15 @@
     </w:p>
     <w:p>
       <w:r>
-        <w:t>CLI --&gt; RCL : User selects\n"View Chat Logs" function</w:t>
+        <w:t>CLI --&gt; RCL : User selects\</w:t>
+      </w:r>
+      <w:proofErr w:type="spellStart"/>
+      <w:r>
+        <w:t>n"View</w:t>
+      </w:r>
+      <w:proofErr w:type="spellEnd"/>
+      <w:r>
+        <w:t xml:space="preserve"> Chat Logs" function</w:t>
       </w:r>
     </w:p>
     <w:p>
@@ -10220,7 +10298,15 @@
     </w:p>
     <w:p>
       <w:r>
-        <w:t>DISP --&gt; CLI : Display requested\nchat logs</w:t>
+        <w:t>DISP --&gt; CLI : Display requested\</w:t>
+      </w:r>
+      <w:proofErr w:type="spellStart"/>
+      <w:r>
+        <w:t>nchat</w:t>
+      </w:r>
+      <w:proofErr w:type="spellEnd"/>
+      <w:r>
+        <w:t xml:space="preserve"> logs</w:t>
       </w:r>
     </w:p>
     <w:p>
@@ -10267,7 +10353,10 @@
         </w:numPr>
       </w:pPr>
       <w:r>
-        <w:t>Send Message (Group) Use Case Diagram</w:t>
+        <w:t>Receive Message</w:t>
+      </w:r>
+      <w:r>
+        <w:t xml:space="preserve"> Use Case Diagram</w:t>
       </w:r>
     </w:p>
     <w:p/>
@@ -10335,7 +10424,7 @@
                     <pic:cNvPicPr preferRelativeResize="0"/>
                   </pic:nvPicPr>
                   <pic:blipFill>
-                    <a:blip r:embed="rId26"/>
+                    <a:blip r:embed="rId22"/>
                     <a:srcRect/>
                     <a:stretch>
                       <a:fillRect/>
@@ -10371,14 +10460,7 @@
           <w:b/>
           <w:bCs/>
         </w:rPr>
-        <w:t>CA10-RM</w:t>
-      </w:r>
-      <w:r>
-        <w:rPr>
-          <w:b/>
-          <w:bCs/>
-        </w:rPr>
-        <w:t xml:space="preserve"> Code:</w:t>
+        <w:t>CA10-RM Code:</w:t>
       </w:r>
     </w:p>
     <w:p>
@@ -10588,18 +10670,18 @@
           <w:numId w:val="3"/>
         </w:numPr>
       </w:pPr>
-      <w:bookmarkStart w:id="31" w:name="_Object_Candidates_and"/>
-      <w:bookmarkStart w:id="32" w:name="_Toc222478440"/>
-      <w:bookmarkStart w:id="33" w:name="_Toc223255453"/>
-      <w:bookmarkStart w:id="34" w:name="_Toc224291130"/>
-      <w:bookmarkEnd w:id="31"/>
+      <w:bookmarkStart w:id="30" w:name="_Object_Candidates_and"/>
+      <w:bookmarkStart w:id="31" w:name="_Toc222478440"/>
+      <w:bookmarkStart w:id="32" w:name="_Toc223255453"/>
+      <w:bookmarkStart w:id="33" w:name="_Toc224291130"/>
+      <w:bookmarkEnd w:id="30"/>
       <w:r>
         <w:lastRenderedPageBreak/>
         <w:t>Object Candidates and Class Diagrams</w:t>
       </w:r>
+      <w:bookmarkEnd w:id="31"/>
       <w:bookmarkEnd w:id="32"/>
       <w:bookmarkEnd w:id="33"/>
-      <w:bookmarkEnd w:id="34"/>
     </w:p>
     <w:p>
       <w:pPr>
@@ -10609,15 +10691,15 @@
           <w:numId w:val="3"/>
         </w:numPr>
       </w:pPr>
-      <w:bookmarkStart w:id="35" w:name="_Toc222478441"/>
-      <w:bookmarkStart w:id="36" w:name="_Toc223255454"/>
-      <w:bookmarkStart w:id="37" w:name="_Toc224291131"/>
+      <w:bookmarkStart w:id="34" w:name="_Toc222478441"/>
+      <w:bookmarkStart w:id="35" w:name="_Toc223255454"/>
+      <w:bookmarkStart w:id="36" w:name="_Toc224291131"/>
       <w:r>
         <w:t>Object Candidates</w:t>
       </w:r>
+      <w:bookmarkEnd w:id="34"/>
       <w:bookmarkEnd w:id="35"/>
       <w:bookmarkEnd w:id="36"/>
-      <w:bookmarkEnd w:id="37"/>
     </w:p>
     <w:p>
       <w:pPr>
@@ -10644,9 +10726,11 @@
       <w:pPr>
         <w:ind w:left="1440"/>
       </w:pPr>
+      <w:proofErr w:type="spellStart"/>
       <w:r>
         <w:t>AdminPanel</w:t>
       </w:r>
+      <w:proofErr w:type="spellEnd"/>
     </w:p>
     <w:p>
       <w:pPr>
@@ -10732,15 +10816,15 @@
           <w:numId w:val="3"/>
         </w:numPr>
       </w:pPr>
-      <w:bookmarkStart w:id="38" w:name="_Toc222478442"/>
-      <w:bookmarkStart w:id="39" w:name="_Toc223255455"/>
-      <w:bookmarkStart w:id="40" w:name="_Toc224291132"/>
+      <w:bookmarkStart w:id="37" w:name="_Toc222478442"/>
+      <w:bookmarkStart w:id="38" w:name="_Toc223255455"/>
+      <w:bookmarkStart w:id="39" w:name="_Toc224291132"/>
       <w:r>
         <w:t>Class Diagrams</w:t>
       </w:r>
+      <w:bookmarkEnd w:id="37"/>
       <w:bookmarkEnd w:id="38"/>
       <w:bookmarkEnd w:id="39"/>
-      <w:bookmarkEnd w:id="40"/>
     </w:p>
     <w:p>
       <w:pPr>
@@ -10750,18 +10834,18 @@
           <w:numId w:val="3"/>
         </w:numPr>
       </w:pPr>
-      <w:bookmarkStart w:id="41" w:name="_UML_Sequence_Diagrams"/>
-      <w:bookmarkStart w:id="42" w:name="_Toc222478443"/>
-      <w:bookmarkStart w:id="43" w:name="_Toc223255456"/>
-      <w:bookmarkStart w:id="44" w:name="_Toc224291133"/>
-      <w:bookmarkEnd w:id="41"/>
+      <w:bookmarkStart w:id="40" w:name="_UML_Sequence_Diagrams"/>
+      <w:bookmarkStart w:id="41" w:name="_Toc222478443"/>
+      <w:bookmarkStart w:id="42" w:name="_Toc223255456"/>
+      <w:bookmarkStart w:id="43" w:name="_Toc224291133"/>
+      <w:bookmarkEnd w:id="40"/>
       <w:r>
         <w:lastRenderedPageBreak/>
         <w:t>UML Sequence Diagrams</w:t>
       </w:r>
+      <w:bookmarkEnd w:id="41"/>
       <w:bookmarkEnd w:id="42"/>
       <w:bookmarkEnd w:id="43"/>
-      <w:bookmarkEnd w:id="44"/>
     </w:p>
     <w:p>
       <w:pPr>
@@ -10771,18 +10855,18 @@
           <w:numId w:val="3"/>
         </w:numPr>
       </w:pPr>
-      <w:bookmarkStart w:id="45" w:name="_Toc222478444"/>
-      <w:bookmarkStart w:id="46" w:name="_Toc223255457"/>
-      <w:bookmarkStart w:id="47" w:name="_Toc224291134"/>
+      <w:bookmarkStart w:id="44" w:name="_Toc222478444"/>
+      <w:bookmarkStart w:id="45" w:name="_Toc223255457"/>
+      <w:bookmarkStart w:id="46" w:name="_Toc224291134"/>
       <w:r>
         <w:t xml:space="preserve">User Actor and the Communication </w:t>
       </w:r>
+      <w:bookmarkEnd w:id="44"/>
+      <w:r>
+        <w:t>Application</w:t>
+      </w:r>
       <w:bookmarkEnd w:id="45"/>
-      <w:r>
-        <w:t>Application</w:t>
-      </w:r>
       <w:bookmarkEnd w:id="46"/>
-      <w:bookmarkEnd w:id="47"/>
     </w:p>
     <w:p/>
     <w:p>
@@ -10806,7 +10890,7 @@
                     <pic:cNvPicPr/>
                   </pic:nvPicPr>
                   <pic:blipFill>
-                    <a:blip r:embed="rId27">
+                    <a:blip r:embed="rId23">
                       <a:extLst>
                         <a:ext uri="{28A0092B-C50C-407E-A947-70E740481C1C}">
                           <a14:useLocalDpi xmlns:a14="http://schemas.microsoft.com/office/drawing/2010/main"/>
@@ -10841,18 +10925,18 @@
           <w:numId w:val="3"/>
         </w:numPr>
       </w:pPr>
-      <w:bookmarkStart w:id="48" w:name="_Toc222478445"/>
-      <w:bookmarkStart w:id="49" w:name="_Toc223255458"/>
-      <w:bookmarkStart w:id="50" w:name="_Toc224291135"/>
+      <w:bookmarkStart w:id="47" w:name="_Toc222478445"/>
+      <w:bookmarkStart w:id="48" w:name="_Toc223255458"/>
+      <w:bookmarkStart w:id="49" w:name="_Toc224291135"/>
       <w:r>
         <w:t xml:space="preserve">IT User Actor and the Communication </w:t>
       </w:r>
+      <w:bookmarkEnd w:id="47"/>
+      <w:r>
+        <w:t>Application</w:t>
+      </w:r>
       <w:bookmarkEnd w:id="48"/>
-      <w:r>
-        <w:t>Application</w:t>
-      </w:r>
       <w:bookmarkEnd w:id="49"/>
-      <w:bookmarkEnd w:id="50"/>
     </w:p>
     <w:p/>
     <w:p>
@@ -10877,7 +10961,7 @@
                     <pic:cNvPicPr/>
                   </pic:nvPicPr>
                   <pic:blipFill>
-                    <a:blip r:embed="rId28">
+                    <a:blip r:embed="rId24">
                       <a:extLst>
                         <a:ext uri="{28A0092B-C50C-407E-A947-70E740481C1C}">
                           <a14:useLocalDpi xmlns:a14="http://schemas.microsoft.com/office/drawing/2010/main"/>
@@ -10912,14 +10996,14 @@
           <w:numId w:val="3"/>
         </w:numPr>
       </w:pPr>
-      <w:bookmarkStart w:id="51" w:name="_Toc223255459"/>
-      <w:bookmarkStart w:id="52" w:name="_Toc224291136"/>
+      <w:bookmarkStart w:id="50" w:name="_Toc223255459"/>
+      <w:bookmarkStart w:id="51" w:name="_Toc224291136"/>
       <w:r>
         <w:lastRenderedPageBreak/>
         <w:t>Application</w:t>
       </w:r>
+      <w:bookmarkEnd w:id="50"/>
       <w:bookmarkEnd w:id="51"/>
-      <w:bookmarkEnd w:id="52"/>
     </w:p>
     <w:p>
       <w:r>
@@ -10942,7 +11026,7 @@
                     <pic:cNvPicPr/>
                   </pic:nvPicPr>
                   <pic:blipFill>
-                    <a:blip r:embed="rId29">
+                    <a:blip r:embed="rId25">
                       <a:extLst>
                         <a:ext uri="{28A0092B-C50C-407E-A947-70E740481C1C}">
                           <a14:useLocalDpi xmlns:a14="http://schemas.microsoft.com/office/drawing/2010/main"/>
@@ -10971,10 +11055,10 @@
     </w:p>
     <w:p/>
     <w:sectPr>
-      <w:headerReference w:type="default" r:id="rId30"/>
-      <w:footerReference w:type="default" r:id="rId31"/>
-      <w:headerReference w:type="first" r:id="rId32"/>
-      <w:footerReference w:type="first" r:id="rId33"/>
+      <w:headerReference w:type="default" r:id="rId26"/>
+      <w:footerReference w:type="default" r:id="rId27"/>
+      <w:headerReference w:type="first" r:id="rId28"/>
+      <w:footerReference w:type="first" r:id="rId29"/>
       <w:type w:val="continuous"/>
       <w:pgSz w:w="12240" w:h="15840"/>
       <w:pgMar w:top="1440" w:right="1800" w:bottom="1800" w:left="1800" w:header="720" w:footer="1080" w:gutter="0"/>
@@ -10984,45 +11068,6 @@
     </w:sectPr>
   </w:body>
 </w:document>
-</file>
-
-<file path=word/comments.xml><?xml version="1.0" encoding="utf-8"?>
-<w:comments xmlns:wpc="http://schemas.microsoft.com/office/word/2010/wordprocessingCanvas" xmlns:cx="http://schemas.microsoft.com/office/drawing/2014/chartex" xmlns:cx1="http://schemas.microsoft.com/office/drawing/2015/9/8/chartex" xmlns:cx2="http://schemas.microsoft.com/office/drawing/2015/10/21/chartex" xmlns:cx3="http://schemas.microsoft.com/office/drawing/2016/5/9/chartex" xmlns:cx4="http://schemas.microsoft.com/office/drawing/2016/5/10/chartex" xmlns:cx5="http://schemas.microsoft.com/office/drawing/2016/5/11/chartex" xmlns:cx6="http://schemas.microsoft.com/office/drawing/2016/5/12/chartex" xmlns:cx7="http://schemas.microsoft.com/office/drawing/2016/5/13/chartex" xmlns:cx8="http://schemas.microsoft.com/office/drawing/2016/5/14/chartex" xmlns:mc="http://schemas.openxmlformats.org/markup-compatibility/2006" xmlns:aink="http://schemas.microsoft.com/office/drawing/2016/ink" xmlns:am3d="http://schemas.microsoft.com/office/drawing/2017/model3d" xmlns:o="urn:schemas-microsoft-com:office:office" xmlns:oel="http://schemas.microsoft.com/office/2019/extlst" xmlns:r="http://schemas.openxmlformats.org/officeDocument/2006/relationships" xmlns:m="http://schemas.openxmlformats.org/officeDocument/2006/math" xmlns:v="urn:schemas-microsoft-com:vml" xmlns:wp14="http://schemas.microsoft.com/office/word/2010/wordprocessingDrawing" xmlns:wp="http://schemas.openxmlformats.org/drawingml/2006/wordprocessingDrawing" xmlns:w10="urn:schemas-microsoft-com:office:word" xmlns:w="http://schemas.openxmlformats.org/wordprocessingml/2006/main" xmlns:w14="http://schemas.microsoft.com/office/word/2010/wordml" xmlns:w15="http://schemas.microsoft.com/office/word/2012/wordml" xmlns:w16cex="http://schemas.microsoft.com/office/word/2018/wordml/cex" xmlns:w16cid="http://schemas.microsoft.com/office/word/2016/wordml/cid" xmlns:w16="http://schemas.microsoft.com/office/word/2018/wordml" xmlns:w16du="http://schemas.microsoft.com/office/word/2023/wordml/word16du" xmlns:w16sdtdh="http://schemas.microsoft.com/office/word/2020/wordml/sdtdatahash" xmlns:w16sdtfl="http://schemas.microsoft.com/office/word/2024/wordml/sdtformatlock" xmlns:w16se="http://schemas.microsoft.com/office/word/2015/wordml/symex" xmlns:wpg="http://schemas.microsoft.com/office/word/2010/wordprocessingGroup" xmlns:wpi="http://schemas.microsoft.com/office/word/2010/wordprocessingInk" xmlns:wne="http://schemas.microsoft.com/office/word/2006/wordml" xmlns:wps="http://schemas.microsoft.com/office/word/2010/wordprocessingShape" mc:Ignorable="w14 w15 w16se w16cid w16 w16cex w16sdtdh w16sdtfl w16du wp14">
-  <w:comment w:id="25" w:author="Darien Chau" w:date="2026-03-20T10:14:00Z" w:initials="DC">
-    <w:p>
-      <w:pPr>
-        <w:pStyle w:val="CommentText"/>
-      </w:pPr>
-      <w:r>
-        <w:rPr>
-          <w:rStyle w:val="CommentReference"/>
-        </w:rPr>
-        <w:annotationRef/>
-      </w:r>
-      <w:r>
-        <w:t>In Question…. Very lengthy and illegible.</w:t>
-      </w:r>
-    </w:p>
-  </w:comment>
-</w:comments>
-</file>
-
-<file path=word/commentsExtended.xml><?xml version="1.0" encoding="utf-8"?>
-<w15:commentsEx xmlns:wpc="http://schemas.microsoft.com/office/word/2010/wordprocessingCanvas" xmlns:cx="http://schemas.microsoft.com/office/drawing/2014/chartex" xmlns:cx1="http://schemas.microsoft.com/office/drawing/2015/9/8/chartex" xmlns:cx2="http://schemas.microsoft.com/office/drawing/2015/10/21/chartex" xmlns:cx3="http://schemas.microsoft.com/office/drawing/2016/5/9/chartex" xmlns:cx4="http://schemas.microsoft.com/office/drawing/2016/5/10/chartex" xmlns:cx5="http://schemas.microsoft.com/office/drawing/2016/5/11/chartex" xmlns:cx6="http://schemas.microsoft.com/office/drawing/2016/5/12/chartex" xmlns:cx7="http://schemas.microsoft.com/office/drawing/2016/5/13/chartex" xmlns:cx8="http://schemas.microsoft.com/office/drawing/2016/5/14/chartex" xmlns:mc="http://schemas.openxmlformats.org/markup-compatibility/2006" xmlns:aink="http://schemas.microsoft.com/office/drawing/2016/ink" xmlns:am3d="http://schemas.microsoft.com/office/drawing/2017/model3d" xmlns:o="urn:schemas-microsoft-com:office:office" xmlns:oel="http://schemas.microsoft.com/office/2019/extlst" xmlns:r="http://schemas.openxmlformats.org/officeDocument/2006/relationships" xmlns:m="http://schemas.openxmlformats.org/officeDocument/2006/math" xmlns:v="urn:schemas-microsoft-com:vml" xmlns:wp14="http://schemas.microsoft.com/office/word/2010/wordprocessingDrawing" xmlns:wp="http://schemas.openxmlformats.org/drawingml/2006/wordprocessingDrawing" xmlns:w10="urn:schemas-microsoft-com:office:word" xmlns:w="http://schemas.openxmlformats.org/wordprocessingml/2006/main" xmlns:w14="http://schemas.microsoft.com/office/word/2010/wordml" xmlns:w15="http://schemas.microsoft.com/office/word/2012/wordml" xmlns:w16cex="http://schemas.microsoft.com/office/word/2018/wordml/cex" xmlns:w16cid="http://schemas.microsoft.com/office/word/2016/wordml/cid" xmlns:w16="http://schemas.microsoft.com/office/word/2018/wordml" xmlns:w16du="http://schemas.microsoft.com/office/word/2023/wordml/word16du" xmlns:w16sdtdh="http://schemas.microsoft.com/office/word/2020/wordml/sdtdatahash" xmlns:w16sdtfl="http://schemas.microsoft.com/office/word/2024/wordml/sdtformatlock" xmlns:w16se="http://schemas.microsoft.com/office/word/2015/wordml/symex" xmlns:wpg="http://schemas.microsoft.com/office/word/2010/wordprocessingGroup" xmlns:wpi="http://schemas.microsoft.com/office/word/2010/wordprocessingInk" xmlns:wne="http://schemas.microsoft.com/office/word/2006/wordml" xmlns:wps="http://schemas.microsoft.com/office/word/2010/wordprocessingShape" mc:Ignorable="w14 w15 w16se w16cid w16 w16cex w16sdtdh w16sdtfl w16du wp14">
-  <w15:commentEx w15:paraId="1467BDCA" w15:done="0"/>
-</w15:commentsEx>
-</file>
-
-<file path=word/commentsExtensible.xml><?xml version="1.0" encoding="utf-8"?>
-<w16cex:commentsExtensible xmlns:wpc="http://schemas.microsoft.com/office/word/2010/wordprocessingCanvas" xmlns:cx="http://schemas.microsoft.com/office/drawing/2014/chartex" xmlns:cx1="http://schemas.microsoft.com/office/drawing/2015/9/8/chartex" xmlns:cx2="http://schemas.microsoft.com/office/drawing/2015/10/21/chartex" xmlns:cx3="http://schemas.microsoft.com/office/drawing/2016/5/9/chartex" xmlns:cx4="http://schemas.microsoft.com/office/drawing/2016/5/10/chartex" xmlns:cx5="http://schemas.microsoft.com/office/drawing/2016/5/11/chartex" xmlns:cx6="http://schemas.microsoft.com/office/drawing/2016/5/12/chartex" xmlns:cx7="http://schemas.microsoft.com/office/drawing/2016/5/13/chartex" xmlns:cx8="http://schemas.microsoft.com/office/drawing/2016/5/14/chartex" xmlns:cr="http://schemas.microsoft.com/office/comments/2020/reactions" xmlns:mc="http://schemas.openxmlformats.org/markup-compatibility/2006" xmlns:aink="http://schemas.microsoft.com/office/drawing/2016/ink" xmlns:am3d="http://schemas.microsoft.com/office/drawing/2017/model3d" xmlns:o="urn:schemas-microsoft-com:office:office" xmlns:oel="http://schemas.microsoft.com/office/2019/extlst" xmlns:r="http://schemas.openxmlformats.org/officeDocument/2006/relationships" xmlns:m="http://schemas.openxmlformats.org/officeDocument/2006/math" xmlns:v="urn:schemas-microsoft-com:vml" xmlns:wp14="http://schemas.microsoft.com/office/word/2010/wordprocessingDrawing" xmlns:wp="http://schemas.openxmlformats.org/drawingml/2006/wordprocessingDrawing" xmlns:w10="urn:schemas-microsoft-com:office:word" xmlns:w="http://schemas.openxmlformats.org/wordprocessingml/2006/main" xmlns:w14="http://schemas.microsoft.com/office/word/2010/wordml" xmlns:w15="http://schemas.microsoft.com/office/word/2012/wordml" xmlns:w16cex="http://schemas.microsoft.com/office/word/2018/wordml/cex" xmlns:w16cid="http://schemas.microsoft.com/office/word/2016/wordml/cid" xmlns:w16="http://schemas.microsoft.com/office/word/2018/wordml" xmlns:w16du="http://schemas.microsoft.com/office/word/2023/wordml/word16du" xmlns:w16sdtdh="http://schemas.microsoft.com/office/word/2020/wordml/sdtdatahash" xmlns:w16sdtfl="http://schemas.microsoft.com/office/word/2024/wordml/sdtformatlock" xmlns:w16se="http://schemas.microsoft.com/office/word/2015/wordml/symex" xmlns:wpg="http://schemas.microsoft.com/office/word/2010/wordprocessingGroup" xmlns:wpi="http://schemas.microsoft.com/office/word/2010/wordprocessingInk" xmlns:wne="http://schemas.microsoft.com/office/word/2006/wordml" xmlns:wps="http://schemas.microsoft.com/office/word/2010/wordprocessingShape" mc:Ignorable="w14 w15 w16se w16cid w16 w16cex w16sdtdh w16sdtfl cr w16du wp14">
-  <w16cex:commentExtensible w16cex:durableId="63E82EF3" w16cex:dateUtc="2026-03-20T17:14:00Z"/>
-</w16cex:commentsExtensible>
-</file>
-
-<file path=word/commentsIds.xml><?xml version="1.0" encoding="utf-8"?>
-<w16cid:commentsIds xmlns:wpc="http://schemas.microsoft.com/office/word/2010/wordprocessingCanvas" xmlns:cx="http://schemas.microsoft.com/office/drawing/2014/chartex" xmlns:cx1="http://schemas.microsoft.com/office/drawing/2015/9/8/chartex" xmlns:cx2="http://schemas.microsoft.com/office/drawing/2015/10/21/chartex" xmlns:cx3="http://schemas.microsoft.com/office/drawing/2016/5/9/chartex" xmlns:cx4="http://schemas.microsoft.com/office/drawing/2016/5/10/chartex" xmlns:cx5="http://schemas.microsoft.com/office/drawing/2016/5/11/chartex" xmlns:cx6="http://schemas.microsoft.com/office/drawing/2016/5/12/chartex" xmlns:cx7="http://schemas.microsoft.com/office/drawing/2016/5/13/chartex" xmlns:cx8="http://schemas.microsoft.com/office/drawing/2016/5/14/chartex" xmlns:mc="http://schemas.openxmlformats.org/markup-compatibility/2006" xmlns:aink="http://schemas.microsoft.com/office/drawing/2016/ink" xmlns:am3d="http://schemas.microsoft.com/office/drawing/2017/model3d" xmlns:o="urn:schemas-microsoft-com:office:office" xmlns:oel="http://schemas.microsoft.com/office/2019/extlst" xmlns:r="http://schemas.openxmlformats.org/officeDocument/2006/relationships" xmlns:m="http://schemas.openxmlformats.org/officeDocument/2006/math" xmlns:v="urn:schemas-microsoft-com:vml" xmlns:wp14="http://schemas.microsoft.com/office/word/2010/wordprocessingDrawing" xmlns:wp="http://schemas.openxmlformats.org/drawingml/2006/wordprocessingDrawing" xmlns:w10="urn:schemas-microsoft-com:office:word" xmlns:w="http://schemas.openxmlformats.org/wordprocessingml/2006/main" xmlns:w14="http://schemas.microsoft.com/office/word/2010/wordml" xmlns:w15="http://schemas.microsoft.com/office/word/2012/wordml" xmlns:w16cex="http://schemas.microsoft.com/office/word/2018/wordml/cex" xmlns:w16cid="http://schemas.microsoft.com/office/word/2016/wordml/cid" xmlns:w16="http://schemas.microsoft.com/office/word/2018/wordml" xmlns:w16du="http://schemas.microsoft.com/office/word/2023/wordml/word16du" xmlns:w16sdtdh="http://schemas.microsoft.com/office/word/2020/wordml/sdtdatahash" xmlns:w16sdtfl="http://schemas.microsoft.com/office/word/2024/wordml/sdtformatlock" xmlns:w16se="http://schemas.microsoft.com/office/word/2015/wordml/symex" xmlns:wpg="http://schemas.microsoft.com/office/word/2010/wordprocessingGroup" xmlns:wpi="http://schemas.microsoft.com/office/word/2010/wordprocessingInk" xmlns:wne="http://schemas.microsoft.com/office/word/2006/wordml" xmlns:wps="http://schemas.microsoft.com/office/word/2010/wordprocessingShape" mc:Ignorable="w14 w15 w16se w16cid w16 w16cex w16sdtdh w16sdtfl w16du wp14">
-  <w16cid:commentId w16cid:paraId="1467BDCA" w16cid:durableId="63E82EF3"/>
-</w16cid:commentsIds>
 </file>
 
 <file path=word/endnotes.xml><?xml version="1.0" encoding="utf-8"?>
@@ -11098,8 +11143,17 @@
                     <w:rStyle w:val="PageNumber"/>
                     <w:color w:val="000000"/>
                   </w:rPr>
-                  <w:t>ii</w:t>
+                  <w:t>i</w:t>
                 </w:r>
+                <w:proofErr w:type="spellStart"/>
+                <w:r>
+                  <w:rPr>
+                    <w:rStyle w:val="PageNumber"/>
+                    <w:color w:val="000000"/>
+                  </w:rPr>
+                  <w:t>i</w:t>
+                </w:r>
+                <w:proofErr w:type="spellEnd"/>
                 <w:r>
                   <w:rPr>
                     <w:rStyle w:val="PageNumber"/>
@@ -11162,8 +11216,17 @@
                     <w:rStyle w:val="PageNumber"/>
                     <w:color w:val="000000"/>
                   </w:rPr>
-                  <w:t>viii</w:t>
+                  <w:t>vii</w:t>
                 </w:r>
+                <w:proofErr w:type="spellStart"/>
+                <w:r>
+                  <w:rPr>
+                    <w:rStyle w:val="PageNumber"/>
+                    <w:color w:val="000000"/>
+                  </w:rPr>
+                  <w:t>i</w:t>
+                </w:r>
+                <w:proofErr w:type="spellEnd"/>
                 <w:r>
                   <w:rPr>
                     <w:rStyle w:val="PageNumber"/>
@@ -11216,8 +11279,16 @@
       <w:rPr>
         <w:rStyle w:val="PageNumber"/>
       </w:rPr>
-      <w:t>iii</w:t>
+      <w:t>ii</w:t>
     </w:r>
+    <w:proofErr w:type="spellStart"/>
+    <w:r>
+      <w:rPr>
+        <w:rStyle w:val="PageNumber"/>
+      </w:rPr>
+      <w:t>i</w:t>
+    </w:r>
+    <w:proofErr w:type="spellEnd"/>
     <w:r>
       <w:rPr>
         <w:rStyle w:val="PageNumber"/>
@@ -16150,14 +16221,6 @@
     <w:abstractNumId w:val="48"/>
   </w:num>
 </w:numbering>
-</file>
-
-<file path=word/people.xml><?xml version="1.0" encoding="utf-8"?>
-<w15:people xmlns:wpc="http://schemas.microsoft.com/office/word/2010/wordprocessingCanvas" xmlns:cx="http://schemas.microsoft.com/office/drawing/2014/chartex" xmlns:cx1="http://schemas.microsoft.com/office/drawing/2015/9/8/chartex" xmlns:cx2="http://schemas.microsoft.com/office/drawing/2015/10/21/chartex" xmlns:cx3="http://schemas.microsoft.com/office/drawing/2016/5/9/chartex" xmlns:cx4="http://schemas.microsoft.com/office/drawing/2016/5/10/chartex" xmlns:cx5="http://schemas.microsoft.com/office/drawing/2016/5/11/chartex" xmlns:cx6="http://schemas.microsoft.com/office/drawing/2016/5/12/chartex" xmlns:cx7="http://schemas.microsoft.com/office/drawing/2016/5/13/chartex" xmlns:cx8="http://schemas.microsoft.com/office/drawing/2016/5/14/chartex" xmlns:mc="http://schemas.openxmlformats.org/markup-compatibility/2006" xmlns:aink="http://schemas.microsoft.com/office/drawing/2016/ink" xmlns:am3d="http://schemas.microsoft.com/office/drawing/2017/model3d" xmlns:o="urn:schemas-microsoft-com:office:office" xmlns:oel="http://schemas.microsoft.com/office/2019/extlst" xmlns:r="http://schemas.openxmlformats.org/officeDocument/2006/relationships" xmlns:m="http://schemas.openxmlformats.org/officeDocument/2006/math" xmlns:v="urn:schemas-microsoft-com:vml" xmlns:wp14="http://schemas.microsoft.com/office/word/2010/wordprocessingDrawing" xmlns:wp="http://schemas.openxmlformats.org/drawingml/2006/wordprocessingDrawing" xmlns:w10="urn:schemas-microsoft-com:office:word" xmlns:w="http://schemas.openxmlformats.org/wordprocessingml/2006/main" xmlns:w14="http://schemas.microsoft.com/office/word/2010/wordml" xmlns:w15="http://schemas.microsoft.com/office/word/2012/wordml" xmlns:w16cex="http://schemas.microsoft.com/office/word/2018/wordml/cex" xmlns:w16cid="http://schemas.microsoft.com/office/word/2016/wordml/cid" xmlns:w16="http://schemas.microsoft.com/office/word/2018/wordml" xmlns:w16du="http://schemas.microsoft.com/office/word/2023/wordml/word16du" xmlns:w16sdtdh="http://schemas.microsoft.com/office/word/2020/wordml/sdtdatahash" xmlns:w16sdtfl="http://schemas.microsoft.com/office/word/2024/wordml/sdtformatlock" xmlns:w16se="http://schemas.microsoft.com/office/word/2015/wordml/symex" xmlns:wpg="http://schemas.microsoft.com/office/word/2010/wordprocessingGroup" xmlns:wpi="http://schemas.microsoft.com/office/word/2010/wordprocessingInk" xmlns:wne="http://schemas.microsoft.com/office/word/2006/wordml" xmlns:wps="http://schemas.microsoft.com/office/word/2010/wordprocessingShape" mc:Ignorable="w14 w15 w16se w16cid w16 w16cex w16sdtdh w16sdtfl w16du wp14">
-  <w15:person w15:author="Darien Chau">
-    <w15:presenceInfo w15:providerId="AD" w15:userId="S::dchau@horizon.csueastbay.edu::6457da15-b024-46f4-96d8-2a4edc11854b"/>
-  </w15:person>
-</w15:people>
 </file>
 
 <file path=word/styles.xml><?xml version="1.0" encoding="utf-8"?>

</xml_diff>

<commit_message>
Full UML Class Diagram
</commit_message>
<xml_diff>
--- a/SDS_Communications.docx
+++ b/SDS_Communications.docx
@@ -543,16 +543,8 @@
               <w:rPr>
                 <w:color w:val="000000"/>
               </w:rPr>
-              <w:t xml:space="preserve">Darien, Victor, Ola, </w:t>
-            </w:r>
-            <w:proofErr w:type="spellStart"/>
-            <w:r>
-              <w:rPr>
-                <w:color w:val="000000"/>
-              </w:rPr>
-              <w:t>Clarize</w:t>
-            </w:r>
-            <w:proofErr w:type="spellEnd"/>
+              <w:t>Darien, Victor, Ola, Clarize</w:t>
+            </w:r>
           </w:p>
         </w:tc>
       </w:tr>
@@ -576,6 +568,13 @@
                 <w:u w:val="single"/>
               </w:rPr>
             </w:pPr>
+            <w:r>
+              <w:rPr>
+                <w:color w:val="000000"/>
+                <w:u w:val="single"/>
+              </w:rPr>
+              <w:t>03/27/2026</w:t>
+            </w:r>
           </w:p>
         </w:tc>
         <w:tc>
@@ -596,6 +595,12 @@
                 <w:color w:val="000000"/>
               </w:rPr>
             </w:pPr>
+            <w:r>
+              <w:rPr>
+                <w:color w:val="000000"/>
+              </w:rPr>
+              <w:t>1.3</w:t>
+            </w:r>
           </w:p>
         </w:tc>
         <w:tc>
@@ -616,6 +621,12 @@
                 <w:color w:val="000000"/>
               </w:rPr>
             </w:pPr>
+            <w:r>
+              <w:rPr>
+                <w:color w:val="000000"/>
+              </w:rPr>
+              <w:t>Full UML Class Diagram</w:t>
+            </w:r>
           </w:p>
         </w:tc>
         <w:tc>
@@ -637,6 +648,12 @@
                 <w:color w:val="000000"/>
               </w:rPr>
             </w:pPr>
+            <w:r>
+              <w:rPr>
+                <w:color w:val="000000"/>
+              </w:rPr>
+              <w:t>Darien, Clarize, Victor</w:t>
+            </w:r>
           </w:p>
         </w:tc>
       </w:tr>
@@ -4463,23 +4480,7 @@
           <w:rFonts w:eastAsia="Arial"/>
           <w:color w:val="000000" w:themeColor="text1"/>
         </w:rPr>
-        <w:t>3.1.1.4, 3.1.1.5, 3.1.1.12, 3.1.</w:t>
-      </w:r>
-      <w:proofErr w:type="gramStart"/>
-      <w:r>
-        <w:rPr>
-          <w:rFonts w:eastAsia="Arial"/>
-          <w:color w:val="000000" w:themeColor="text1"/>
-        </w:rPr>
-        <w:t>1.14</w:t>
-      </w:r>
-      <w:proofErr w:type="gramEnd"/>
-      <w:r>
-        <w:rPr>
-          <w:rFonts w:eastAsia="Arial"/>
-          <w:color w:val="000000" w:themeColor="text1"/>
-        </w:rPr>
-        <w:t>, 3.1.2.3, 3.2.3, 3.3.10</w:t>
+        <w:t>3.1.1.4, 3.1.1.5, 3.1.1.12, 3.1.1.14, 3.1.2.3, 3.2.3, 3.3.10</w:t>
       </w:r>
     </w:p>
     <w:p>
@@ -4936,23 +4937,7 @@
           <w:rFonts w:eastAsia="Arial"/>
           <w:color w:val="000000" w:themeColor="text1"/>
         </w:rPr>
-        <w:t>Relevant requirements: 3.1.3.6 , 3.1.</w:t>
-      </w:r>
-      <w:proofErr w:type="gramStart"/>
-      <w:r>
-        <w:rPr>
-          <w:rFonts w:eastAsia="Arial"/>
-          <w:color w:val="000000" w:themeColor="text1"/>
-        </w:rPr>
-        <w:t>1.13</w:t>
-      </w:r>
-      <w:proofErr w:type="gramEnd"/>
-      <w:r>
-        <w:rPr>
-          <w:rFonts w:eastAsia="Arial"/>
-          <w:color w:val="000000" w:themeColor="text1"/>
-        </w:rPr>
-        <w:t>, 3.1.2.4, 3.1.2.5, 3.1.3.6, 3.3.6</w:t>
+        <w:t>Relevant requirements: 3.1.3.6 , 3.1.1.13, 3.1.2.4, 3.1.2.5, 3.1.3.6, 3.3.6</w:t>
       </w:r>
     </w:p>
     <w:p>
@@ -7147,15 +7132,7 @@
         <w:ind w:left="1440"/>
       </w:pPr>
       <w:r>
-        <w:t>Relevant Requirements: 3.1.1.2, 3.1.1.3, 3.1.1.8, 3.1.3.2, 3.1.3.3, 3.1.3.3</w:t>
-      </w:r>
-      <w:proofErr w:type="gramStart"/>
-      <w:r>
-        <w:t>.1, 3.1.3.3.2, 3.1.3.4</w:t>
-      </w:r>
-      <w:proofErr w:type="gramEnd"/>
-      <w:r>
-        <w:t>, 3.1.3.5, 3.1.4.1.2, 3.1.4.1.1, 3.2.2, 3.3.3.1, 3.3.4</w:t>
+        <w:t>Relevant Requirements: 3.1.1.2, 3.1.1.3, 3.1.1.8, 3.1.3.2, 3.1.3.3, 3.1.3.3.1, 3.1.3.3.2, 3.1.3.4, 3.1.3.5, 3.1.4.1.2, 3.1.4.1.1, 3.2.2, 3.3.3.1, 3.3.4</w:t>
       </w:r>
     </w:p>
     <w:p>
@@ -7364,15 +7341,7 @@
         </w:numPr>
       </w:pPr>
       <w:r>
-        <w:t xml:space="preserve">Server queues </w:t>
-      </w:r>
-      <w:proofErr w:type="gramStart"/>
-      <w:r>
-        <w:t>a message</w:t>
-      </w:r>
-      <w:proofErr w:type="gramEnd"/>
-      <w:r>
-        <w:t xml:space="preserve"> for offline members</w:t>
+        <w:t>Server queues a message for offline members</w:t>
       </w:r>
     </w:p>
     <w:p>
@@ -9351,23 +9320,7 @@
     </w:p>
     <w:p>
       <w:r>
-        <w:t>CLI --&gt; REG : User selects\</w:t>
-      </w:r>
-      <w:proofErr w:type="spellStart"/>
-      <w:r>
-        <w:t>n"Register</w:t>
-      </w:r>
-      <w:proofErr w:type="spellEnd"/>
-      <w:r>
-        <w:t xml:space="preserve"> User"\</w:t>
-      </w:r>
-      <w:proofErr w:type="spellStart"/>
-      <w:r>
-        <w:t>nand</w:t>
-      </w:r>
-      <w:proofErr w:type="spellEnd"/>
-      <w:r>
-        <w:t xml:space="preserve"> inputs credentials</w:t>
+        <w:t>CLI --&gt; REG : User selects\n"Register User"\nand inputs credentials</w:t>
       </w:r>
     </w:p>
     <w:p>
@@ -9678,15 +9631,7 @@
     </w:p>
     <w:p>
       <w:r>
-        <w:t>CLI --&gt; SM : User selects group chat\</w:t>
-      </w:r>
-      <w:proofErr w:type="spellStart"/>
-      <w:r>
-        <w:t>nand</w:t>
-      </w:r>
-      <w:proofErr w:type="spellEnd"/>
-      <w:r>
-        <w:t xml:space="preserve"> types message</w:t>
+        <w:t>CLI --&gt; SM : User selects group chat\nand types message</w:t>
       </w:r>
     </w:p>
     <w:p>
@@ -9721,15 +9666,7 @@
     </w:p>
     <w:p>
       <w:r>
-        <w:t xml:space="preserve">LOG .&gt; CLI : Update </w:t>
-      </w:r>
-      <w:proofErr w:type="spellStart"/>
-      <w:r>
-        <w:t>chatbox</w:t>
-      </w:r>
-      <w:proofErr w:type="spellEnd"/>
-      <w:r>
-        <w:t xml:space="preserve"> / console</w:t>
+        <w:t>LOG .&gt; CLI : Update chatbox / console</w:t>
       </w:r>
     </w:p>
     <w:p/>
@@ -9960,15 +9897,7 @@
     </w:p>
     <w:p>
       <w:r>
-        <w:t>(</w:t>
-      </w:r>
-      <w:proofErr w:type="gramStart"/>
-      <w:r>
-        <w:t>Retrieve</w:t>
-      </w:r>
-      <w:proofErr w:type="gramEnd"/>
-      <w:r>
-        <w:t xml:space="preserve"> Stored Messages) as RET</w:t>
+        <w:t>(Retrieve Stored Messages) as RET</w:t>
       </w:r>
     </w:p>
     <w:p>
@@ -10010,15 +9939,7 @@
     </w:p>
     <w:p>
       <w:r>
-        <w:t>DM --&gt; CLI : Display scrollable\</w:t>
-      </w:r>
-      <w:proofErr w:type="spellStart"/>
-      <w:r>
-        <w:t>nchat</w:t>
-      </w:r>
-      <w:proofErr w:type="spellEnd"/>
-      <w:r>
-        <w:t xml:space="preserve"> history</w:t>
+        <w:t>DM --&gt; CLI : Display scrollable\nchat history</w:t>
       </w:r>
     </w:p>
     <w:p/>
@@ -10230,15 +10151,7 @@
     </w:p>
     <w:p>
       <w:r>
-        <w:t>(</w:t>
-      </w:r>
-      <w:proofErr w:type="gramStart"/>
-      <w:r>
-        <w:t>Retrieve</w:t>
-      </w:r>
-      <w:proofErr w:type="gramEnd"/>
-      <w:r>
-        <w:t xml:space="preserve"> Log Files) as RET</w:t>
+        <w:t>(Retrieve Log Files) as RET</w:t>
       </w:r>
     </w:p>
     <w:p>
@@ -10265,15 +10178,7 @@
     </w:p>
     <w:p>
       <w:r>
-        <w:t>CLI --&gt; RCL : User selects\</w:t>
-      </w:r>
-      <w:proofErr w:type="spellStart"/>
-      <w:r>
-        <w:t>n"View</w:t>
-      </w:r>
-      <w:proofErr w:type="spellEnd"/>
-      <w:r>
-        <w:t xml:space="preserve"> Chat Logs" function</w:t>
+        <w:t>CLI --&gt; RCL : User selects\n"View Chat Logs" function</w:t>
       </w:r>
     </w:p>
     <w:p>
@@ -10298,15 +10203,7 @@
     </w:p>
     <w:p>
       <w:r>
-        <w:t>DISP --&gt; CLI : Display requested\</w:t>
-      </w:r>
-      <w:proofErr w:type="spellStart"/>
-      <w:r>
-        <w:t>nchat</w:t>
-      </w:r>
-      <w:proofErr w:type="spellEnd"/>
-      <w:r>
-        <w:t xml:space="preserve"> logs</w:t>
+        <w:t>DISP --&gt; CLI : Display requested\nchat logs</w:t>
       </w:r>
     </w:p>
     <w:p>
@@ -10726,11 +10623,9 @@
       <w:pPr>
         <w:ind w:left="1440"/>
       </w:pPr>
-      <w:proofErr w:type="spellStart"/>
       <w:r>
         <w:t>AdminPanel</w:t>
       </w:r>
-      <w:proofErr w:type="spellEnd"/>
     </w:p>
     <w:p>
       <w:pPr>
@@ -10820,13 +10715,16 @@
       <w:bookmarkStart w:id="38" w:name="_Toc223255455"/>
       <w:bookmarkStart w:id="39" w:name="_Toc224291132"/>
       <w:r>
+        <w:t xml:space="preserve">Full UML </w:t>
+      </w:r>
+      <w:r>
         <w:t>Class Diagr</w:t>
       </w:r>
       <w:bookmarkEnd w:id="37"/>
       <w:bookmarkEnd w:id="38"/>
       <w:bookmarkEnd w:id="39"/>
       <w:r>
-        <w:t>ams</w:t>
+        <w:t>am</w:t>
       </w:r>
     </w:p>
     <w:p>
@@ -10851,13 +10749,12 @@
         <w:ind w:left="1440"/>
       </w:pPr>
       <w:r>
-        <w:t>TLPBR-Cs4BxpLmnoYRE9ZUQQGx6ghNK4s98hoLq4tQBWMenDh4If8fri4FI_T_YIwDZD8UPyyt4qBmxvMIhQgsDJ4o9_SD7HdZPGSy7KMyUWxTMX9JLxLg1QwFd-eA3YFTiftWf2hgVJASJfTXtdKPbaQG484CB4iO4Ypl-8ywACocq1xsIx8RzbMKaMsTUK_Eiuso9WPEagIMCIVOsUo29TaEpB5mDuyhfO_bq-RU9tiewB8bh698-NIL7QJ-VnxzkuA4aHH_dyqKlpnwXSPKilvd6q24HS9caWPDlII_ghDhnvjbvlqsJk0emscvKJRB3N-iT40lDLLDWKx6eg9Mmbwp4mr2OBU00k5AvtxL6eGJeYHT268L2edeizOXtkVMtxAiIuJ4gKlxTjpQW0HB1kwYWH6vE8ADrv-z5ydctJqcd8hV5cSXoCta4th6zGhLgxdjoCtxs5FLFelC6qmnPmFfynDyxnCqLXV3LmuEqjoC3Ow9cclRIyieJ1Q7TEC4Ko-SVi3Da7nDAiZ8i7SXrL3HSRAbWDDHEL1AuagvzrDrFeMiM4uhG6Kwyx-CxGEYgMssJcQfYKGnLn6TIHgx2IwAjbOf3MxwISqB5YGKnxexiPTOXLRTOnCJexyNpGCTeGeyKwIJTH6gykXrgm_WKzdRT2ebdeMLVJ7MimGXVAQ5v7WqTA-ok7WAJT_t1oSdLW9suPPtD6grMxbvDdNklMbH_hfYbxBXNhXwwJGTUTyJiKhV-sTq8FR0SPPR8nQkbRImOAVj6mTWJJh0BZWoR2AVP25RkaUwJrsHwiX4sao_Gx6I7CnecC7NGYfqnX4__GxQMJtp0fwPwjC4LeVMsbFp_zPUlYPAcJFswSE1YQ6wHLBNvoxy-hyMyQfFqKdH-eGlf7gYdYAOX08iwWxAXEiOBHVdUua1hlupZrXX7cZuiUN7pdfs7Fi0BL0l-XIlze-rJHSAV4aylwKbz80Ogt4EyujlUvufyZanxsryPW9pZ3Wua1muox42RZ_Bq36QpxODtORKZm5b3lbpUsTJ4eUZOHvsFSHcSYTvtkWptRb8SHNz0EOHlT47XWzkCepyS418fBLy4mXl9uDTxrm_p1NtSg6le61_g2RThs3DG1RwjMC60_iIzr-nzeNxtIdk6qFUAhui3U02MWTOqsK0IfhqCxZ6RmoCIE6NXtQ3akssUu_p2RUTFLPiwv6vSu_EeUPZFu1FRl2ltL3vafNFqIu5Tcpx05uDvIg_PLJ7z5xcnsRsZZ52JEkgPf2Yxmk9DhVUQzxK0tdc3YJuTZNIRvGNxoWL3_Fz-nsuYUH5xxJHYzURTPtZS18pMu74y-vjIkuAle2Hz6jjh1WyqbqsJFjve7NPpav0teT44UpTzdR4pz_FmF</w:t>
-      </w:r>
-    </w:p>
-    <w:p>
-      <w:pPr>
-        <w:ind w:left="1440"/>
-      </w:pPr>
+        <w:t>bHfhRziuyhj_1T4lTHedsDx7ebYirrOI0V7ZBBb5SNie68csXSYIJfIR3OhzxpSpV4lsNgue494p7CvxXgH_anrlkzEn78taSr4rlEL7LXQLw5uRmUgsEzIZKkmwrjMiBVQ7ZkL5AxAkgAlHwFtDpGsBbjj5j9ccyMgPC9Y0QIQgqr6qdB3mcoNHvakqIT9fkar-ZXXRBH_ZPOGVTtVwAzfiLflHNoErO9iOTFPpfB6dNwVVHlFbV6GM_OLxyJndhVZFIKXW4fYMo6ftAEIGYqtqpssKfEctTVHpb4JB-I9AakbzDDf4zt6IAY4q4i2dczc36Ns9ew-prJATpjB4p3skflFPmpHzWBMhpJSplOccyyVLlHdEO9n6zvlLTkqMtiTBRx3QfcOqdS_rDexSOlKbwas2vA6QfP8GsKIrHQXasWR-Bi14y8TO86v0IXZ7wNgwZ1wL5eUaO3KgYbbAtvFjR0OAi-ExQVmOpTKGH82FzIR-0fj_DthLcthZv5kIHelleR5dZt6qJAsv6GDfbz4i9UBpEB53ffYT7NYr5woem7ch32nUxzX2ICbX4eo_KTwW_NEsMYosotYcFNIwNZ_gWV5Mn49_0pwcYVBXhEHIigqKBV03q7ZEFi5-7NndzQdgxEW4A1K_2fX8khQezZ3NmDgNkitzkKB6AOoVwheKl68m0xnt9mbppjLXbcU6_dGsMssDLaQZQ-9cVB949wontrS0xchrFRvo-rwplUY0UPf3XjM4vdc0kTQC3m09yKhJ7hVNJ7h476U8zgCkSeLWYJP31EN6g7_GZjK-WxdbAesIJwFtq_nOL6jUYPALeiebApefoXsQcREcxaJL5RnaPAy9Un907G3ts_XMsp1EhHNXqxDZqVcM15uL9WYf-8xJCNSMysJQ4-pAmM0khrUDg1opOuElFHQbciuNyP92xhoeYMX_0ASpY40W2pcjANacZY2X5iMHHsaWS91VQGMIQlsd8DcYO05RnEn6yFontilnhYZHTMNVReYoBsGdMkjrqlEw0Nu3GyM_yXsV0-L118pN19R6jQG7ACuIHaP0pPr7t4AcK8P-y4wSWptmSh26B06kmOwyg9JBQCtY9EOTYEvJsuB6qU5HCJQV-a1og4ygE_phbzlRZ_ycQDoieLwwo64C_byZxN4FT4K0ghpJfYcBZFAkOvIWB-2WXo-5U1dBFZC18YXtvlXICGeV1CiB2Kxq2YvLgPeTjMtTruWyFIbb2ACES8sYmgsrKaoIkoj4cVi2kbpN0_cxXtBnhXF7fgCjR10H98DOQecExAdYKByGuph7Zuywrv_B9qe2g13T2emFswCSshPrrV6iayPq7vJTEBgH01q1lYHB03bJJWoItZAkcbFtPbdBckSplMa8gI5R-3kEmHSmhyo7Cf468FKPuL4AKNNd4Q4r4o2CHJxAlHCcmCp0xPx12lMf6m_rTz_Mf</w:t>
+      </w:r>
+      <w:r>
+        <w:lastRenderedPageBreak/>
+        <w:t>sRM2cBEyuGzpY_FkmBaPN0oOILcdfulwqY2qRC3PR8nbEtsDH3CCzGrTdgQTbedj1bgxkIYiQUAOqrcnGLtRNtytqj0jRkYFPBSWbGGyffXjr6UKLUSuZvjNLAMzVHLYPVjvU01wFfy_22qhFTpfR4fCFGMVsjrpbwgNKFWJa0-cPww0vPCbN6e10oHC7W8X7gwx99liXjb6DsGiGTUvIMa9gKqFQidgKBhFluHf00Y6W79KBdJOrVnS1TFehfb74O08DijU0LEtogVrGE0QOymq2mO0XmaXzIqD_0o668v3VaU6-6ELx0uh_LofzORhvY6irhFVLGgpU4aJCJLO6hbXoxE9MIJC_vfU7Izh6rCJHE4HQR8J8zB4P3FLTt1FqYVTznVYKb9j2cU4xrPo415Ku15XW3YGKylalllUBomTBpEp9AmSqxhOnSa4oQzxzRxFgfbW60e0DnyNgc618JYWpvtvkGc64ck-nSZx63HnfVu3DIAJJ0hk4Ustw1ld08ymBa6trfOzJfBqK4oUTR9H-hMgbUnLIU2D1rIOWuZGUVcLSSIsK64J7sPkjZL7IzTVo6rlJ1312oD1ynCF4wyXgZVj2b0tPoRBp6eAc_t4FpKGltDkEp2QgWj4cPEA8D2etLrIiKuH9-mlo_H1qe7Ia-GjZF5r5Yf2n0LH2UDVWD7dQp0T3R3SBH6r-34iz6mlxO-02b1Mxuhe5_f-B4nFaoJu8A8yiaSxRNzRVHvJXA6e0VeTn_Ar9Ym1kGdGzgJiuGd0wfNHlBK2EB2KKDWAnjJJfvXK5dUpqPM29qfDiu6cBBVMm9CpQx3C5D-aDJPio0nwKEXcz3pRq6q4O82-QbNUPJg0xxK8UfIV6cVnER9nfBjldFdinTRpylneoBnphRelKWChn02GNiATjq0z0tJDDt4ls_fU0nq67iFBPCoG6Q3dW0tMgDC6iKYCcHpl36eilg8zmAwXvTwnU-dtKwq8iUA2piMsDhhXPAk6beX6qWgTi4QrDfzRGiev0poXKFNvq8w9nbso0RsvAGHIpprQ8jhH7CZn5qV8tADhdAAz65EO6q6qwUqmR17W5eWF7IO6pu4euONKVgmcZlrWbhX27xAe9UYcUlGBED0orT6AZA-P3jem7I-SygyLjSWxGdw5xS9k5yd5HRwfxkpKqjClzBmLWfJ-RLAM_vY257MblRs5tXaEJJvUr2Xz3TNQZ1q375OTdNMtdYvfEJmYI3EHcCONY0Wh51b3PxIzqkzrWykv_73zdNWzPezW05juqmJU-hMhh3WpMSJzEhlhuGCxKokBiYafjIrF7jsbEZcL5LucZDEcOZkio6am0d43dcExpINV6OWc3KzsBtO5QWdnnhP3I93iGNkm8eT-y7B8jVapeN8k1TWHd2h6kiZT0m4vuGJe2Ugd32okLHo-SOgrQ6uju6ryq6W1e55xYv_2n2Yn6ppQizWeiyz8aT_0anU8csM6aNiWWsgkeCMv5a4lBR-BTrRLTAquWTrS_b9NJu9bPXaZ-D2uc56v73q673iqhPrU9E9BgLkFqtOdAppXGiRvuBKy-Xyumt2cE1bQT9l-Mh8YDoqgPeO7YW_1vdirx2nrKIFlF63WnwIHD4Qlz7CgdHYWyMFljuUI0h0RyoqVKsE8JDI4VSIPrTKf_eaGLQUPQ818rRYvP8MJUR2llgHj4_71qsDv-3_t5-Fb-fAKhILJmAlNWXd79PfjR0VQvhS2qGhAl3Lot-Xyz8DZQ9xCIPWNY3Hq0PFhs5jxHKgwkOk47Pd9j0zwFcYtoeEw8gyuTq1vMbLdWpJ5qoIDvfqxEru1ulNi5RJKc-dTVkgQPcBp4CXQHR2_1mbZJOtgz_cJw5uupDSJIvjOEiY9ysJZ-32zq7Y3doCg_FBcvCGtesgyAN2e_ApL2nhmkVA6YvJbqvz7eqkdw135ABowfd7ekbaDLFgW69vj8SJEwCF9aDlp0wyisOpMq9h6cnBQSVd76zy7jGYNr4V9xxF_EEgb-AiQ9WvwzqEd-UnqO5m05y80XqMh1H2JzAXQ9herIWuGFfNNvSIUJyYg7PVYW80ze80x__1pAWtwi19B5ogqPLNW7hhAXD-0dUQtAlU_Mrn44fb5BBJJ3b_t6EDRO-yPF8LSkMHwIffdXicgYdHjVAgrpB4rQuUzrNhaNxXBMPVJRIt-Ai2_jrwWGyWvrUhHvtpQr_mk2ArfeNkio3Fe_Zzu53NmKDNrwSRN7hEiTLX75TwxxcRwD7z9CI-Si9V_SfvvAzGHo6V7y5be4X0kr63Lmjia52C0szpK1ae_GcE25H4qCF0Cu06385XQ8jKNt3B7WIu2ardXxg0JsXhF_PUW8jZKz9hgdxN7-dvTn_PxItxmDI_Ty0l_jxbXhtxnPj_fzxKp1B6FYhKl7wfRdu5tDlRZuJctbf7cZgY8Gfyt6_ZaJbzQF8Uj7Uw3oyS71tOweD5ziZHj2KMh1w5juF_BwrWzGZlU8nk_gW8ZNuOfD3_gDXG5EyHFz17I3XayWF-TCClwUXPhIZL0HODxBrReaUxHrqu_E63xWTb7UyrCvZkFH46iC7pLm0TllQ4X0FL-n3FEN3w5XtjrdjZxhs8c6M3uzGbn447UGanR0qkOOM9amn_IwQ-jJTkEjeVfzzMsrI5klVBBIqWXOxtsojBnJZUU_y-a-duyvGLUWPuNd3_6GQAtZEuOu9_lq6bnr-v_HS0</w:t>
+      </w:r>
     </w:p>
     <w:p>
       <w:pPr>
@@ -10867,24 +10764,39 @@
           <w:bCs/>
         </w:rPr>
       </w:pPr>
-      <w:r>
+    </w:p>
+    <w:p>
+      <w:pPr>
+        <w:ind w:left="1440"/>
         <w:rPr>
           <w:b/>
           <w:bCs/>
         </w:rPr>
+      </w:pPr>
+      <w:r>
+        <w:rPr>
+          <w:b/>
+          <w:bCs/>
+        </w:rPr>
+        <w:lastRenderedPageBreak/>
         <w:t>Image:</w:t>
       </w:r>
     </w:p>
     <w:p>
       <w:pPr>
-        <w:ind w:left="1440"/>
-      </w:pPr>
+        <w:ind w:left="1440" w:hanging="1440"/>
+      </w:pPr>
+      <w:r>
+        <w:tab/>
+      </w:r>
+      <w:r>
+        <w:t>https://img.plantuml.biz/plantuml/svg/bHfhRziuyhj_1T4lTHedsDx7ebYirrOI0V7ZBBb5SNie68csXSYIJfIR3OhzxpSpV4lsNgue494p7CvxXgH_anrlkzEn78taSr4rlEL7LXQLw5uRmUgsEzIZKkmwrjMiBVQ7ZkL5AxAkgAlHwFtDpGsBbjj5j9ccyMgPC9Y0QIQgqr6qdB3mcoNHvakqIT9fkar-ZXXRBH_ZPOGVTtVwAzfiLflHNoErO9iOTFPpfB6dNwVVHlFbV6GM_OLxyJndhVZFIKXW4fYMo6ftAEIGYqtqpssKfEctTVHpb4JB-I9AakbzDDf4zt6IAY4q4i2dczc36Ns9ew-prJATpjB4p3skflFPmpHzWBMhpJSplOccyyVLlHdEO9n6zvlLTkqMtiTBRx3QfcOqdS_rDexSOlKbwas2vA6QfP8GsKIrHQXasWR-Bi14y8TO86v0IXZ7wNgwZ1wL5eUaO3KgYbbAtvFjR0OAi-ExQVmOpTKGH82FzIR-0fj_DthLcthZv5kIHelleR5dZt6qJAsv6GDfbz4i9UBpEB53ffYT7NYr5woem7ch32nUxzX2ICbX4eo_KTwW_NEsMYosotYcFNIwNZ_gWV5Mn49_0pwcYVBXhEHIigqKBV03q7ZEFi5-7NndzQdgxEW4A1K_2fX8khQezZ3NmDgNkitzkKB6AOoVwheKl68m0xnt9mbppjLXbcU6_dGsMssDLaQZQ-9cVB949wontrS0xchrFRvo-rwplUY0UPf3XjM4vdc0kTQC3m09yKhJ7hVNJ7h476U8zgCkSeLWYJP31EN6g7_GZjK-WxdbAesIJwFtq_nOL6jUYPALeiebApefoXsQcREcxaJL5RnaPAy9Un907G3ts_XMsp1EhHNXqxDZqVcM15uL9WYf-8xJCNSMysJQ4-pAmM0khrUDg1opOuElFHQbciuNyP92xhoeYMX_0ASpY40W2pcjANacZY2X5iMHHsaWS91VQGMIQlsd8DcYO05RnEn6yFontilnhYZHTMNVReYoBsGdMkjrqlEw0Nu3GyM_yXsV0-L118pN19R6jQG7ACuIHaP0pPr7t4AcK8P-y4wSWptmSh26B06kmOwyg9JBQCtY9EOTYEvJsuB6qU5HCJQV-a1og4ygE_phbzlRZ_ycQDoieLwwo64C_byZxN4FT4K0ghpJfYcBZFAkOvIWB-2WXo-5U1dBFZC18YXtvlXICGeV1CiB2Kxq2YvLgPeTjMtTruWyFIbb2ACES8sYmgsrKaoIkoj4cVi2kbpN0_cxXtBnhXF7fgCjR10H98DOQecExAdYKByGuph7Zuywrv_B9qe2g13T2emFswCSshPrrV6iayPq7vJTEBgH01q1lYHB03bJJWoItZAkcbFtPbdBckSplMa8gI5R-3kEmHSmhyo7Cf468FKPuL4AKNNd4Q4r4o2CHJxAlHCcmCp0xPx12lMf6m_rTz_MfsRM2cBEyuGzpY_FkmBaPN0oOILcdfulwqY2qRC3PR8nbEtsDH3CCzGrTdgQTbedj1bgxkIYiQUAOqrcnGLtRNtytqj0jRkYFPBSWbGGyffXjr6UKLUSuZvjNLAMzVHLYPVjvU01wFfy_22qhFTpfR4fCFGMVsjrpbwgNKFWJa0-cPww0vPCbN6e10oHC7W8X7gwx99liXjb6DsGiGTUvIMa9gKqFQidgKBhFluHf00Y6W79KBdJOrVnS1TFehfb74O08DijU0LEtogVrGE0QOymq2mO0XmaXzIqD_0o668v3VaU6-6ELx0uh_LofzORhvY6irhFVLGgpU4aJCJLO6hbXoxE9MIJC_vfU7Izh6rCJHE4HQR8J8zB4P3FLTt1FqYVTznVYKb9j2cU4xrPo415Ku15XW3YGKylalllUBomTBpEp9AmSqxhOnSa4oQzxzRxFgfbW60e0DnyNgc618JYWpvtvkGc64ck-nSZx63HnfVu3DIAJJ0hk4Ustw1ld08ymBa6trfOzJfBqK4oUTR9H-hMgbUnLIU2D1rIOWuZGUVcLSSIsK64J7sPkjZL7IzTVo6rlJ1312oD1ynCF4wyXgZVj2b0tPoRBp6eAc_t4FpKGltDkEp2QgWj4cPEA8D2etLrIiKuH9-mlo_H1qe7Ia-GjZF5r5Yf2n0LH2UDVWD7dQp0T3R3SBH6r-34iz6mlxO-02b1Mxuhe5_f-B4nFaoJu8A8yiaSxRNzRVHvJXA6e0VeTn_Ar9Ym1kGdGzgJiuGd0wfNHlBK2EB2KKDWAnjJJfvXK5dUpqPM29qfDiu6cBBVMm9CpQx3C5D-aDJPio0nwKEXcz3pRq6q4O82-QbNUPJg0xxK8UfIV6cVnER9nfBjldFdinTRpylneoBnphRelKWChn02GNiATjq0z0tJDDt4ls_fU0nq67iFBPCoG6Q3dW0tMgDC6iKYCcHpl36eilg8zmAwXvTwnU-dtKwq8iUA2piMsDhhXPAk6beX6qWgTi4QrDfzRGiev0poXKFNvq8w9nbso0RsvAGHIpprQ8jhH7CZn5qV8tADhdAAz65EO6q6qwUqmR17W5eWF7IO6pu4euONKVgmcZlrWbhX27xAe9UYcUlGBED0orT6AZA-P3jem7I-SygyLjSWxGdw5xS9k5yd5HRwfxkpKqjClzBmLWfJ-</w:t>
+      </w:r>
       <w:r>
         <w:lastRenderedPageBreak/>
-        <w:t>https://img.plantuml.biz/plantuml/svg/TLPBR-Cs4BxpLmnoYRE9ZUQQGx6ghNK4s98hoLq4tQBWMenDh4If8fri4FI_T_YIwDZD8UPyyt4qBmxvMIhQgsDJ4o9_SD7HdZPGSy7KMyUWxTMX9JLxLg1QwFd-eA3YFTiftWf2hgVJASJfTXtdKPbaQG484CB4iO4Ypl-8ywACocq1xsIx8RzbMKaMsTUK_Eiuso9WPEagIMCIVOsUo29TaEpB5mDuyhfO_bq-RU9tiewB8bh698-NIL7QJ-VnxzkuA4aHH_dyqKlpnwXSPKilvd6q24HS9caWPDlII_ghDhnvjbvlqsJk0emscvKJRB3N-iT40lDLLDWKx6eg9Mmbwp4mr2OBU00k5AvtxL6eGJeYHT268L2edeizOXtkVMtxAiIuJ4gKlxTjpQW0HB1kwYWH6vE8ADrv-z5ydctJqcd8hV5cSXoCta4th6zGhLgxdjoCtxs5FLFelC6qmnPmFfynDyxnCqLXV3LmuEqjoC3Ow9cclRIyieJ1Q7TEC4Ko-SVi3Da7nDAiZ8i7SXrL3HSRAbWDDHEL1AuagvzrDrFeMiM4uhG6Kwyx-CxGEYgMssJcQfYKGnLn6TIHgx2IwAjbOf3MxwISqB5YGKnxexiPTOXLRTOnCJexyNpGCTeGeyKwIJTH6gykXrgm_WKzdRT2ebdeMLVJ7MimGXVAQ5v7WqTA-ok7WAJT_t1oSdLW9suPPtD6grMxbvDdNklMbH_hfYbxBXNhXwwJGTUTyJiKhV-sTq8FR0SPPR8nQkbRImOAVj6mTWJJh0BZWoR2AVP25RkaUwJrsHwiX4sao_Gx6I7CnecC7NGYfqnX4__GxQMJtp0fwPwjC4LeVMsbFp_zPUlYPAcJFswSE1YQ6wHLBNvoxy-hyMyQfFqKdH-eGlf7gYdYAOX08iwWxAXEiOBHVdUua1hlupZrXX7cZuiUN7pdfs7Fi0BL0l-XIlze-rJHSAV4aylwKbz80Ogt4EyujlUvufyZanxsryPW9pZ3Wua1muox42RZ_Bq36QpxODtORKZm5b3lbpUsTJ4eUZOHvsFSHcSYTvtkWptRb8SHNz0EOHlT47XWzkCepyS418fBLy4mXl9uDTxrm_p1NtSg6le61_g2RThs3DG1RwjMC60_iIzr-nzeNxtIdk6qFUAhui3U02MWTOqsK0IfhqCxZ6RmoCIE6NXtQ3akssUu_p2RUTFLPiwv6vSu_EeUPZFu1FRl2ltL3vafNFqIu5Tcpx05uDvIg_PLJ7z5xcnsRsZZ52JEkgPf2Yxmk9DhVUQzxK0tdc3YJuTZNIRvGNxoWL3_Fz-nsuYUH5xxJHYzURTPtZS18pMu74y-vjIkuAle2Hz6jjh1WyqbqsJFjve7NPpav0teT44UpTzdR4pz_FmF</w:t>
-      </w:r>
-    </w:p>
-    <w:p/>
+        <w:t>RLAM_vY257MblRs5tXaEJJvUr2Xz3TNQZ1q375OTdNMtdYvfEJmYI3EHcCONY0Wh51b3PxIzqkzrWykv_73zdNWzPezW05juqmJU-hMhh3WpMSJzEhlhuGCxKokBiYafjIrF7jsbEZcL5LucZDEcOZkio6am0d43dcExpINV6OWc3KzsBtO5QWdnnhP3I93iGNkm8eT-y7B8jVapeN8k1TWHd2h6kiZT0m4vuGJe2Ugd32okLHo-SOgrQ6uju6ryq6W1e55xYv_2n2Yn6ppQizWeiyz8aT_0anU8csM6aNiWWsgkeCMv5a4lBR-BTrRLTAquWTrS_b9NJu9bPXaZ-D2uc56v73q673iqhPrU9E9BgLkFqtOdAppXGiRvuBKy-Xyumt2cE1bQT9l-Mh8YDoqgPeO7YW_1vdirx2nrKIFlF63WnwIHD4Qlz7CgdHYWyMFljuUI0h0RyoqVKsE8JDI4VSIPrTKf_eaGLQUPQ818rRYvP8MJUR2llgHj4_71qsDv-3_t5-Fb-fAKhILJmAlNWXd79PfjR0VQvhS2qGhAl3Lot-Xyz8DZQ9xCIPWNY3Hq0PFhs5jxHKgwkOk47Pd9j0zwFcYtoeEw8gyuTq1vMbLdWpJ5qoIDvfqxEru1ulNi5RJKc-dTVkgQPcBp4CXQHR2_1mbZJOtgz_cJw5uupDSJIvjOEiY9ysJZ-32zq7Y3doCg_FBcvCGtesgyAN2e_ApL2nhmkVA6YvJbqvz7eqkdw135ABowfd7ekbaDLFgW69vj8SJEwCF9aDlp0wyisOpMq9h6cnBQSVd76zy7jGYNr4V9xxF_EEgb-AiQ9WvwzqEd-UnqO5m05y80XqMh1H2JzAXQ9herIWuGFfNNvSIUJyYg7PVYW80ze80x__1pAWtwi19B5ogqPLNW7hhAXD-0dUQtAlU_Mrn44fb5BBJJ3b_t6EDRO-yPF8LSkMHwIffdXicgYdHjVAgrpB4rQuUzrNhaNxXBMPVJRIt-Ai2_jrwWGyWvrUhHvtpQr_mk2ArfeNkio3Fe_Zzu53NmKDNrwSRN7hEiTLX75TwxxcRwD7z9CI-Si9V_SfvvAzGHo6V7y5be4X0kr63Lmjia52C0szpK1ae_GcE25H4qCF0Cu06385XQ8jKNt3B7WIu2ardXxg0JsXhF_PUW8jZKz9hgdxN7-dvTn_PxItxmDI_Ty0l_jxbXhtxnPj_fzxKp1B6FYhKl7wfRdu5tDlRZuJctbf7cZgY8Gfyt6_ZaJbzQF8Uj7Uw3oyS71tOweD5ziZHj2KMh1w5juF_BwrWzGZlU8nk_gW8ZNuOfD3_gDXG5EyHFz17I3XayWF-TCClwUXPhIZL0HODxBrReaUxHrqu_E63xWTb7UyrCvZkFH46iC7pLm0TllQ4X0FL-n3FEN3w5XtjrdjZxhs8c6M3uzGbn447UGanR0qkOOM9amn_IwQ-jJTkEjeVfzzMsrI5klVBBIqWXOxtsojBnJZUU_y-a-duyvGLUWPuNd3_6GQAtZEuOu9_lq6bnr-v_HS0</w:t>
+      </w:r>
+    </w:p>
     <w:p>
       <w:pPr>
         <w:rPr>

</xml_diff>

<commit_message>
revision to UML Class Diagram/Candidates
</commit_message>
<xml_diff>
--- a/SDS_Communications.docx
+++ b/SDS_Communications.docx
@@ -677,6 +677,13 @@
                 <w:u w:val="single"/>
               </w:rPr>
             </w:pPr>
+            <w:r>
+              <w:rPr>
+                <w:color w:val="000000"/>
+                <w:u w:val="single"/>
+              </w:rPr>
+              <w:t>04/02/2026</w:t>
+            </w:r>
           </w:p>
         </w:tc>
         <w:tc>
@@ -697,6 +704,12 @@
                 <w:color w:val="000000"/>
               </w:rPr>
             </w:pPr>
+            <w:r>
+              <w:rPr>
+                <w:color w:val="000000"/>
+              </w:rPr>
+              <w:t>1.4</w:t>
+            </w:r>
           </w:p>
         </w:tc>
         <w:tc>
@@ -717,6 +730,12 @@
                 <w:color w:val="000000"/>
               </w:rPr>
             </w:pPr>
+            <w:r>
+              <w:rPr>
+                <w:color w:val="000000"/>
+              </w:rPr>
+              <w:t>Sequence Diagrams</w:t>
+            </w:r>
           </w:p>
         </w:tc>
         <w:tc>
@@ -738,6 +757,12 @@
                 <w:color w:val="000000"/>
               </w:rPr>
             </w:pPr>
+            <w:r>
+              <w:rPr>
+                <w:color w:val="000000"/>
+              </w:rPr>
+              <w:t>Clarize, Victor</w:t>
+            </w:r>
           </w:p>
         </w:tc>
       </w:tr>
@@ -761,6 +786,13 @@
                 <w:u w:val="single"/>
               </w:rPr>
             </w:pPr>
+            <w:r>
+              <w:rPr>
+                <w:color w:val="000000"/>
+                <w:u w:val="single"/>
+              </w:rPr>
+              <w:t>04/02/2026</w:t>
+            </w:r>
           </w:p>
         </w:tc>
         <w:tc>
@@ -781,6 +813,12 @@
                 <w:color w:val="000000"/>
               </w:rPr>
             </w:pPr>
+            <w:r>
+              <w:rPr>
+                <w:color w:val="000000"/>
+              </w:rPr>
+              <w:t>1.5</w:t>
+            </w:r>
           </w:p>
         </w:tc>
         <w:tc>
@@ -801,6 +839,12 @@
                 <w:color w:val="000000"/>
               </w:rPr>
             </w:pPr>
+            <w:r>
+              <w:rPr>
+                <w:color w:val="000000"/>
+              </w:rPr>
+              <w:t>Revise UML Class Diagram and Class Candidates</w:t>
+            </w:r>
           </w:p>
         </w:tc>
         <w:tc>
@@ -822,6 +866,12 @@
                 <w:color w:val="000000"/>
               </w:rPr>
             </w:pPr>
+            <w:r>
+              <w:rPr>
+                <w:color w:val="000000"/>
+              </w:rPr>
+              <w:t>Darien D. Chau</w:t>
+            </w:r>
           </w:p>
         </w:tc>
       </w:tr>
@@ -9320,7 +9370,23 @@
     </w:p>
     <w:p>
       <w:r>
-        <w:t>CLI --&gt; REG : User selects\n"Register User"\nand inputs credentials</w:t>
+        <w:t>CLI --&gt; REG : User selects\</w:t>
+      </w:r>
+      <w:proofErr w:type="spellStart"/>
+      <w:r>
+        <w:t>n"Register</w:t>
+      </w:r>
+      <w:proofErr w:type="spellEnd"/>
+      <w:r>
+        <w:t xml:space="preserve"> User"\</w:t>
+      </w:r>
+      <w:proofErr w:type="spellStart"/>
+      <w:r>
+        <w:t>nand</w:t>
+      </w:r>
+      <w:proofErr w:type="spellEnd"/>
+      <w:r>
+        <w:t xml:space="preserve"> inputs credentials</w:t>
       </w:r>
     </w:p>
     <w:p>
@@ -9631,7 +9697,15 @@
     </w:p>
     <w:p>
       <w:r>
-        <w:t>CLI --&gt; SM : User selects group chat\nand types message</w:t>
+        <w:t>CLI --&gt; SM : User selects group chat\</w:t>
+      </w:r>
+      <w:proofErr w:type="spellStart"/>
+      <w:r>
+        <w:t>nand</w:t>
+      </w:r>
+      <w:proofErr w:type="spellEnd"/>
+      <w:r>
+        <w:t xml:space="preserve"> types message</w:t>
       </w:r>
     </w:p>
     <w:p>
@@ -9666,7 +9740,15 @@
     </w:p>
     <w:p>
       <w:r>
-        <w:t>LOG .&gt; CLI : Update chatbox / console</w:t>
+        <w:t xml:space="preserve">LOG .&gt; CLI : Update </w:t>
+      </w:r>
+      <w:proofErr w:type="spellStart"/>
+      <w:r>
+        <w:t>chatbox</w:t>
+      </w:r>
+      <w:proofErr w:type="spellEnd"/>
+      <w:r>
+        <w:t xml:space="preserve"> / console</w:t>
       </w:r>
     </w:p>
     <w:p/>
@@ -9939,7 +10021,15 @@
     </w:p>
     <w:p>
       <w:r>
-        <w:t>DM --&gt; CLI : Display scrollable\nchat history</w:t>
+        <w:t>DM --&gt; CLI : Display scrollable\</w:t>
+      </w:r>
+      <w:proofErr w:type="spellStart"/>
+      <w:r>
+        <w:t>nchat</w:t>
+      </w:r>
+      <w:proofErr w:type="spellEnd"/>
+      <w:r>
+        <w:t xml:space="preserve"> history</w:t>
       </w:r>
     </w:p>
     <w:p/>
@@ -10178,7 +10268,15 @@
     </w:p>
     <w:p>
       <w:r>
-        <w:t>CLI --&gt; RCL : User selects\n"View Chat Logs" function</w:t>
+        <w:t>CLI --&gt; RCL : User selects\</w:t>
+      </w:r>
+      <w:proofErr w:type="spellStart"/>
+      <w:r>
+        <w:t>n"View</w:t>
+      </w:r>
+      <w:proofErr w:type="spellEnd"/>
+      <w:r>
+        <w:t xml:space="preserve"> Chat Logs" function</w:t>
       </w:r>
     </w:p>
     <w:p>
@@ -10203,7 +10301,15 @@
     </w:p>
     <w:p>
       <w:r>
-        <w:t>DISP --&gt; CLI : Display requested\nchat logs</w:t>
+        <w:t>DISP --&gt; CLI : Display requested\</w:t>
+      </w:r>
+      <w:proofErr w:type="spellStart"/>
+      <w:r>
+        <w:t>nchat</w:t>
+      </w:r>
+      <w:proofErr w:type="spellEnd"/>
+      <w:r>
+        <w:t xml:space="preserve"> logs</w:t>
       </w:r>
     </w:p>
     <w:p>
@@ -10608,95 +10714,586 @@
         <w:ind w:left="1440"/>
       </w:pPr>
       <w:r>
+        <w:rPr>
+          <w:b/>
+          <w:bCs/>
+        </w:rPr>
         <w:t>User</w:t>
       </w:r>
+      <w:r>
+        <w:rPr>
+          <w:b/>
+          <w:bCs/>
+        </w:rPr>
+        <w:t xml:space="preserve">: </w:t>
+      </w:r>
+      <w:r>
+        <w:t>General actors who interact with the system for its communication services.</w:t>
+      </w:r>
     </w:p>
     <w:p>
       <w:pPr>
         <w:ind w:left="1440"/>
       </w:pPr>
-      <w:r>
+    </w:p>
+    <w:p>
+      <w:pPr>
+        <w:ind w:left="1440"/>
+      </w:pPr>
+      <w:r>
+        <w:rPr>
+          <w:b/>
+          <w:bCs/>
+        </w:rPr>
         <w:t>IT User</w:t>
       </w:r>
+      <w:r>
+        <w:rPr>
+          <w:b/>
+          <w:bCs/>
+        </w:rPr>
+        <w:t xml:space="preserve">: </w:t>
+      </w:r>
+      <w:r>
+        <w:t>Super actors who interact with the system similar to regular users, but with elevated privileges in the GUI.</w:t>
+      </w:r>
     </w:p>
     <w:p>
       <w:pPr>
         <w:ind w:left="1440"/>
       </w:pPr>
-      <w:r>
-        <w:t>AdminPanel</w:t>
-      </w:r>
     </w:p>
     <w:p>
       <w:pPr>
         <w:ind w:left="1440"/>
       </w:pPr>
       <w:r>
-        <w:t>Client</w:t>
+        <w:rPr>
+          <w:b/>
+          <w:bCs/>
+        </w:rPr>
+        <w:t>GUI</w:t>
+      </w:r>
+      <w:r>
+        <w:rPr>
+          <w:b/>
+          <w:bCs/>
+        </w:rPr>
+        <w:t xml:space="preserve">: </w:t>
+      </w:r>
+      <w:r>
+        <w:t>The interactive interface where users can point and click to make actions and use the communication service.</w:t>
+      </w:r>
+    </w:p>
+    <w:p>
+      <w:pPr>
+        <w:pStyle w:val="ListParagraph"/>
+        <w:numPr>
+          <w:ilvl w:val="0"/>
+          <w:numId w:val="4"/>
+        </w:numPr>
+        <w:rPr>
+          <w:b/>
+          <w:bCs/>
+        </w:rPr>
+      </w:pPr>
+      <w:proofErr w:type="spellStart"/>
+      <w:r>
+        <w:rPr>
+          <w:b/>
+          <w:bCs/>
+        </w:rPr>
+        <w:t>ITControlPanelView</w:t>
+      </w:r>
+      <w:proofErr w:type="spellEnd"/>
+    </w:p>
+    <w:p>
+      <w:pPr>
+        <w:pStyle w:val="ListParagraph"/>
+        <w:numPr>
+          <w:ilvl w:val="1"/>
+          <w:numId w:val="4"/>
+        </w:numPr>
+        <w:rPr>
+          <w:b/>
+          <w:bCs/>
+        </w:rPr>
+      </w:pPr>
+      <w:r>
+        <w:t xml:space="preserve">An implied sub interface that contributes to the commands that an </w:t>
+      </w:r>
+      <w:proofErr w:type="spellStart"/>
+      <w:r>
+        <w:t>ITUser</w:t>
+      </w:r>
+      <w:proofErr w:type="spellEnd"/>
+      <w:r>
+        <w:t xml:space="preserve"> can execute.</w:t>
+      </w:r>
+    </w:p>
+    <w:p>
+      <w:pPr>
+        <w:pStyle w:val="ListParagraph"/>
+        <w:numPr>
+          <w:ilvl w:val="0"/>
+          <w:numId w:val="4"/>
+        </w:numPr>
+        <w:rPr>
+          <w:b/>
+          <w:bCs/>
+        </w:rPr>
+      </w:pPr>
+      <w:proofErr w:type="spellStart"/>
+      <w:r>
+        <w:rPr>
+          <w:b/>
+          <w:bCs/>
+        </w:rPr>
+        <w:t>GroupCreationView</w:t>
+      </w:r>
+      <w:proofErr w:type="spellEnd"/>
+    </w:p>
+    <w:p>
+      <w:pPr>
+        <w:pStyle w:val="ListParagraph"/>
+        <w:numPr>
+          <w:ilvl w:val="1"/>
+          <w:numId w:val="4"/>
+        </w:numPr>
+        <w:rPr>
+          <w:b/>
+          <w:bCs/>
+        </w:rPr>
+      </w:pPr>
+      <w:r>
+        <w:t xml:space="preserve">An implied sub interface that provides a graphical representation to search, add, and make a new chat with other users. </w:t>
+      </w:r>
+    </w:p>
+    <w:p>
+      <w:pPr>
+        <w:pStyle w:val="ListParagraph"/>
+        <w:numPr>
+          <w:ilvl w:val="0"/>
+          <w:numId w:val="4"/>
+        </w:numPr>
+        <w:rPr>
+          <w:b/>
+          <w:bCs/>
+        </w:rPr>
+      </w:pPr>
+      <w:proofErr w:type="spellStart"/>
+      <w:r>
+        <w:rPr>
+          <w:b/>
+          <w:bCs/>
+        </w:rPr>
+        <w:t>ChatOverlayView</w:t>
+      </w:r>
+      <w:proofErr w:type="spellEnd"/>
+    </w:p>
+    <w:p>
+      <w:pPr>
+        <w:pStyle w:val="ListParagraph"/>
+        <w:numPr>
+          <w:ilvl w:val="1"/>
+          <w:numId w:val="4"/>
+        </w:numPr>
+        <w:rPr>
+          <w:b/>
+          <w:bCs/>
+        </w:rPr>
+      </w:pPr>
+      <w:r>
+        <w:t xml:space="preserve">An implied sub interface that </w:t>
+      </w:r>
+      <w:r>
+        <w:t>serves as the graphical representation</w:t>
+      </w:r>
+      <w:r>
+        <w:tab/>
+        <w:t>for users to interact and communicate with other users.</w:t>
+      </w:r>
+    </w:p>
+    <w:p>
+      <w:pPr>
+        <w:pStyle w:val="ListParagraph"/>
+        <w:numPr>
+          <w:ilvl w:val="0"/>
+          <w:numId w:val="4"/>
+        </w:numPr>
+        <w:rPr>
+          <w:b/>
+          <w:bCs/>
+        </w:rPr>
+      </w:pPr>
+      <w:proofErr w:type="spellStart"/>
+      <w:r>
+        <w:rPr>
+          <w:b/>
+          <w:bCs/>
+        </w:rPr>
+        <w:t>LoginView</w:t>
+      </w:r>
+      <w:proofErr w:type="spellEnd"/>
+    </w:p>
+    <w:p>
+      <w:pPr>
+        <w:pStyle w:val="ListParagraph"/>
+        <w:numPr>
+          <w:ilvl w:val="1"/>
+          <w:numId w:val="4"/>
+        </w:numPr>
+        <w:rPr>
+          <w:b/>
+          <w:bCs/>
+        </w:rPr>
+      </w:pPr>
+      <w:r>
+        <w:t xml:space="preserve">An implied sub interface that is the first page that the user will see, in order to login to the communication application. </w:t>
+      </w:r>
+    </w:p>
+    <w:p>
+      <w:pPr>
+        <w:pStyle w:val="ListParagraph"/>
+        <w:numPr>
+          <w:ilvl w:val="0"/>
+          <w:numId w:val="4"/>
+        </w:numPr>
+        <w:rPr>
+          <w:b/>
+          <w:bCs/>
+        </w:rPr>
+      </w:pPr>
+      <w:proofErr w:type="spellStart"/>
+      <w:r>
+        <w:rPr>
+          <w:b/>
+          <w:bCs/>
+        </w:rPr>
+        <w:t>ClientNetwork</w:t>
+      </w:r>
+      <w:proofErr w:type="spellEnd"/>
+    </w:p>
+    <w:p>
+      <w:pPr>
+        <w:pStyle w:val="ListParagraph"/>
+        <w:numPr>
+          <w:ilvl w:val="1"/>
+          <w:numId w:val="4"/>
+        </w:numPr>
+        <w:rPr>
+          <w:b/>
+          <w:bCs/>
+        </w:rPr>
+      </w:pPr>
+      <w:r>
+        <w:t xml:space="preserve">Responsible for request creation, forwarding, and parsing to make decisions on the user’s behalf. Also serves as the user’s connection to the server. </w:t>
       </w:r>
     </w:p>
     <w:p>
       <w:pPr>
         <w:ind w:left="1440"/>
-      </w:pPr>
-      <w:r>
-        <w:t>Server</w:t>
-      </w:r>
+        <w:rPr>
+          <w:b/>
+          <w:bCs/>
+        </w:rPr>
+      </w:pPr>
     </w:p>
     <w:p>
       <w:pPr>
         <w:ind w:left="1440"/>
       </w:pPr>
       <w:r>
+        <w:rPr>
+          <w:b/>
+          <w:bCs/>
+        </w:rPr>
+        <w:t>Request</w:t>
+      </w:r>
+      <w:r>
+        <w:rPr>
+          <w:b/>
+          <w:bCs/>
+        </w:rPr>
+        <w:t xml:space="preserve">: </w:t>
+      </w:r>
+      <w:r>
+        <w:t>The designated class that defines how requests will be sent and received between the client and server.</w:t>
+      </w:r>
+    </w:p>
+    <w:p>
+      <w:pPr>
+        <w:ind w:left="1440"/>
+      </w:pPr>
+    </w:p>
+    <w:p>
+      <w:pPr>
+        <w:ind w:left="1440"/>
+      </w:pPr>
+      <w:proofErr w:type="spellStart"/>
+      <w:r>
+        <w:rPr>
+          <w:b/>
+          <w:bCs/>
+        </w:rPr>
+        <w:t>ServerNetwork</w:t>
+      </w:r>
+      <w:proofErr w:type="spellEnd"/>
+      <w:r>
+        <w:rPr>
+          <w:b/>
+          <w:bCs/>
+        </w:rPr>
+        <w:t xml:space="preserve">: </w:t>
+      </w:r>
+      <w:r>
+        <w:t xml:space="preserve">Initializes the server, accept incoming connections, and process incoming and forward outgoing requests. </w:t>
+      </w:r>
+    </w:p>
+    <w:p>
+      <w:pPr>
+        <w:pStyle w:val="ListParagraph"/>
+        <w:numPr>
+          <w:ilvl w:val="0"/>
+          <w:numId w:val="4"/>
+        </w:numPr>
+        <w:rPr>
+          <w:b/>
+          <w:bCs/>
+        </w:rPr>
+      </w:pPr>
+      <w:proofErr w:type="spellStart"/>
+      <w:r>
+        <w:rPr>
+          <w:b/>
+          <w:bCs/>
+        </w:rPr>
+        <w:t>ClientHandler</w:t>
+      </w:r>
+      <w:proofErr w:type="spellEnd"/>
+    </w:p>
+    <w:p>
+      <w:pPr>
+        <w:pStyle w:val="ListParagraph"/>
+        <w:numPr>
+          <w:ilvl w:val="1"/>
+          <w:numId w:val="4"/>
+        </w:numPr>
+        <w:rPr>
+          <w:b/>
+          <w:bCs/>
+        </w:rPr>
+      </w:pPr>
+      <w:r>
+        <w:t>Incoming connections are forwarded and receive a thread of execution to provide multithreaded capability with the communications application.</w:t>
+      </w:r>
+    </w:p>
+    <w:p>
+      <w:pPr>
+        <w:ind w:left="1440"/>
+      </w:pPr>
+      <w:proofErr w:type="spellStart"/>
+      <w:r>
+        <w:rPr>
+          <w:b/>
+          <w:bCs/>
+        </w:rPr>
+        <w:t>RequestHandler</w:t>
+      </w:r>
+      <w:proofErr w:type="spellEnd"/>
+      <w:r>
+        <w:rPr>
+          <w:b/>
+          <w:bCs/>
+        </w:rPr>
+        <w:t xml:space="preserve">: </w:t>
+      </w:r>
+      <w:r>
+        <w:t xml:space="preserve">Processes and creates requests that are inbound, dependent on the request’s specific type. </w:t>
+      </w:r>
+    </w:p>
+    <w:p>
+      <w:pPr>
+        <w:pStyle w:val="ListParagraph"/>
+        <w:numPr>
+          <w:ilvl w:val="0"/>
+          <w:numId w:val="4"/>
+        </w:numPr>
+        <w:rPr>
+          <w:b/>
+          <w:bCs/>
+        </w:rPr>
+      </w:pPr>
+      <w:proofErr w:type="spellStart"/>
+      <w:r>
+        <w:rPr>
+          <w:b/>
+          <w:bCs/>
+        </w:rPr>
+        <w:t>UserAuthenticator</w:t>
+      </w:r>
+      <w:proofErr w:type="spellEnd"/>
+    </w:p>
+    <w:p>
+      <w:pPr>
+        <w:pStyle w:val="ListParagraph"/>
+        <w:numPr>
+          <w:ilvl w:val="1"/>
+          <w:numId w:val="4"/>
+        </w:numPr>
+        <w:rPr>
+          <w:b/>
+          <w:bCs/>
+        </w:rPr>
+      </w:pPr>
+      <w:r>
+        <w:t>Processes requests that are relevant to logging in and logging out of the system.</w:t>
+      </w:r>
+    </w:p>
+    <w:p>
+      <w:pPr>
+        <w:pStyle w:val="ListParagraph"/>
+        <w:numPr>
+          <w:ilvl w:val="0"/>
+          <w:numId w:val="4"/>
+        </w:numPr>
+        <w:rPr>
+          <w:b/>
+          <w:bCs/>
+        </w:rPr>
+      </w:pPr>
+      <w:proofErr w:type="spellStart"/>
+      <w:r>
+        <w:rPr>
+          <w:b/>
+          <w:bCs/>
+        </w:rPr>
+        <w:t>ConnectionManager</w:t>
+      </w:r>
+      <w:proofErr w:type="spellEnd"/>
+    </w:p>
+    <w:p>
+      <w:pPr>
+        <w:pStyle w:val="ListParagraph"/>
+        <w:numPr>
+          <w:ilvl w:val="1"/>
+          <w:numId w:val="4"/>
+        </w:numPr>
+        <w:rPr>
+          <w:b/>
+          <w:bCs/>
+        </w:rPr>
+      </w:pPr>
+      <w:r>
+        <w:t>Processes requests that are relevant to connecting and disconnecting clients upon application start up.</w:t>
+      </w:r>
+    </w:p>
+    <w:p>
+      <w:pPr>
+        <w:pStyle w:val="ListParagraph"/>
+        <w:numPr>
+          <w:ilvl w:val="0"/>
+          <w:numId w:val="4"/>
+        </w:numPr>
+        <w:rPr>
+          <w:b/>
+          <w:bCs/>
+        </w:rPr>
+      </w:pPr>
+      <w:proofErr w:type="spellStart"/>
+      <w:r>
+        <w:rPr>
+          <w:b/>
+          <w:bCs/>
+        </w:rPr>
+        <w:t>StorageManager</w:t>
+      </w:r>
+      <w:proofErr w:type="spellEnd"/>
+    </w:p>
+    <w:p>
+      <w:pPr>
+        <w:pStyle w:val="ListParagraph"/>
+        <w:numPr>
+          <w:ilvl w:val="1"/>
+          <w:numId w:val="4"/>
+        </w:numPr>
+        <w:rPr>
+          <w:b/>
+          <w:bCs/>
+        </w:rPr>
+      </w:pPr>
+      <w:r>
+        <w:t xml:space="preserve">Processes requests that are relevant to general user information and storing them to files. </w:t>
+      </w:r>
+    </w:p>
+    <w:p>
+      <w:pPr>
+        <w:pStyle w:val="ListParagraph"/>
+        <w:numPr>
+          <w:ilvl w:val="0"/>
+          <w:numId w:val="4"/>
+        </w:numPr>
+        <w:rPr>
+          <w:b/>
+          <w:bCs/>
+        </w:rPr>
+      </w:pPr>
+      <w:proofErr w:type="spellStart"/>
+      <w:r>
+        <w:rPr>
+          <w:b/>
+          <w:bCs/>
+        </w:rPr>
+        <w:t>LoggingManager</w:t>
+      </w:r>
+      <w:proofErr w:type="spellEnd"/>
+    </w:p>
+    <w:p>
+      <w:pPr>
+        <w:pStyle w:val="ListParagraph"/>
+        <w:numPr>
+          <w:ilvl w:val="1"/>
+          <w:numId w:val="4"/>
+        </w:numPr>
+        <w:rPr>
+          <w:b/>
+          <w:bCs/>
+        </w:rPr>
+      </w:pPr>
+      <w:r>
+        <w:t xml:space="preserve">Processes requests that are relevant to all other managers, recording all information based on the log class. </w:t>
+      </w:r>
+    </w:p>
+    <w:p>
+      <w:pPr>
+        <w:ind w:left="1440"/>
+        <w:rPr>
+          <w:b/>
+          <w:bCs/>
+        </w:rPr>
+      </w:pPr>
+    </w:p>
+    <w:p>
+      <w:pPr>
+        <w:ind w:left="1440"/>
+      </w:pPr>
+      <w:r>
+        <w:rPr>
+          <w:b/>
+          <w:bCs/>
+        </w:rPr>
         <w:t>Log</w:t>
       </w:r>
-    </w:p>
-    <w:p>
-      <w:pPr>
-        <w:ind w:left="1440"/>
-      </w:pPr>
-      <w:r>
-        <w:t>Logger</w:t>
-      </w:r>
-    </w:p>
-    <w:p>
-      <w:pPr>
-        <w:ind w:left="1440"/>
-      </w:pPr>
-      <w:r>
-        <w:t>Message</w:t>
-      </w:r>
-    </w:p>
-    <w:p>
-      <w:pPr>
-        <w:ind w:left="1440"/>
-      </w:pPr>
-      <w:r>
-        <w:t>Networking (Client)</w:t>
-      </w:r>
-    </w:p>
-    <w:p>
-      <w:pPr>
-        <w:ind w:left="1440"/>
-      </w:pPr>
-      <w:r>
-        <w:t>Networking (Server)</w:t>
-      </w:r>
-    </w:p>
-    <w:p>
-      <w:pPr>
-        <w:ind w:left="1440"/>
-      </w:pPr>
-    </w:p>
-    <w:p>
-      <w:pPr>
-        <w:ind w:left="1440"/>
-      </w:pPr>
-    </w:p>
-    <w:p>
-      <w:pPr>
-        <w:ind w:left="1440"/>
-      </w:pPr>
+      <w:r>
+        <w:rPr>
+          <w:b/>
+          <w:bCs/>
+        </w:rPr>
+        <w:t xml:space="preserve">: </w:t>
+      </w:r>
+      <w:r>
+        <w:t xml:space="preserve">Defines the contents of what a log should be, and in turn, the specifics of what is to be written to a log file. </w:t>
+      </w:r>
     </w:p>
     <w:p>
       <w:pPr>
@@ -10715,6 +11312,7 @@
       <w:bookmarkStart w:id="38" w:name="_Toc223255455"/>
       <w:bookmarkStart w:id="39" w:name="_Toc224291132"/>
       <w:r>
+        <w:lastRenderedPageBreak/>
         <w:t xml:space="preserve">Full UML </w:t>
       </w:r>
       <w:r>
@@ -10749,11 +11347,11 @@
         <w:ind w:left="1440"/>
       </w:pPr>
       <w:r>
-        <w:t>bHfhRziuyhj_1T4lTHedsDx7ebYirrOI0V7ZBBb5SNie68csXSYIJfIR3OhzxpSpV4lsNgue494p7CvxXgH_anrlkzEn78taSr4rlEL7LXQLw5uRmUgsEzIZKkmwrjMiBVQ7ZkL5AxAkgAlHwFtDpGsBbjj5j9ccyMgPC9Y0QIQgqr6qdB3mcoNHvakqIT9fkar-ZXXRBH_ZPOGVTtVwAzfiLflHNoErO9iOTFPpfB6dNwVVHlFbV6GM_OLxyJndhVZFIKXW4fYMo6ftAEIGYqtqpssKfEctTVHpb4JB-I9AakbzDDf4zt6IAY4q4i2dczc36Ns9ew-prJATpjB4p3skflFPmpHzWBMhpJSplOccyyVLlHdEO9n6zvlLTkqMtiTBRx3QfcOqdS_rDexSOlKbwas2vA6QfP8GsKIrHQXasWR-Bi14y8TO86v0IXZ7wNgwZ1wL5eUaO3KgYbbAtvFjR0OAi-ExQVmOpTKGH82FzIR-0fj_DthLcthZv5kIHelleR5dZt6qJAsv6GDfbz4i9UBpEB53ffYT7NYr5woem7ch32nUxzX2ICbX4eo_KTwW_NEsMYosotYcFNIwNZ_gWV5Mn49_0pwcYVBXhEHIigqKBV03q7ZEFi5-7NndzQdgxEW4A1K_2fX8khQezZ3NmDgNkitzkKB6AOoVwheKl68m0xnt9mbppjLXbcU6_dGsMssDLaQZQ-9cVB949wontrS0xchrFRvo-rwplUY0UPf3XjM4vdc0kTQC3m09yKhJ7hVNJ7h476U8zgCkSeLWYJP31EN6g7_GZjK-WxdbAesIJwFtq_nOL6jUYPALeiebApefoXsQcREcxaJL5RnaPAy9Un907G3ts_XMsp1EhHNXqxDZqVcM15uL9WYf-8xJCNSMysJQ4-pAmM0khrUDg1opOuElFHQbciuNyP92xhoeYMX_0ASpY40W2pcjANacZY2X5iMHHsaWS91VQGMIQlsd8DcYO05RnEn6yFontilnhYZHTMNVReYoBsGdMkjrqlEw0Nu3GyM_yXsV0-L118pN19R6jQG7ACuIHaP0pPr7t4AcK8P-y4wSWptmSh26B06kmOwyg9JBQCtY9EOTYEvJsuB6qU5HCJQV-a1og4ygE_phbzlRZ_ycQDoieLwwo64C_byZxN4FT4K0ghpJfYcBZFAkOvIWB-2WXo-5U1dBFZC18YXtvlXICGeV1CiB2Kxq2YvLgPeTjMtTruWyFIbb2ACES8sYmgsrKaoIkoj4cVi2kbpN0_cxXtBnhXF7fgCjR10H98DOQecExAdYKByGuph7Zuywrv_B9qe2g13T2emFswCSshPrrV6iayPq7vJTEBgH01q1lYHB03bJJWoItZAkcbFtPbdBckSplMa8gI5R-3kEmHSmhyo7Cf468FKPuL4AKNNd4Q4r4o2CHJxAlHCcmCp0xPx12lMf6m_rTz_Mf</w:t>
+        <w:t>bHfhRziuyhj-1T4ljHl7QEzZKHIhjPL4W5zdoIsAsqF1IBGjH9Pqf9niKEn_lnc-H4hsNgue46bcE9pt32d_9bhAs_Ef30BnL5GDvVH4og9YxMl3ICtROnsKRD-IjYQyE1nRaXUSPMrHLq7m_lRsbaIhtJBQXccyNYK4000ch3gV6AUI2fz94cs_HTia3TDTyYiWPBrQnAi87-xkz5EqtQwtmL-1Mh1B33dv5MZgy7lu8vYlve5Pz1VkHVESSFQVCnCW90WjKDJsM8YX5DledxieITCVc-XNa4Ih-J9Aal0-2hRHVPoaIWbD1FXmEtimRz_YwFjilKh3MPeOs68TpcSFOVe0QzVR7mQyZSBvOdrlNcVmdaRts_LkqosyZrVEotgNchTmFjVRTEoMwszH3mYQ-sOMIaCK4yqMeP7bDl1t2Iw2Fr84AGre2UznkWbNqK9PSSWALgEXYENqCzdDPc0m-tuNnejehbv11NZOREDliFbFOrUzgVEU_4ZIQFdJT_Pi4KUhrBgR4D1s5SrIoNmU9_QLA65dHreT62ag2Dug0u_NUx9aGb00WlEtAXfqVCxMo-Lk5SzqX8QRpKA_c6X5Aemta2DCL0nd9HM2x0JZ80zWupdv3Fkry9pLvwgrRsSWgUY90I1fUL4T0DR0sfUQvowi474AxuzrNJ9Q4O20xErP0AmBTO3IpF0FPxFrpbWb26waDAEpPJeXZNqU0xgjrVDetErxGmwi1U4b30LM02tpW7AZ1HyW4Ych13lItX3XCEiaGxBdkiWLWMNQ30bK6AFzmJhM-YJGzezJwm5uT7nGjAuNO1z52GAgFUDqH3jhE_8S96xSuG2Mr-k6LM5-AgeDhLWvClGwskvtCJdHeY9IA2qQ0Z5I8HxEdBDAcWYZm6QWYvHgV5RnzA-Fq-cdVqjit6oWmdQs9WJ-to3lKGyrbWXPgyEcAOjCPggLL65Vm2p7RmLx6Oc-C1uX667MoQMy2WyIbnUYAUdhhAugLUKZpci-SZtsdeZpep86C-POr8UYmgsrKKnQt1Mip5q5k-peeTpTVRresx9JqyejhEia9WCFSib7z4nnh5-auBegZ4wwEboAGAK1r9Hs_SmuR8zwQD_MLKkpLXZNVL1-0r3npC16G2-a9u2TAK26I6yPLysvVREkPKtpcTxKnzGGe-wE8uW5ZERvK2Tf0LRbHddKWbNjPK9evWoKiSGdSUYKyIWp2Bidy49zRaT3-ztp-jpCE9F2EP5mGFZgSYW8LaAGCQinSUnytKO2d9uTaL2CeD3pLqynnr4tE1jetccToCtGSkSk6tkcEDNIhRZWZjUd_xq4JBil-4dgpQG9V5apx4_b1NF5AUx3wrAM7CTU5NlPNKyUm6ukvmzYo_emLnOBGQ2tn1jdXqAqZA_KhZvopw2UXEVs2C6ZAmwuNrmWmkIHABJJzP1yazzaXT4jd3pGAY-XD2cZQQW6ohwW9xy5Q05CD06o0LkTJ_fTsCQ1kpWQrPnGU0E4zDsILX3qNCMiVW6SZWY3pRnNm8FcK9eE1bzwhzYTVBb7HhdJ61RdjLxUcHM1M-qO7whjt2Ub-G08WBWQWDPkwY8iaJwv49z6ncxwiQECQRtOP8hCJ4Ko0_AvwZlu1_dJbhehiIWndkB9me521IgQ0ZmoH4WPD7YPtF_4WTJoSUO1oyB2EgkFkYIP4E4yS-Vvf9O1WU40UFCuLeC3A4K7az6iqrlYfEPgPhBA3XPjNOqlOAtQ4cSLTzZsHxfjPm07SMaaj1vE67_6n6-Xc3pfuYCaBDxqEhQQH91dHvIOyTKzshdTiKHna21JJwOljdLBosw-4DfVM24yaKO3OIQE9Cv0f5RrUaHRDvVW9IPLvUpkenyvzD-CYjRlXjeZVkM4DiWqMLkdiXdxv1FozotwACk1iXEKxKm9DLBc0aA5qKMZFy25qiXOpcQOZjRf6fquFbBUTxraOm1AWlPyMy2yqj9JOs9O0Y44aUIpEGng_zliSuB4Jq47qPy-bAknO0tOJuQy9nSPJmPSnqRpr2ZIfQF6m5OsfpfzXabbPR-OMJvsfiIuc63AVsz9C0NT-6ccuY2fioScrPGFYjoaddjkraxm6kJdNkTHflVa6XKDkPvVEYPnUBAvPAVll8lPgwFdzVnHcNXdH_HU9lg7Ja_Hde6xQG3cXZ1Dj_7lkpHAFgEoXBo7aKav8BD9Bn6tsg946CCYCLJpN83-MGsdmOEPuOLUyVjvlsUSvTXnOSS2Htkz49KMi5mqK5JiWWsOjVtE2sZa1Ef5HwxFXVASPCIHFh0d9qrOugb7UrmJcZi4siqnBDVaggO85zSft1kVTB2OESLd84SWF7IOEo54euMNKVgmddVc1REAbfypcAKavCPtoyYpyjXe9Pqlo1u6C5tlEcFUgCCtFyFyqcq2uTSAHONnsTtog2LcNcae5ynqVcrIJbyC8rcrXRql11b93aF-0KmetCsL6GmVmnoMZI_w6s-Tb1uk4wJPQWeZ2oI4LQgi8LBwSQdNkidLHVnmV1r4lHOFSC3R1DF4dhfrA2nfyyKalVhxLHB3E9CZSreApQdbD7lgECcxDjNX9Sm4PSBQBuQHGYUGEp9otA2v5ZC3nQphmU_5la0xTQ99lq5cAB4W74Yn9y-qB7BDxbAAZ7e9PXItfh4n8e-</w:t>
       </w:r>
       <w:r>
         <w:lastRenderedPageBreak/>
-        <w:t>sRM2cBEyuGzpY_FkmBaPN0oOILcdfulwqY2qRC3PR8nbEtsDH3CCzGrTdgQTbedj1bgxkIYiQUAOqrcnGLtRNtytqj0jRkYFPBSWbGGyffXjr6UKLUSuZvjNLAMzVHLYPVjvU01wFfy_22qhFTpfR4fCFGMVsjrpbwgNKFWJa0-cPww0vPCbN6e10oHC7W8X7gwx99liXjb6DsGiGTUvIMa9gKqFQidgKBhFluHf00Y6W79KBdJOrVnS1TFehfb74O08DijU0LEtogVrGE0QOymq2mO0XmaXzIqD_0o668v3VaU6-6ELx0uh_LofzORhvY6irhFVLGgpU4aJCJLO6hbXoxE9MIJC_vfU7Izh6rCJHE4HQR8J8zB4P3FLTt1FqYVTznVYKb9j2cU4xrPo415Ku15XW3YGKylalllUBomTBpEp9AmSqxhOnSa4oQzxzRxFgfbW60e0DnyNgc618JYWpvtvkGc64ck-nSZx63HnfVu3DIAJJ0hk4Ustw1ld08ymBa6trfOzJfBqK4oUTR9H-hMgbUnLIU2D1rIOWuZGUVcLSSIsK64J7sPkjZL7IzTVo6rlJ1312oD1ynCF4wyXgZVj2b0tPoRBp6eAc_t4FpKGltDkEp2QgWj4cPEA8D2etLrIiKuH9-mlo_H1qe7Ia-GjZF5r5Yf2n0LH2UDVWD7dQp0T3R3SBH6r-34iz6mlxO-02b1Mxuhe5_f-B4nFaoJu8A8yiaSxRNzRVHvJXA6e0VeTn_Ar9Ym1kGdGzgJiuGd0wfNHlBK2EB2KKDWAnjJJfvXK5dUpqPM29qfDiu6cBBVMm9CpQx3C5D-aDJPio0nwKEXcz3pRq6q4O82-QbNUPJg0xxK8UfIV6cVnER9nfBjldFdinTRpylneoBnphRelKWChn02GNiATjq0z0tJDDt4ls_fU0nq67iFBPCoG6Q3dW0tMgDC6iKYCcHpl36eilg8zmAwXvTwnU-dtKwq8iUA2piMsDhhXPAk6beX6qWgTi4QrDfzRGiev0poXKFNvq8w9nbso0RsvAGHIpprQ8jhH7CZn5qV8tADhdAAz65EO6q6qwUqmR17W5eWF7IO6pu4euONKVgmcZlrWbhX27xAe9UYcUlGBED0orT6AZA-P3jem7I-SygyLjSWxGdw5xS9k5yd5HRwfxkpKqjClzBmLWfJ-RLAM_vY257MblRs5tXaEJJvUr2Xz3TNQZ1q375OTdNMtdYvfEJmYI3EHcCONY0Wh51b3PxIzqkzrWykv_73zdNWzPezW05juqmJU-hMhh3WpMSJzEhlhuGCxKokBiYafjIrF7jsbEZcL5LucZDEcOZkio6am0d43dcExpINV6OWc3KzsBtO5QWdnnhP3I93iGNkm8eT-y7B8jVapeN8k1TWHd2h6kiZT0m4vuGJe2Ugd32okLHo-SOgrQ6uju6ryq6W1e55xYv_2n2Yn6ppQizWeiyz8aT_0anU8csM6aNiWWsgkeCMv5a4lBR-BTrRLTAquWTrS_b9NJu9bPXaZ-D2uc56v73q673iqhPrU9E9BgLkFqtOdAppXGiRvuBKy-Xyumt2cE1bQT9l-Mh8YDoqgPeO7YW_1vdirx2nrKIFlF63WnwIHD4Qlz7CgdHYWyMFljuUI0h0RyoqVKsE8JDI4VSIPrTKf_eaGLQUPQ818rRYvP8MJUR2llgHj4_71qsDv-3_t5-Fb-fAKhILJmAlNWXd79PfjR0VQvhS2qGhAl3Lot-Xyz8DZQ9xCIPWNY3Hq0PFhs5jxHKgwkOk47Pd9j0zwFcYtoeEw8gyuTq1vMbLdWpJ5qoIDvfqxEru1ulNi5RJKc-dTVkgQPcBp4CXQHR2_1mbZJOtgz_cJw5uupDSJIvjOEiY9ysJZ-32zq7Y3doCg_FBcvCGtesgyAN2e_ApL2nhmkVA6YvJbqvz7eqkdw135ABowfd7ekbaDLFgW69vj8SJEwCF9aDlp0wyisOpMq9h6cnBQSVd76zy7jGYNr4V9xxF_EEgb-AiQ9WvwzqEd-UnqO5m05y80XqMh1H2JzAXQ9herIWuGFfNNvSIUJyYg7PVYW80ze80x__1pAWtwi19B5ogqPLNW7hhAXD-0dUQtAlU_Mrn44fb5BBJJ3b_t6EDRO-yPF8LSkMHwIffdXicgYdHjVAgrpB4rQuUzrNhaNxXBMPVJRIt-Ai2_jrwWGyWvrUhHvtpQr_mk2ArfeNkio3Fe_Zzu53NmKDNrwSRN7hEiTLX75TwxxcRwD7z9CI-Si9V_SfvvAzGHo6V7y5be4X0kr63Lmjia52C0szpK1ae_GcE25H4qCF0Cu06385XQ8jKNt3B7WIu2ardXxg0JsXhF_PUW8jZKz9hgdxN7-dvTn_PxItxmDI_Ty0l_jxbXhtxnPj_fzxKp1B6FYhKl7wfRdu5tDlRZuJctbf7cZgY8Gfyt6_ZaJbzQF8Uj7Uw3oyS71tOweD5ziZHj2KMh1w5juF_BwrWzGZlU8nk_gW8ZNuOfD3_gDXG5EyHFz17I3XayWF-TCClwUXPhIZL0HODxBrReaUxHrqu_E63xWTb7UyrCvZkFH46iC7pLm0TllQ4X0FL-n3FEN3w5XtjrdjZxhs8c6M3uzGbn447UGanR0qkOOM9amn_IwQ-jJTkEjeVfzzMsrI5klVBBIqWXOxtsojBnJZUU_y-a-duyvGLUWPuNd3_6GQAtZEuOu9_lq6bnr-v_HS0</w:t>
+        <w:t>149nm0dHK5HCYVIwKNgwpIdKexcrW_NnaQ44GaNRNXGKeKMArURLdCDQN7ecZFm4dhh4sIuqXzju6LTt22FB4F5dD4ddSUwj96iwUvJINdzNb4rE5IVGaBWGUPbWEHu-1n5tPjW5lJapNIhTR9cnDrlMYIvik1ENCe-kDy-Bd12rBKtxBLyE6vMPCrSpmGFd5gsHV_S5MCptHnaqE-Uc15Tp4ZHPMbHERB6xszVP0Le1-OwNjMt84bL4sSQTmjaLrhiy2TALPnXfmOiLUhbdHL2wSgnVI-lBueBdH7EAVkkj1Nwqf-ifbWLSlacRajscri9zhcjqBP2iQyDMfVtxmoXiQnVTgJW2S8LFV1u-lVc_jDIevpLrXt9sPmFPWvwjngoJO5oM356gFg0zNTT8lNm2KqMZAiRFZ7IpUm5hDItrjg_chvcKkCe-5a518yqkSDDdSh7vRFFdgZIv8DRcsWUsBL5fUnWWkVEyLRY_6g3g_lBa8uTseIb_PU5Hz5afapVXIMyDbwjAfBwEnvIDCY8nLJZzpH3IJh1PA7L2iZFPmOY7wO3ACnkn8M-isioMCfjwsikouakEDpuDQv1hgqyIDcN-CUoNEgeQLizxlyOCk3ZgG3X0BNgB3WhKYw6awL4qp7GVU0TAz-hfMoFiP8NltjIm0P2y9yFuVt8nsanEuL0kNQd8L5M3UkigOMy0xInxKxFwsFF2rCWRPQw6wU3nWZ-KdMXBn2hNoH7IND9yR9ceeqRrot1iPucfVZ_gcTLY_K8xLLpFjBVwka7-tdk47aCkhrKUTosjVyBWYjAMPdhEWpgFw_UHGry73KDUd6rnwAR3LOHnNEby0jz6Y-n410U1g3I44VrLVXqxx2dqKwla9GWQQ18mRDKGrmm49rJXIdeF9mEYFS4IGJGGZ3283UC0h20nZaPeBfkI1GQX8S7Qi2tY4iVRJrF_kM9oQafsaH-LxeE7lFf7fb7mWwjyxa1T_8N5BtdrquE_KDxL0hq2gsw_ouNuN1txhqGiTcjwvtRzAwBXzd4u_MEB075Cqs3BpLWV-lT__oyjR7U3jZT7wZqgIoH-9AF8_AZ9KfRV_1_n2xne3mu6pKfqwqIlEnqOCm-vBB9pOy2liXzkyVgbkdK-G7hZtNS_33RvPUTZX9ngViMTLYPfY74oTJy2z4xTPEZZjN2CS37ZN2FtEVOtAhslIUrFfhwcz4DF9k0X_h7UfoaJdfpXQGHdPpezfB1SJFRwF3TQxW_H3MZFsxddWts_GRV6tIVy5</w:t>
       </w:r>
     </w:p>
     <w:p>
@@ -10778,32 +11376,27 @@
           <w:b/>
           <w:bCs/>
         </w:rPr>
-        <w:lastRenderedPageBreak/>
         <w:t>Image:</w:t>
       </w:r>
     </w:p>
     <w:p>
       <w:pPr>
         <w:ind w:left="1440" w:hanging="1440"/>
-      </w:pPr>
-      <w:r>
-        <w:tab/>
-      </w:r>
-      <w:r>
-        <w:t>https://img.plantuml.biz/plantuml/svg/bHfhRziuyhj_1T4lTHedsDx7ebYirrOI0V7ZBBb5SNie68csXSYIJfIR3OhzxpSpV4lsNgue494p7CvxXgH_anrlkzEn78taSr4rlEL7LXQLw5uRmUgsEzIZKkmwrjMiBVQ7ZkL5AxAkgAlHwFtDpGsBbjj5j9ccyMgPC9Y0QIQgqr6qdB3mcoNHvakqIT9fkar-ZXXRBH_ZPOGVTtVwAzfiLflHNoErO9iOTFPpfB6dNwVVHlFbV6GM_OLxyJndhVZFIKXW4fYMo6ftAEIGYqtqpssKfEctTVHpb4JB-I9AakbzDDf4zt6IAY4q4i2dczc36Ns9ew-prJATpjB4p3skflFPmpHzWBMhpJSplOccyyVLlHdEO9n6zvlLTkqMtiTBRx3QfcOqdS_rDexSOlKbwas2vA6QfP8GsKIrHQXasWR-Bi14y8TO86v0IXZ7wNgwZ1wL5eUaO3KgYbbAtvFjR0OAi-ExQVmOpTKGH82FzIR-0fj_DthLcthZv5kIHelleR5dZt6qJAsv6GDfbz4i9UBpEB53ffYT7NYr5woem7ch32nUxzX2ICbX4eo_KTwW_NEsMYosotYcFNIwNZ_gWV5Mn49_0pwcYVBXhEHIigqKBV03q7ZEFi5-7NndzQdgxEW4A1K_2fX8khQezZ3NmDgNkitzkKB6AOoVwheKl68m0xnt9mbppjLXbcU6_dGsMssDLaQZQ-9cVB949wontrS0xchrFRvo-rwplUY0UPf3XjM4vdc0kTQC3m09yKhJ7hVNJ7h476U8zgCkSeLWYJP31EN6g7_GZjK-WxdbAesIJwFtq_nOL6jUYPALeiebApefoXsQcREcxaJL5RnaPAy9Un907G3ts_XMsp1EhHNXqxDZqVcM15uL9WYf-8xJCNSMysJQ4-pAmM0khrUDg1opOuElFHQbciuNyP92xhoeYMX_0ASpY40W2pcjANacZY2X5iMHHsaWS91VQGMIQlsd8DcYO05RnEn6yFontilnhYZHTMNVReYoBsGdMkjrqlEw0Nu3GyM_yXsV0-L118pN19R6jQG7ACuIHaP0pPr7t4AcK8P-y4wSWptmSh26B06kmOwyg9JBQCtY9EOTYEvJsuB6qU5HCJQV-a1og4ygE_phbzlRZ_ycQDoieLwwo64C_byZxN4FT4K0ghpJfYcBZFAkOvIWB-2WXo-5U1dBFZC18YXtvlXICGeV1CiB2Kxq2YvLgPeTjMtTruWyFIbb2ACES8sYmgsrKaoIkoj4cVi2kbpN0_cxXtBnhXF7fgCjR10H98DOQecExAdYKByGuph7Zuywrv_B9qe2g13T2emFswCSshPrrV6iayPq7vJTEBgH01q1lYHB03bJJWoItZAkcbFtPbdBckSplMa8gI5R-3kEmHSmhyo7Cf468FKPuL4AKNNd4Q4r4o2CHJxAlHCcmCp0xPx12lMf6m_rTz_MfsRM2cBEyuGzpY_FkmBaPN0oOILcdfulwqY2qRC3PR8nbEtsDH3CCzGrTdgQTbedj1bgxkIYiQUAOqrcnGLtRNtytqj0jRkYFPBSWbGGyffXjr6UKLUSuZvjNLAMzVHLYPVjvU01wFfy_22qhFTpfR4fCFGMVsjrpbwgNKFWJa0-cPww0vPCbN6e10oHC7W8X7gwx99liXjb6DsGiGTUvIMa9gKqFQidgKBhFluHf00Y6W79KBdJOrVnS1TFehfb74O08DijU0LEtogVrGE0QOymq2mO0XmaXzIqD_0o668v3VaU6-6ELx0uh_LofzORhvY6irhFVLGgpU4aJCJLO6hbXoxE9MIJC_vfU7Izh6rCJHE4HQR8J8zB4P3FLTt1FqYVTznVYKb9j2cU4xrPo415Ku15XW3YGKylalllUBomTBpEp9AmSqxhOnSa4oQzxzRxFgfbW60e0DnyNgc618JYWpvtvkGc64ck-nSZx63HnfVu3DIAJJ0hk4Ustw1ld08ymBa6trfOzJfBqK4oUTR9H-hMgbUnLIU2D1rIOWuZGUVcLSSIsK64J7sPkjZL7IzTVo6rlJ1312oD1ynCF4wyXgZVj2b0tPoRBp6eAc_t4FpKGltDkEp2QgWj4cPEA8D2etLrIiKuH9-mlo_H1qe7Ia-GjZF5r5Yf2n0LH2UDVWD7dQp0T3R3SBH6r-34iz6mlxO-02b1Mxuhe5_f-B4nFaoJu8A8yiaSxRNzRVHvJXA6e0VeTn_Ar9Ym1kGdGzgJiuGd0wfNHlBK2EB2KKDWAnjJJfvXK5dUpqPM29qfDiu6cBBVMm9CpQx3C5D-aDJPio0nwKEXcz3pRq6q4O82-QbNUPJg0xxK8UfIV6cVnER9nfBjldFdinTRpylneoBnphRelKWChn02GNiATjq0z0tJDDt4ls_fU0nq67iFBPCoG6Q3dW0tMgDC6iKYCcHpl36eilg8zmAwXvTwnU-dtKwq8iUA2piMsDhhXPAk6beX6qWgTi4QrDfzRGiev0poXKFNvq8w9nbso0RsvAGHIpprQ8jhH7CZn5qV8tADhdAAz65EO6q6qwUqmR17W5eWF7IO6pu4euONKVgmcZlrWbhX27xAe9UYcUlGBED0orT6AZA-P3jem7I-SygyLjSWxGdw5xS9k5yd5HRwfxkpKqjClzBmLWfJ-</w:t>
-      </w:r>
-      <w:r>
-        <w:lastRenderedPageBreak/>
-        <w:t>RLAM_vY257MblRs5tXaEJJvUr2Xz3TNQZ1q375OTdNMtdYvfEJmYI3EHcCONY0Wh51b3PxIzqkzrWykv_73zdNWzPezW05juqmJU-hMhh3WpMSJzEhlhuGCxKokBiYafjIrF7jsbEZcL5LucZDEcOZkio6am0d43dcExpINV6OWc3KzsBtO5QWdnnhP3I93iGNkm8eT-y7B8jVapeN8k1TWHd2h6kiZT0m4vuGJe2Ugd32okLHo-SOgrQ6uju6ryq6W1e55xYv_2n2Yn6ppQizWeiyz8aT_0anU8csM6aNiWWsgkeCMv5a4lBR-BTrRLTAquWTrS_b9NJu9bPXaZ-D2uc56v73q673iqhPrU9E9BgLkFqtOdAppXGiRvuBKy-Xyumt2cE1bQT9l-Mh8YDoqgPeO7YW_1vdirx2nrKIFlF63WnwIHD4Qlz7CgdHYWyMFljuUI0h0RyoqVKsE8JDI4VSIPrTKf_eaGLQUPQ818rRYvP8MJUR2llgHj4_71qsDv-3_t5-Fb-fAKhILJmAlNWXd79PfjR0VQvhS2qGhAl3Lot-Xyz8DZQ9xCIPWNY3Hq0PFhs5jxHKgwkOk47Pd9j0zwFcYtoeEw8gyuTq1vMbLdWpJ5qoIDvfqxEru1ulNi5RJKc-dTVkgQPcBp4CXQHR2_1mbZJOtgz_cJw5uupDSJIvjOEiY9ysJZ-32zq7Y3doCg_FBcvCGtesgyAN2e_ApL2nhmkVA6YvJbqvz7eqkdw135ABowfd7ekbaDLFgW69vj8SJEwCF9aDlp0wyisOpMq9h6cnBQSVd76zy7jGYNr4V9xxF_EEgb-AiQ9WvwzqEd-UnqO5m05y80XqMh1H2JzAXQ9herIWuGFfNNvSIUJyYg7PVYW80ze80x__1pAWtwi19B5ogqPLNW7hhAXD-0dUQtAlU_Mrn44fb5BBJJ3b_t6EDRO-yPF8LSkMHwIffdXicgYdHjVAgrpB4rQuUzrNhaNxXBMPVJRIt-Ai2_jrwWGyWvrUhHvtpQr_mk2ArfeNkio3Fe_Zzu53NmKDNrwSRN7hEiTLX75TwxxcRwD7z9CI-Si9V_SfvvAzGHo6V7y5be4X0kr63Lmjia52C0szpK1ae_GcE25H4qCF0Cu06385XQ8jKNt3B7WIu2ardXxg0JsXhF_PUW8jZKz9hgdxN7-dvTn_PxItxmDI_Ty0l_jxbXhtxnPj_fzxKp1B6FYhKl7wfRdu5tDlRZuJctbf7cZgY8Gfyt6_ZaJbzQF8Uj7Uw3oyS71tOweD5ziZHj2KMh1w5juF_BwrWzGZlU8nk_gW8ZNuOfD3_gDXG5EyHFz17I3XayWF-TCClwUXPhIZL0HODxBrReaUxHrqu_E63xWTb7UyrCvZkFH46iC7pLm0TllQ4X0FL-n3FEN3w5XtjrdjZxhs8c6M3uzGbn447UGanR0qkOOM9amn_IwQ-jJTkEjeVfzzMsrI5klVBBIqWXOxtsojBnJZUU_y-a-duyvGLUWPuNd3_6GQAtZEuOu9_lq6bnr-v_HS0</w:t>
-      </w:r>
-    </w:p>
-    <w:p>
-      <w:pPr>
         <w:rPr>
           <w:b/>
           <w:bCs/>
         </w:rPr>
       </w:pPr>
+      <w:r>
+        <w:tab/>
+      </w:r>
+      <w:r>
+        <w:t>https://img.plantuml.biz/plantuml/svg/bHfhRziuyhj-1T4ljHl7QEzZKHIhjPL4W5zdoIsAsqF1IBGjH9Pqf9niKEn_lnc-H4hsNgue46bcE9pt32d_9bhAs_Ef30BnL5GDvVH4og9YxMl3ICtROnsKRD-IjYQyE1nRaXUSPMrHLq7m_lRsbaIhtJBQXccyNYK4000ch3gV6AUI2fz94cs_HTia3TDTyYiWPBrQnAi87-xkz5EqtQwtmL-1Mh1B33dv5MZgy7lu8vYlve5Pz1VkHVESSFQVCnCW90WjKDJsM8YX5DledxieITCVc-XNa4Ih-J9Aal0-2hRHVPoaIWbD1FXmEtimRz_YwFjilKh3MPeOs68TpcSFOVe0QzVR7mQyZSBvOdrlNcVmdaRts_LkqosyZrVEotgNchTmFjVRTEoMwszH3mYQ-sOMIaCK4yqMeP7bDl1t2Iw2Fr84AGre2UznkWbNqK9PSSWALgEXYENqCzdDPc0m-tuNnejehbv11NZOREDliFbFOrUzgVEU_4ZIQFdJT_Pi4KUhrBgR4D1s5SrIoNmU9_QLA65dHreT62ag2Dug0u_NUx9aGb00WlEtAXfqVCxMo-Lk5SzqX8QRpKA_c6X5Aemta2DCL0nd9HM2x0JZ80zWupdv3Fkry9pLvwgrRsSWgUY90I1fUL4T0DR0sfUQvowi474AxuzrNJ9Q4O20xErP0AmBTO3IpF0FPxFrpbWb26waDAEpPJeXZNqU0xgjrVDetErxGmwi1U4b30LM02tpW7AZ1HyW4Ych13lItX3XCEiaGxBdkiWLWMNQ30bK6AFzmJhM-YJGzezJwm5uT7nGjAuNO1z52GAgFUDqH3jhE_8S96xSuG2Mr-k6LM5-AgeDhLWvClGwskvtCJdHeY9IA2qQ0Z5I8HxEdBDAcWYZm6QWYvHgV5RnzA-Fq-cdVqjit6oWmdQs9WJ-to3lKGyrbWXPgyEcAOjCPggLL65Vm2p7RmLx6Oc-C1uX667MoQMy2WyIbnUYAUdhhAugLUKZpci-SZtsdeZpep86C-POr8UYmgsrKKnQt1Mip5q5k-peeTpTVRresx9JqyejhEia9WCFSib7z4nnh5-auBegZ4wwEboAGAK1r9Hs_SmuR8zwQD_MLKkpLXZNVL1-0r3npC16G2-a9u2TAK26I6yPLysvVREkPKtpcTxKnzGGe-wE8uW5ZERvK2Tf0LRbHddKWbNjPK9evWoKiSGdSUYKyIWp2Bidy49zRaT3-ztp-</w:t>
+      </w:r>
+      <w:r>
+        <w:lastRenderedPageBreak/>
+        <w:t>jpCE9F2EP5mGFZgSYW8LaAGCQinSUnytKO2d9uTaL2CeD3pLqynnr4tE1jetccToCtGSkSk6tkcEDNIhRZWZjUd_xq4JBil-4dgpQG9V5apx4_b1NF5AUx3wrAM7CTU5NlPNKyUm6ukvmzYo_emLnOBGQ2tn1jdXqAqZA_KhZvopw2UXEVs2C6ZAmwuNrmWmkIHABJJzP1yazzaXT4jd3pGAY-XD2cZQQW6ohwW9xy5Q05CD06o0LkTJ_fTsCQ1kpWQrPnGU0E4zDsILX3qNCMiVW6SZWY3pRnNm8FcK9eE1bzwhzYTVBb7HhdJ61RdjLxUcHM1M-qO7whjt2Ub-G08WBWQWDPkwY8iaJwv49z6ncxwiQECQRtOP8hCJ4Ko0_AvwZlu1_dJbhehiIWndkB9me521IgQ0ZmoH4WPD7YPtF_4WTJoSUO1oyB2EgkFkYIP4E4yS-Vvf9O1WU40UFCuLeC3A4K7az6iqrlYfEPgPhBA3XPjNOqlOAtQ4cSLTzZsHxfjPm07SMaaj1vE67_6n6-Xc3pfuYCaBDxqEhQQH91dHvIOyTKzshdTiKHna21JJwOljdLBosw-4DfVM24yaKO3OIQE9Cv0f5RrUaHRDvVW9IPLvUpkenyvzD-CYjRlXjeZVkM4DiWqMLkdiXdxv1FozotwACk1iXEKxKm9DLBc0aA5qKMZFy25qiXOpcQOZjRf6fquFbBUTxraOm1AWlPyMy2yqj9JOs9O0Y44aUIpEGng_zliSuB4Jq47qPy-bAknO0tOJuQy9nSPJmPSnqRpr2ZIfQF6m5OsfpfzXabbPR-OMJvsfiIuc63AVsz9C0NT-6ccuY2fioScrPGFYjoaddjkraxm6kJdNkTHflVa6XKDkPvVEYPnUBAvPAVll8lPgwFdzVnHcNXdH_HU9lg7Ja_Hde6xQG3cXZ1Dj_7lkpHAFgEoXBo7aKav8BD9Bn6tsg946CCYCLJpN83-MGsdmOEPuOLUyVjvlsUSvTXnOSS2Htkz49KMi5mqK5JiWWsOjVtE2sZa1Ef5HwxFXVASPCIHFh0d9qrOugb7UrmJcZi4siqnBDVaggO85zSft1kVTB2OESLd84SWF7IOEo54euMNKVgmddVc1REAbfypcAKavCPtoyYpyjXe9Pqlo1u6C5tlEcFUgCCtFyFyqcq2uTSAHONnsTtog2LcNcae5ynqVcrIJbyC8rcrXRql11b93aF-0KmetCsL6GmVmnoMZI_w6s-Tb1uk4wJPQWeZ2oI4LQgi8LBwSQdNkidLHVnmV1r4lHOFSC3R1DF4dhfrA2nfyyKalVhxLHB3E9CZSreApQdbD7lgECcxDjNX9Sm4PSBQBuQHGYUGEp9otA2v5ZC3nQphmU_5la0xTQ99lq5cAB4W74Yn9y-qB7BDxbAAZ7e9PXItfh4n8e-149nm0dHK5HCYVIwKNgwpIdKexcrW_NnaQ44GaNRNXGKeKMArURLdCDQN7ecZFm4dhh4sIuqXzju6LTt22FB4F5dD4ddSUwj96iwUvJINdzNb4rE5IVGaBWGUPbWEHu-1n5tPjW5lJapNIhTR9cnDrlMYIvik1ENCe-kDy-Bd12rBKtxBLyE6vMPCrSpmGFd5gsHV_S5MCptHnaqE-Uc15Tp4ZHPMbHERB6xszVP0Le1-OwNjMt84bL4sSQTmjaLrhiy2TALPnXfmOiLUhbdHL2wSgnVI-lBueBdH7EAVkkj1Nwqf-ifbWLSlacRajscri9zhcjqBP2iQyDMfVtxmoXiQnVTgJW2S8LFV1u-lVc_jDIevpLrXt9sPmFPWvwjngoJO5oM356gFg0zNTT8lNm2KqMZAiRFZ7IpUm5hDItrjg_chvcKkCe-5a518yqkSDDdSh7vRFFdgZIv8DRcsWUsBL5fUnWWkVEyLRY_6g3g_lBa8uTseIb_PU5Hz5afapVXIMyDbwjAfBwEnvIDCY8nLJZzpH3IJh1PA7L2iZFPmOY7wO3ACnkn8M-isioMCfjwsikouakEDpuDQv1hgqyIDcN-CUoNEgeQLizxlyOCk3ZgG3X0BNgB3WhKYw6awL4qp7GVU0TAz-hfMoFiP8NltjIm0P2y9yFuVt8nsanEuL0kNQd8L5M3UkigOMy0xInxKxFwsFF2rCWRPQw6wU3nWZ-KdMXBn2hNoH7IND9yR9ceeqRrot1iPucfVZ_gcTLY_K8xLLpFjBVwka7-tdk47aCkhrKUTosjVyBWYjAMPdhEWpgFw_UHGry73KDUd6rnwAR3LOHnNEby0jz6Y-n410U1g3I44VrLVXqxx2dqKwla9GWQQ18mRDKGrmm49rJXIdeF9mEYFS4IGJGGZ3283UC0h20nZaPeBfkI1GQX8S7Qi2tY4iVRJrF_kM9oQafsaH-LxeE7lFf7fb7mWwjyxa1T_8N5BtdrquE_KDxL0hq2gsw_ouNuN1txhqGiTcjwvtRzAwBXzd4u_MEB075Cqs3BpLWV-lT__oyjR7U3jZT7wZqgIoH-9AF8_AZ9KfRV_1_n2xne3mu6pKfqwqIlEnqOCm-vBB9pOy2liXzkyVgbkdK-G7hZtNS_33RvPUTZX9ngViMTLYPfY74oTJy2z4xTPEZZjN2CS37ZN2FtEVOtAhslIUrFfhwcz4DF9k0X_h7UfoaJdfpXQGHdPpezfB1SJFRwF3TQxW_H3MZFsxddWts_GRV6tIVy5</w:t>
+      </w:r>
     </w:p>
     <w:p>
       <w:pPr>
@@ -10849,45 +11442,102 @@
     </w:p>
     <w:p/>
     <w:p>
+      <w:pPr>
+        <w:rPr>
+          <w:b/>
+          <w:bCs/>
+        </w:rPr>
+      </w:pPr>
+      <w:r>
+        <w:rPr>
+          <w:b/>
+          <w:bCs/>
+        </w:rPr>
+        <w:t>Encoding:</w:t>
+      </w:r>
+    </w:p>
+    <w:p>
+      <w:r>
+        <w:t>fLN1Zjem4BtxAtm4gVi3IAmMqOeYBLJQNNftazbWrR6puycY_dt7JW8CILUjoW6mPzxCcpSly1398BMrKsJ9WJv4G6rygTUXhbjl2qCsUBrg6jT_LyeK531dgeR1jh2DyQGtXwquFuRA-kyMJk9sxInusWET0luKaMV0Ty2fo1EyjH3fA_DoDqqJYrLBHwwP-0KPVUOBKy7EU7x7MtPChveATHI7Rcgvr5STaXhBfL9PgBlxDFL2Pn6lD9hD5T-dy5c4XIvjR9pvnR4p-2fgYA1kADzmoZbowN6oL1pJrUpnssQxvp9z3o4f9u8lTn0ZppLpgKmltro9n8GKaYyqXfQWXxw45uCLa2ZnYOidnFRpN0biAYQtnFE6OHWbGobvj3TMu7841eqozDr4asjGETL8xdcXUPnCQzNfpOt66660Jj0dY4tm4MOjq-A9H4fcThC5GKmdrAtyms8dCeVDTei7MhU8d98awGc8X8ipTb_sXtcsx0Oye77T0xqgfdtR0Bu6hBlmnRGV60h_oqius8Zo-Qzir60ek4n_dTna7Ec-Klwq236D4cqay0KepQ_nLkMF0OzbtWU2N3LXPCQatnAeL2o8f16FeNMb_W79NnLdJ5EOC2EtpjN-pOKySUlEM_Z0XjWZ_cI-iNSUk0__7_m6</w:t>
+      </w:r>
+      <w:r>
+        <w:br/>
+      </w:r>
+      <w:r>
+        <w:br/>
+      </w:r>
+    </w:p>
+    <w:p>
+      <w:pPr>
+        <w:rPr>
+          <w:b/>
+          <w:bCs/>
+        </w:rPr>
+      </w:pPr>
+      <w:r>
+        <w:rPr>
+          <w:b/>
+          <w:bCs/>
+        </w:rPr>
+        <w:t>Image:</w:t>
+      </w:r>
+    </w:p>
+    <w:p>
+      <w:r>
+        <w:fldChar w:fldCharType="begin"/>
+      </w:r>
+      <w:r>
+        <w:instrText xml:space="preserve"> INCLUDEPICTURE "https://img.plantuml.biz/plantuml/png/fLN1Zjem4BtxAtm4gVi3IAmMqOeYBLJQNNftazbWrR6puycY_dt7JW8CILUjoW6mPzxCcpSly1398BMrKsJ9WJv4G6rygTUXhbjl2qCsUBrg6jT_LyeK531dgeR1jh2DyQGtXwquFuRA-kyMJk9sxInusWET0luKaMV0Ty2fo1EyjH3fA_DoDqqJYrLBHwwP-0KPVUOBKy7EU7x7MtPChveATHI7Rcgvr5STaXhBfL9PgBlxDFL2Pn6lD9hD5T-dy5c4XIvjR9pvnR4p-2fgYA1kADzmoZbowN6oL1pJrUpnssQxvp9z3o4f9u8lTn0ZppLpgKmltro9n8GKaYyqXfQWXxw45uCLa2ZnYOidnFRpN0biAYQtnFE6OHWbGobvj3TMu7841eqozDr4asjGETL8xdcXUPnCQzNfpOt66660Jj0dY4tm4MOjq-A9H4fcThC5GKmdrAtyms8dCeVDTei7MhU8d98awGc8X8ipTb_sXtcsx0Oye77T0xqgfdtR0Bu6hBlmnRGV60h_oqius8Zo-Qzir60ek4n_dTna7Ec-Klwq236D4cqay0KepQ_nLkMF0OzbtWU2N3LXPCQatnAeL2o8f16FeNMb_W79NnLdJ5EOC2EtpjN-pOKySUlEM_Z0XjWZ_cI-iNSUk0__7_m6" \* MERGEFORMATINET </w:instrText>
+      </w:r>
+      <w:r>
+        <w:fldChar w:fldCharType="separate"/>
+      </w:r>
       <w:r>
         <w:rPr>
           <w:noProof/>
         </w:rPr>
         <w:drawing>
-          <wp:inline distT="0" distB="0" distL="0" distR="0" wp14:anchorId="47646713" wp14:editId="71D32515">
-            <wp:extent cx="5095875" cy="5486400"/>
+          <wp:inline distT="0" distB="0" distL="0" distR="0" wp14:anchorId="7C674E73" wp14:editId="3FFF3FD9">
+            <wp:extent cx="5486400" cy="4057650"/>
             <wp:effectExtent l="0" t="0" r="0" b="0"/>
-            <wp:docPr id="1897449995" name="drawing"/>
+            <wp:docPr id="667765563" name="Picture 1" descr="A screenshot of a computer&#10;&#10;AI-generated content may be incorrect."/>
             <wp:cNvGraphicFramePr>
-              <a:graphicFrameLocks xmlns:a="http://schemas.openxmlformats.org/drawingml/2006/main" noChangeAspect="1"/>
+              <a:graphicFrameLocks xmlns:a="http://schemas.openxmlformats.org/drawingml/2006/main"/>
             </wp:cNvGraphicFramePr>
             <a:graphic xmlns:a="http://schemas.openxmlformats.org/drawingml/2006/main">
               <a:graphicData uri="http://schemas.openxmlformats.org/drawingml/2006/picture">
                 <pic:pic xmlns:pic="http://schemas.openxmlformats.org/drawingml/2006/picture">
                   <pic:nvPicPr>
-                    <pic:cNvPr id="1897449995" name="Picture 1897449995"/>
-                    <pic:cNvPicPr/>
+                    <pic:cNvPr id="667765563" name="Picture 1" descr="A screenshot of a computer&#10;&#10;AI-generated content may be incorrect."/>
+                    <pic:cNvPicPr>
+                      <a:picLocks/>
+                    </pic:cNvPicPr>
                   </pic:nvPicPr>
                   <pic:blipFill>
-                    <a:blip r:embed="rId23">
+                    <a:blip r:embed="rId23" cstate="print">
                       <a:extLst>
                         <a:ext uri="{28A0092B-C50C-407E-A947-70E740481C1C}">
-                          <a14:useLocalDpi xmlns:a14="http://schemas.microsoft.com/office/drawing/2010/main"/>
+                          <a14:useLocalDpi xmlns:a14="http://schemas.microsoft.com/office/drawing/2010/main" val="0"/>
                         </a:ext>
                       </a:extLst>
                     </a:blip>
+                    <a:srcRect/>
                     <a:stretch>
                       <a:fillRect/>
                     </a:stretch>
                   </pic:blipFill>
-                  <pic:spPr>
+                  <pic:spPr bwMode="auto">
                     <a:xfrm>
                       <a:off x="0" y="0"/>
-                      <a:ext cx="5095875" cy="5486400"/>
+                      <a:ext cx="5486400" cy="4057650"/>
                     </a:xfrm>
                     <a:prstGeom prst="rect">
                       <a:avLst/>
                     </a:prstGeom>
+                    <a:noFill/>
+                    <a:ln>
+                      <a:noFill/>
+                    </a:ln>
                   </pic:spPr>
                 </pic:pic>
               </a:graphicData>
@@ -10895,7 +11545,741 @@
           </wp:inline>
         </w:drawing>
       </w:r>
-    </w:p>
+      <w:r>
+        <w:fldChar w:fldCharType="end"/>
+      </w:r>
+    </w:p>
+    <w:p/>
+    <w:p>
+      <w:pPr>
+        <w:rPr>
+          <w:b/>
+          <w:bCs/>
+        </w:rPr>
+      </w:pPr>
+    </w:p>
+    <w:p>
+      <w:pPr>
+        <w:rPr>
+          <w:b/>
+          <w:bCs/>
+        </w:rPr>
+      </w:pPr>
+    </w:p>
+    <w:p>
+      <w:pPr>
+        <w:rPr>
+          <w:b/>
+          <w:bCs/>
+        </w:rPr>
+      </w:pPr>
+    </w:p>
+    <w:p>
+      <w:pPr>
+        <w:rPr>
+          <w:b/>
+          <w:bCs/>
+        </w:rPr>
+      </w:pPr>
+    </w:p>
+    <w:p>
+      <w:pPr>
+        <w:rPr>
+          <w:b/>
+          <w:bCs/>
+        </w:rPr>
+      </w:pPr>
+      <w:r>
+        <w:rPr>
+          <w:b/>
+          <w:bCs/>
+        </w:rPr>
+        <w:lastRenderedPageBreak/>
+        <w:t>Code:</w:t>
+      </w:r>
+    </w:p>
+    <w:p>
+      <w:r>
+        <w:t>@startuml</w:t>
+      </w:r>
+    </w:p>
+    <w:p>
+      <w:r>
+        <w:t>title User and Communication Application</w:t>
+      </w:r>
+    </w:p>
+    <w:p/>
+    <w:p>
+      <w:r>
+        <w:t>actor User</w:t>
+      </w:r>
+    </w:p>
+    <w:p>
+      <w:r>
+        <w:t>participant GUI</w:t>
+      </w:r>
+    </w:p>
+    <w:p>
+      <w:r>
+        <w:t xml:space="preserve">participant </w:t>
+      </w:r>
+      <w:proofErr w:type="spellStart"/>
+      <w:r>
+        <w:t>LoginView</w:t>
+      </w:r>
+      <w:proofErr w:type="spellEnd"/>
+    </w:p>
+    <w:p>
+      <w:r>
+        <w:t xml:space="preserve">participant </w:t>
+      </w:r>
+      <w:proofErr w:type="spellStart"/>
+      <w:r>
+        <w:t>ClientNetwork</w:t>
+      </w:r>
+      <w:proofErr w:type="spellEnd"/>
+    </w:p>
+    <w:p>
+      <w:r>
+        <w:t xml:space="preserve">participant </w:t>
+      </w:r>
+      <w:proofErr w:type="spellStart"/>
+      <w:r>
+        <w:t>ServerNetwork</w:t>
+      </w:r>
+      <w:proofErr w:type="spellEnd"/>
+    </w:p>
+    <w:p>
+      <w:r>
+        <w:t xml:space="preserve">participant </w:t>
+      </w:r>
+      <w:proofErr w:type="spellStart"/>
+      <w:r>
+        <w:t>RequestHandler</w:t>
+      </w:r>
+      <w:proofErr w:type="spellEnd"/>
+    </w:p>
+    <w:p>
+      <w:r>
+        <w:t xml:space="preserve">participant </w:t>
+      </w:r>
+      <w:proofErr w:type="spellStart"/>
+      <w:r>
+        <w:t>UserAuthenticator</w:t>
+      </w:r>
+      <w:proofErr w:type="spellEnd"/>
+    </w:p>
+    <w:p>
+      <w:r>
+        <w:t xml:space="preserve">participant </w:t>
+      </w:r>
+      <w:proofErr w:type="spellStart"/>
+      <w:r>
+        <w:t>StorageManager</w:t>
+      </w:r>
+      <w:proofErr w:type="spellEnd"/>
+    </w:p>
+    <w:p>
+      <w:r>
+        <w:t xml:space="preserve">participant </w:t>
+      </w:r>
+      <w:proofErr w:type="spellStart"/>
+      <w:r>
+        <w:t>LoggingManager</w:t>
+      </w:r>
+      <w:proofErr w:type="spellEnd"/>
+    </w:p>
+    <w:p>
+      <w:r>
+        <w:t xml:space="preserve">participant </w:t>
+      </w:r>
+      <w:proofErr w:type="spellStart"/>
+      <w:r>
+        <w:t>ClientHandler</w:t>
+      </w:r>
+      <w:proofErr w:type="spellEnd"/>
+    </w:p>
+    <w:p/>
+    <w:p>
+      <w:r>
+        <w:t>== Authentication ==</w:t>
+      </w:r>
+    </w:p>
+    <w:p/>
+    <w:p>
+      <w:r>
+        <w:t xml:space="preserve">User -&gt; GUI: </w:t>
+      </w:r>
+      <w:proofErr w:type="spellStart"/>
+      <w:r>
+        <w:t>startApplication</w:t>
+      </w:r>
+      <w:proofErr w:type="spellEnd"/>
+      <w:r>
+        <w:t>()</w:t>
+      </w:r>
+    </w:p>
+    <w:p>
+      <w:r>
+        <w:t xml:space="preserve">GUI -&gt; </w:t>
+      </w:r>
+      <w:proofErr w:type="spellStart"/>
+      <w:r>
+        <w:t>LoginView</w:t>
+      </w:r>
+      <w:proofErr w:type="spellEnd"/>
+      <w:r>
+        <w:t>: display()</w:t>
+      </w:r>
+    </w:p>
+    <w:p/>
+    <w:p>
+      <w:r>
+        <w:t xml:space="preserve">User -&gt; </w:t>
+      </w:r>
+      <w:proofErr w:type="spellStart"/>
+      <w:r>
+        <w:t>LoginView</w:t>
+      </w:r>
+      <w:proofErr w:type="spellEnd"/>
+      <w:r>
+        <w:t xml:space="preserve">: </w:t>
+      </w:r>
+      <w:proofErr w:type="spellStart"/>
+      <w:r>
+        <w:t>attemptLogin</w:t>
+      </w:r>
+      <w:proofErr w:type="spellEnd"/>
+      <w:r>
+        <w:t>()</w:t>
+      </w:r>
+    </w:p>
+    <w:p>
+      <w:proofErr w:type="spellStart"/>
+      <w:r>
+        <w:t>LoginView</w:t>
+      </w:r>
+      <w:proofErr w:type="spellEnd"/>
+      <w:r>
+        <w:t xml:space="preserve"> -&gt; GUI: </w:t>
+      </w:r>
+      <w:proofErr w:type="spellStart"/>
+      <w:r>
+        <w:t>switchView</w:t>
+      </w:r>
+      <w:proofErr w:type="spellEnd"/>
+      <w:r>
+        <w:t>(LOGIN)</w:t>
+      </w:r>
+    </w:p>
+    <w:p/>
+    <w:p>
+      <w:r>
+        <w:t xml:space="preserve">GUI -&gt; </w:t>
+      </w:r>
+      <w:proofErr w:type="spellStart"/>
+      <w:r>
+        <w:t>ClientNetwork</w:t>
+      </w:r>
+      <w:proofErr w:type="spellEnd"/>
+      <w:r>
+        <w:t xml:space="preserve">: </w:t>
+      </w:r>
+      <w:proofErr w:type="spellStart"/>
+      <w:r>
+        <w:t>sendMessage</w:t>
+      </w:r>
+      <w:proofErr w:type="spellEnd"/>
+      <w:r>
+        <w:t>(</w:t>
+      </w:r>
+      <w:proofErr w:type="spellStart"/>
+      <w:r>
+        <w:t>loginRequest</w:t>
+      </w:r>
+      <w:proofErr w:type="spellEnd"/>
+      <w:r>
+        <w:t>)</w:t>
+      </w:r>
+    </w:p>
+    <w:p>
+      <w:proofErr w:type="spellStart"/>
+      <w:r>
+        <w:t>ClientNetwork</w:t>
+      </w:r>
+      <w:proofErr w:type="spellEnd"/>
+      <w:r>
+        <w:t xml:space="preserve"> -&gt; </w:t>
+      </w:r>
+      <w:proofErr w:type="spellStart"/>
+      <w:r>
+        <w:t>ServerNetwork</w:t>
+      </w:r>
+      <w:proofErr w:type="spellEnd"/>
+      <w:r>
+        <w:t xml:space="preserve">: </w:t>
+      </w:r>
+      <w:proofErr w:type="spellStart"/>
+      <w:r>
+        <w:t>routeMessageToTarget</w:t>
+      </w:r>
+      <w:proofErr w:type="spellEnd"/>
+      <w:r>
+        <w:t>(</w:t>
+      </w:r>
+      <w:proofErr w:type="spellStart"/>
+      <w:r>
+        <w:t>loginRequest</w:t>
+      </w:r>
+      <w:proofErr w:type="spellEnd"/>
+      <w:r>
+        <w:t xml:space="preserve">, </w:t>
+      </w:r>
+      <w:proofErr w:type="spellStart"/>
+      <w:r>
+        <w:t>serverID</w:t>
+      </w:r>
+      <w:proofErr w:type="spellEnd"/>
+      <w:r>
+        <w:t>)</w:t>
+      </w:r>
+    </w:p>
+    <w:p>
+      <w:proofErr w:type="spellStart"/>
+      <w:r>
+        <w:t>ServerNetwork</w:t>
+      </w:r>
+      <w:proofErr w:type="spellEnd"/>
+      <w:r>
+        <w:t xml:space="preserve"> -&gt; </w:t>
+      </w:r>
+      <w:proofErr w:type="spellStart"/>
+      <w:r>
+        <w:t>RequestHandler</w:t>
+      </w:r>
+      <w:proofErr w:type="spellEnd"/>
+      <w:r>
+        <w:t xml:space="preserve">: </w:t>
+      </w:r>
+      <w:proofErr w:type="spellStart"/>
+      <w:r>
+        <w:t>doLogin</w:t>
+      </w:r>
+      <w:proofErr w:type="spellEnd"/>
+      <w:r>
+        <w:t>()</w:t>
+      </w:r>
+    </w:p>
+    <w:p/>
+    <w:p>
+      <w:proofErr w:type="spellStart"/>
+      <w:r>
+        <w:t>RequestHandler</w:t>
+      </w:r>
+      <w:proofErr w:type="spellEnd"/>
+      <w:r>
+        <w:t xml:space="preserve"> -&gt; </w:t>
+      </w:r>
+      <w:proofErr w:type="spellStart"/>
+      <w:r>
+        <w:t>UserAuthenticator</w:t>
+      </w:r>
+      <w:proofErr w:type="spellEnd"/>
+      <w:r>
+        <w:t>: authenticate()</w:t>
+      </w:r>
+    </w:p>
+    <w:p>
+      <w:proofErr w:type="spellStart"/>
+      <w:r>
+        <w:t>UserAuthenticator</w:t>
+      </w:r>
+      <w:proofErr w:type="spellEnd"/>
+      <w:r>
+        <w:t xml:space="preserve"> --&gt; </w:t>
+      </w:r>
+      <w:proofErr w:type="spellStart"/>
+      <w:r>
+        <w:t>RequestHandler</w:t>
+      </w:r>
+      <w:proofErr w:type="spellEnd"/>
+      <w:r>
+        <w:t>: authenticated</w:t>
+      </w:r>
+    </w:p>
+    <w:p/>
+    <w:p>
+      <w:proofErr w:type="spellStart"/>
+      <w:r>
+        <w:t>RequestHandler</w:t>
+      </w:r>
+      <w:proofErr w:type="spellEnd"/>
+      <w:r>
+        <w:t xml:space="preserve"> -&gt; </w:t>
+      </w:r>
+      <w:proofErr w:type="spellStart"/>
+      <w:r>
+        <w:t>LoggingManager</w:t>
+      </w:r>
+      <w:proofErr w:type="spellEnd"/>
+      <w:r>
+        <w:t xml:space="preserve">: </w:t>
+      </w:r>
+      <w:proofErr w:type="spellStart"/>
+      <w:r>
+        <w:t>logLoginAttempt</w:t>
+      </w:r>
+      <w:proofErr w:type="spellEnd"/>
+      <w:r>
+        <w:t>()</w:t>
+      </w:r>
+    </w:p>
+    <w:p>
+      <w:proofErr w:type="spellStart"/>
+      <w:r>
+        <w:t>RequestHandler</w:t>
+      </w:r>
+      <w:proofErr w:type="spellEnd"/>
+      <w:r>
+        <w:t xml:space="preserve"> -&gt; </w:t>
+      </w:r>
+      <w:proofErr w:type="spellStart"/>
+      <w:r>
+        <w:t>ClientHandler</w:t>
+      </w:r>
+      <w:proofErr w:type="spellEnd"/>
+      <w:r>
+        <w:t xml:space="preserve">: </w:t>
+      </w:r>
+      <w:proofErr w:type="spellStart"/>
+      <w:r>
+        <w:t>sendResponse</w:t>
+      </w:r>
+      <w:proofErr w:type="spellEnd"/>
+      <w:r>
+        <w:t>(user)</w:t>
+      </w:r>
+    </w:p>
+    <w:p/>
+    <w:p>
+      <w:proofErr w:type="spellStart"/>
+      <w:r>
+        <w:t>ClientHandler</w:t>
+      </w:r>
+      <w:proofErr w:type="spellEnd"/>
+      <w:r>
+        <w:t xml:space="preserve"> --&gt; </w:t>
+      </w:r>
+      <w:proofErr w:type="spellStart"/>
+      <w:r>
+        <w:t>ClientNetwork</w:t>
+      </w:r>
+      <w:proofErr w:type="spellEnd"/>
+      <w:r>
+        <w:t>: authenticated user</w:t>
+      </w:r>
+    </w:p>
+    <w:p>
+      <w:proofErr w:type="spellStart"/>
+      <w:r>
+        <w:t>ClientNetwork</w:t>
+      </w:r>
+      <w:proofErr w:type="spellEnd"/>
+      <w:r>
+        <w:t xml:space="preserve"> --&gt; GUI: authenticated user</w:t>
+      </w:r>
+    </w:p>
+    <w:p/>
+    <w:p>
+      <w:r>
+        <w:t xml:space="preserve">GUI -&gt; GUI: </w:t>
+      </w:r>
+      <w:proofErr w:type="spellStart"/>
+      <w:r>
+        <w:t>setCurrentUser</w:t>
+      </w:r>
+      <w:proofErr w:type="spellEnd"/>
+      <w:r>
+        <w:t>(user)</w:t>
+      </w:r>
+    </w:p>
+    <w:p>
+      <w:r>
+        <w:t xml:space="preserve">GUI -&gt; GUI: </w:t>
+      </w:r>
+      <w:proofErr w:type="spellStart"/>
+      <w:r>
+        <w:t>switchView</w:t>
+      </w:r>
+      <w:proofErr w:type="spellEnd"/>
+      <w:r>
+        <w:t>(MENU)</w:t>
+      </w:r>
+    </w:p>
+    <w:p/>
+    <w:p>
+      <w:r>
+        <w:t>== General User Action ==</w:t>
+      </w:r>
+    </w:p>
+    <w:p/>
+    <w:p>
+      <w:r>
+        <w:t xml:space="preserve">User -&gt; GUI: </w:t>
+      </w:r>
+      <w:proofErr w:type="spellStart"/>
+      <w:r>
+        <w:t>performAction</w:t>
+      </w:r>
+      <w:proofErr w:type="spellEnd"/>
+      <w:r>
+        <w:t>()</w:t>
+      </w:r>
+    </w:p>
+    <w:p>
+      <w:r>
+        <w:t xml:space="preserve">GUI -&gt; </w:t>
+      </w:r>
+      <w:proofErr w:type="spellStart"/>
+      <w:r>
+        <w:t>ClientNetwork</w:t>
+      </w:r>
+      <w:proofErr w:type="spellEnd"/>
+      <w:r>
+        <w:t xml:space="preserve">: </w:t>
+      </w:r>
+      <w:proofErr w:type="spellStart"/>
+      <w:r>
+        <w:t>sendMessage</w:t>
+      </w:r>
+      <w:proofErr w:type="spellEnd"/>
+      <w:r>
+        <w:t>(request)</w:t>
+      </w:r>
+    </w:p>
+    <w:p>
+      <w:proofErr w:type="spellStart"/>
+      <w:r>
+        <w:t>ClientNetwork</w:t>
+      </w:r>
+      <w:proofErr w:type="spellEnd"/>
+      <w:r>
+        <w:t xml:space="preserve"> -&gt; </w:t>
+      </w:r>
+      <w:proofErr w:type="spellStart"/>
+      <w:r>
+        <w:t>ServerNetwork</w:t>
+      </w:r>
+      <w:proofErr w:type="spellEnd"/>
+      <w:r>
+        <w:t xml:space="preserve">: </w:t>
+      </w:r>
+      <w:proofErr w:type="spellStart"/>
+      <w:r>
+        <w:t>routeMessageToTarget</w:t>
+      </w:r>
+      <w:proofErr w:type="spellEnd"/>
+      <w:r>
+        <w:t xml:space="preserve">(request, </w:t>
+      </w:r>
+      <w:proofErr w:type="spellStart"/>
+      <w:r>
+        <w:t>targetID</w:t>
+      </w:r>
+      <w:proofErr w:type="spellEnd"/>
+      <w:r>
+        <w:t>)</w:t>
+      </w:r>
+    </w:p>
+    <w:p>
+      <w:proofErr w:type="spellStart"/>
+      <w:r>
+        <w:t>ServerNetwork</w:t>
+      </w:r>
+      <w:proofErr w:type="spellEnd"/>
+      <w:r>
+        <w:t xml:space="preserve"> -&gt; </w:t>
+      </w:r>
+      <w:proofErr w:type="spellStart"/>
+      <w:r>
+        <w:t>RequestHandler</w:t>
+      </w:r>
+      <w:proofErr w:type="spellEnd"/>
+      <w:r>
+        <w:t xml:space="preserve">: </w:t>
+      </w:r>
+      <w:proofErr w:type="spellStart"/>
+      <w:r>
+        <w:t>processRequest</w:t>
+      </w:r>
+      <w:proofErr w:type="spellEnd"/>
+      <w:r>
+        <w:t>()</w:t>
+      </w:r>
+    </w:p>
+    <w:p/>
+    <w:p>
+      <w:r>
+        <w:t>alt request requires persistence</w:t>
+      </w:r>
+    </w:p>
+    <w:p>
+      <w:r>
+        <w:t xml:space="preserve">    </w:t>
+      </w:r>
+      <w:proofErr w:type="spellStart"/>
+      <w:r>
+        <w:t>RequestHandler</w:t>
+      </w:r>
+      <w:proofErr w:type="spellEnd"/>
+      <w:r>
+        <w:t xml:space="preserve"> -&gt; </w:t>
+      </w:r>
+      <w:proofErr w:type="spellStart"/>
+      <w:r>
+        <w:t>StorageManager</w:t>
+      </w:r>
+      <w:proofErr w:type="spellEnd"/>
+      <w:r>
+        <w:t xml:space="preserve">: </w:t>
+      </w:r>
+      <w:proofErr w:type="spellStart"/>
+      <w:r>
+        <w:t>saveMessage</w:t>
+      </w:r>
+      <w:proofErr w:type="spellEnd"/>
+      <w:r>
+        <w:t>()</w:t>
+      </w:r>
+    </w:p>
+    <w:p>
+      <w:r>
+        <w:t xml:space="preserve">    </w:t>
+      </w:r>
+      <w:proofErr w:type="spellStart"/>
+      <w:r>
+        <w:t>StorageManager</w:t>
+      </w:r>
+      <w:proofErr w:type="spellEnd"/>
+      <w:r>
+        <w:t xml:space="preserve"> --&gt; </w:t>
+      </w:r>
+      <w:proofErr w:type="spellStart"/>
+      <w:r>
+        <w:t>RequestHandler</w:t>
+      </w:r>
+      <w:proofErr w:type="spellEnd"/>
+      <w:r>
+        <w:t>: saved</w:t>
+      </w:r>
+    </w:p>
+    <w:p>
+      <w:r>
+        <w:t>end</w:t>
+      </w:r>
+    </w:p>
+    <w:p/>
+    <w:p>
+      <w:r>
+        <w:t>alt request should be logged</w:t>
+      </w:r>
+    </w:p>
+    <w:p>
+      <w:r>
+        <w:t xml:space="preserve">    </w:t>
+      </w:r>
+      <w:proofErr w:type="spellStart"/>
+      <w:r>
+        <w:t>RequestHandler</w:t>
+      </w:r>
+      <w:proofErr w:type="spellEnd"/>
+      <w:r>
+        <w:t xml:space="preserve"> -&gt; </w:t>
+      </w:r>
+      <w:proofErr w:type="spellStart"/>
+      <w:r>
+        <w:t>LoggingManager</w:t>
+      </w:r>
+      <w:proofErr w:type="spellEnd"/>
+      <w:r>
+        <w:t>: log()</w:t>
+      </w:r>
+    </w:p>
+    <w:p>
+      <w:r>
+        <w:t>end</w:t>
+      </w:r>
+    </w:p>
+    <w:p/>
+    <w:p>
+      <w:proofErr w:type="spellStart"/>
+      <w:r>
+        <w:t>RequestHandler</w:t>
+      </w:r>
+      <w:proofErr w:type="spellEnd"/>
+      <w:r>
+        <w:t xml:space="preserve"> -&gt; </w:t>
+      </w:r>
+      <w:proofErr w:type="spellStart"/>
+      <w:r>
+        <w:t>ClientHandler</w:t>
+      </w:r>
+      <w:proofErr w:type="spellEnd"/>
+      <w:r>
+        <w:t xml:space="preserve">: </w:t>
+      </w:r>
+      <w:proofErr w:type="spellStart"/>
+      <w:r>
+        <w:t>sendResponse</w:t>
+      </w:r>
+      <w:proofErr w:type="spellEnd"/>
+      <w:r>
+        <w:t>(result)</w:t>
+      </w:r>
+    </w:p>
+    <w:p>
+      <w:proofErr w:type="spellStart"/>
+      <w:r>
+        <w:t>ClientHandler</w:t>
+      </w:r>
+      <w:proofErr w:type="spellEnd"/>
+      <w:r>
+        <w:t xml:space="preserve"> --&gt; </w:t>
+      </w:r>
+      <w:proofErr w:type="spellStart"/>
+      <w:r>
+        <w:t>ClientNetwork</w:t>
+      </w:r>
+      <w:proofErr w:type="spellEnd"/>
+      <w:r>
+        <w:t>: response</w:t>
+      </w:r>
+    </w:p>
+    <w:p>
+      <w:proofErr w:type="spellStart"/>
+      <w:r>
+        <w:t>ClientNetwork</w:t>
+      </w:r>
+      <w:proofErr w:type="spellEnd"/>
+      <w:r>
+        <w:t xml:space="preserve"> --&gt; GUI: </w:t>
+      </w:r>
+      <w:proofErr w:type="spellStart"/>
+      <w:r>
+        <w:t>switchView</w:t>
+      </w:r>
+      <w:proofErr w:type="spellEnd"/>
+      <w:r>
+        <w:t>(MENU)</w:t>
+      </w:r>
+    </w:p>
+    <w:p/>
+    <w:p>
+      <w:r>
+        <w:t>@enduml</w:t>
+      </w:r>
+    </w:p>
+    <w:p/>
     <w:p>
       <w:pPr>
         <w:pStyle w:val="Heading2"/>
@@ -10919,46 +12303,97 @@
     </w:p>
     <w:p/>
     <w:p>
+      <w:pPr>
+        <w:rPr>
+          <w:b/>
+          <w:bCs/>
+        </w:rPr>
+      </w:pPr>
+      <w:r>
+        <w:rPr>
+          <w:b/>
+          <w:bCs/>
+        </w:rPr>
+        <w:t>Encoding:</w:t>
+      </w:r>
+    </w:p>
+    <w:p>
+      <w:r>
+        <w:t>fLNRZjem47ttL_WHfEuF855jH2iQYOKLc-sxcqo3LSTExScY_drdSWEJx8ggF23YEJDpvinnU0oeF3QL4QZHW4mp-Hh0IsKBkN5LrLYTAzJEogIkJVzR29MZymHchAYfWivrhIpAxMiQFUzSgUrt3UVeDCqspg9tvbbPC9FmncYmk0SyE_yhYho0VmC_5pd2xmO2VYFYveOJaqmQF55D7i35qHSwK2KyAKlV_fOyiI_dGXt5ePjOh-LL1vPhlHQYqqS-V6PPLhAL-ah6nLBGEOT7bLQoqA4swW_5hjAluWeHgXhR4mADaKkNiyRyn4UBtM6RxgbGtoMIbO1WYoS8WMPR62xJIxWK4P0p8zbNqhi6eK_DNAPy2HYL-4J5EIFziXHHBXUBDqKJks4O4OSOFDaTAN1v14gQ8EJ3J9Fhf6AkKRphbQHnMbf9fpSrckP49kW4FKAedGsmqCZ4QAO8r7AxsKD4ZIzWmvVgPWV3TkV1muOx0m1k6ky9nGn68X7auX6wYeTzTZpidfFzrzq8czxGo9hazorOyCemXoIViVnSXHhyJ-Uh3azrffXxADxXP_zVLlQ3Yx5zlil5jNSvbUcFMIDbKAfE6IweFGGM8EY0O7CGaZvJJyMl8vfAlGtyg2Zdn8XPjtDI8KYFY4KukSOKyWUmkKi2p3EOkGdKkItsRrU01cxCk8CFRe3lCzup_KTUUAIEzFVr5m00</w:t>
+      </w:r>
+    </w:p>
+    <w:p/>
+    <w:p>
+      <w:pPr>
+        <w:rPr>
+          <w:b/>
+          <w:bCs/>
+        </w:rPr>
+      </w:pPr>
+      <w:r>
+        <w:rPr>
+          <w:b/>
+          <w:bCs/>
+        </w:rPr>
+        <w:t>Image:</w:t>
+      </w:r>
+    </w:p>
+    <w:p>
+      <w:r>
+        <w:fldChar w:fldCharType="begin"/>
+      </w:r>
+      <w:r>
+        <w:instrText xml:space="preserve"> INCLUDEPICTURE "https://img.plantuml.biz/plantuml/png/fLNRZjem47ttL_WHfEuF855jH2iQYOKLc-sxcqo3LSTExScY_drdSWEJx8ggF23YEJDpvinnU0oeF3QL4QZHW4mp-Hh0IsKBkN5LrLYTAzJEogIkJVzR29MZymHchAYfWivrhIpAxMiQFUzSgUrt3UVeDCqspg9tvbbPC9FmncYmk0SyE_yhYho0VmC_5pd2xmO2VYFYveOJaqmQF55D7i35qHSwK2KyAKlV_fOyiI_dGXt5ePjOh-LL1vPhlHQYqqS-V6PPLhAL-ah6nLBGEOT7bLQoqA4swW_5hjAluWeHgXhR4mADaKkNiyRyn4UBtM6RxgbGtoMIbO1WYoS8WMPR62xJIxWK4P0p8zbNqhi6eK_DNAPy2HYL-4J5EIFziXHHBXUBDqKJks4O4OSOFDaTAN1v14gQ8EJ3J9Fhf6AkKRphbQHnMbf9fpSrckP49kW4FKAedGsmqCZ4QAO8r7AxsKD4ZIzWmvVgPWV3TkV1muOx0m1k6ky9nGn68X7auX6wYeTzTZpidfFzrzq8czxGo9hazorOyCemXoIViVnSXHhyJ-Uh3azrffXxADxXP_zVLlQ3Yx5zlil5jNSvbUcFMIDbKAfE6IweFGGM8EY0O7CGaZvJJyMl8vfAlGtyg2Zdn8XPjtDI8KYFY4KukSOKyWUmkKi2p3EOkGdKkItsRrU01cxCk8CFRe3lCzup_KTUUAIEzFVr5m00" \* MERGEFORMATINET </w:instrText>
+      </w:r>
+      <w:r>
+        <w:fldChar w:fldCharType="separate"/>
+      </w:r>
       <w:r>
         <w:rPr>
           <w:noProof/>
         </w:rPr>
-        <w:lastRenderedPageBreak/>
         <w:drawing>
-          <wp:inline distT="0" distB="0" distL="0" distR="0" wp14:anchorId="4C428705" wp14:editId="2F42B657">
-            <wp:extent cx="3914775" cy="5486400"/>
+          <wp:inline distT="0" distB="0" distL="0" distR="0" wp14:anchorId="2CF4E832" wp14:editId="7196C48D">
+            <wp:extent cx="5486400" cy="3710305"/>
             <wp:effectExtent l="0" t="0" r="0" b="0"/>
-            <wp:docPr id="1577990753" name="drawing"/>
+            <wp:docPr id="1874015452" name="Picture 3" descr="A screenshot of a computer&#10;&#10;AI-generated content may be incorrect."/>
             <wp:cNvGraphicFramePr>
-              <a:graphicFrameLocks xmlns:a="http://schemas.openxmlformats.org/drawingml/2006/main" noChangeAspect="1"/>
+              <a:graphicFrameLocks xmlns:a="http://schemas.openxmlformats.org/drawingml/2006/main"/>
             </wp:cNvGraphicFramePr>
             <a:graphic xmlns:a="http://schemas.openxmlformats.org/drawingml/2006/main">
               <a:graphicData uri="http://schemas.openxmlformats.org/drawingml/2006/picture">
                 <pic:pic xmlns:pic="http://schemas.openxmlformats.org/drawingml/2006/picture">
                   <pic:nvPicPr>
-                    <pic:cNvPr id="1577990753" name="Picture 1577990753"/>
-                    <pic:cNvPicPr/>
+                    <pic:cNvPr id="1874015452" name="Picture 3" descr="A screenshot of a computer&#10;&#10;AI-generated content may be incorrect."/>
+                    <pic:cNvPicPr>
+                      <a:picLocks/>
+                    </pic:cNvPicPr>
                   </pic:nvPicPr>
                   <pic:blipFill>
-                    <a:blip r:embed="rId24">
+                    <a:blip r:embed="rId24" cstate="print">
                       <a:extLst>
                         <a:ext uri="{28A0092B-C50C-407E-A947-70E740481C1C}">
-                          <a14:useLocalDpi xmlns:a14="http://schemas.microsoft.com/office/drawing/2010/main"/>
+                          <a14:useLocalDpi xmlns:a14="http://schemas.microsoft.com/office/drawing/2010/main" val="0"/>
                         </a:ext>
                       </a:extLst>
                     </a:blip>
+                    <a:srcRect/>
                     <a:stretch>
                       <a:fillRect/>
                     </a:stretch>
                   </pic:blipFill>
-                  <pic:spPr>
+                  <pic:spPr bwMode="auto">
                     <a:xfrm>
                       <a:off x="0" y="0"/>
-                      <a:ext cx="3914775" cy="5486400"/>
+                      <a:ext cx="5486400" cy="3710305"/>
                     </a:xfrm>
                     <a:prstGeom prst="rect">
                       <a:avLst/>
                     </a:prstGeom>
+                    <a:noFill/>
+                    <a:ln>
+                      <a:noFill/>
+                    </a:ln>
                   </pic:spPr>
                 </pic:pic>
               </a:graphicData>
@@ -10966,7 +12401,797 @@
           </wp:inline>
         </w:drawing>
       </w:r>
-    </w:p>
+      <w:r>
+        <w:fldChar w:fldCharType="end"/>
+      </w:r>
+    </w:p>
+    <w:p/>
+    <w:p/>
+    <w:p/>
+    <w:p>
+      <w:pPr>
+        <w:rPr>
+          <w:b/>
+          <w:bCs/>
+        </w:rPr>
+      </w:pPr>
+      <w:r>
+        <w:rPr>
+          <w:b/>
+          <w:bCs/>
+        </w:rPr>
+        <w:t>Code:</w:t>
+      </w:r>
+    </w:p>
+    <w:p>
+      <w:r>
+        <w:t>@startuml</w:t>
+      </w:r>
+    </w:p>
+    <w:p>
+      <w:r>
+        <w:t>title IT User and Communication Application</w:t>
+      </w:r>
+    </w:p>
+    <w:p/>
+    <w:p>
+      <w:r>
+        <w:t xml:space="preserve">actor </w:t>
+      </w:r>
+      <w:proofErr w:type="spellStart"/>
+      <w:r>
+        <w:t>ITUser</w:t>
+      </w:r>
+      <w:proofErr w:type="spellEnd"/>
+    </w:p>
+    <w:p>
+      <w:r>
+        <w:t>participant GUI</w:t>
+      </w:r>
+    </w:p>
+    <w:p>
+      <w:r>
+        <w:t xml:space="preserve">participant </w:t>
+      </w:r>
+      <w:proofErr w:type="spellStart"/>
+      <w:r>
+        <w:t>LoginView</w:t>
+      </w:r>
+      <w:proofErr w:type="spellEnd"/>
+    </w:p>
+    <w:p>
+      <w:r>
+        <w:t xml:space="preserve">participant </w:t>
+      </w:r>
+      <w:proofErr w:type="spellStart"/>
+      <w:r>
+        <w:t>ITControlPanelView</w:t>
+      </w:r>
+      <w:proofErr w:type="spellEnd"/>
+    </w:p>
+    <w:p>
+      <w:r>
+        <w:t xml:space="preserve">participant </w:t>
+      </w:r>
+      <w:proofErr w:type="spellStart"/>
+      <w:r>
+        <w:t>ClientNetwork</w:t>
+      </w:r>
+      <w:proofErr w:type="spellEnd"/>
+    </w:p>
+    <w:p>
+      <w:r>
+        <w:t xml:space="preserve">participant </w:t>
+      </w:r>
+      <w:proofErr w:type="spellStart"/>
+      <w:r>
+        <w:t>ServerNetwork</w:t>
+      </w:r>
+      <w:proofErr w:type="spellEnd"/>
+    </w:p>
+    <w:p>
+      <w:r>
+        <w:t xml:space="preserve">participant </w:t>
+      </w:r>
+      <w:proofErr w:type="spellStart"/>
+      <w:r>
+        <w:t>RequestHandler</w:t>
+      </w:r>
+      <w:proofErr w:type="spellEnd"/>
+    </w:p>
+    <w:p>
+      <w:r>
+        <w:t xml:space="preserve">participant </w:t>
+      </w:r>
+      <w:proofErr w:type="spellStart"/>
+      <w:r>
+        <w:t>UserAuthenticator</w:t>
+      </w:r>
+      <w:proofErr w:type="spellEnd"/>
+    </w:p>
+    <w:p>
+      <w:r>
+        <w:t xml:space="preserve">participant </w:t>
+      </w:r>
+      <w:proofErr w:type="spellStart"/>
+      <w:r>
+        <w:t>StorageManager</w:t>
+      </w:r>
+      <w:proofErr w:type="spellEnd"/>
+    </w:p>
+    <w:p>
+      <w:r>
+        <w:t xml:space="preserve">participant </w:t>
+      </w:r>
+      <w:proofErr w:type="spellStart"/>
+      <w:r>
+        <w:t>LoggingManager</w:t>
+      </w:r>
+      <w:proofErr w:type="spellEnd"/>
+    </w:p>
+    <w:p>
+      <w:r>
+        <w:t xml:space="preserve">participant </w:t>
+      </w:r>
+      <w:proofErr w:type="spellStart"/>
+      <w:r>
+        <w:t>ClientHandler</w:t>
+      </w:r>
+      <w:proofErr w:type="spellEnd"/>
+    </w:p>
+    <w:p/>
+    <w:p>
+      <w:r>
+        <w:t>== Authentication ==</w:t>
+      </w:r>
+    </w:p>
+    <w:p/>
+    <w:p>
+      <w:proofErr w:type="spellStart"/>
+      <w:r>
+        <w:t>ITUser</w:t>
+      </w:r>
+      <w:proofErr w:type="spellEnd"/>
+      <w:r>
+        <w:t xml:space="preserve"> -&gt; GUI: </w:t>
+      </w:r>
+      <w:proofErr w:type="spellStart"/>
+      <w:r>
+        <w:t>startApplication</w:t>
+      </w:r>
+      <w:proofErr w:type="spellEnd"/>
+      <w:r>
+        <w:t>()</w:t>
+      </w:r>
+    </w:p>
+    <w:p>
+      <w:r>
+        <w:t xml:space="preserve">GUI -&gt; </w:t>
+      </w:r>
+      <w:proofErr w:type="spellStart"/>
+      <w:r>
+        <w:t>LoginView</w:t>
+      </w:r>
+      <w:proofErr w:type="spellEnd"/>
+      <w:r>
+        <w:t>: display()</w:t>
+      </w:r>
+    </w:p>
+    <w:p/>
+    <w:p>
+      <w:proofErr w:type="spellStart"/>
+      <w:r>
+        <w:t>ITUser</w:t>
+      </w:r>
+      <w:proofErr w:type="spellEnd"/>
+      <w:r>
+        <w:t xml:space="preserve"> -&gt; </w:t>
+      </w:r>
+      <w:proofErr w:type="spellStart"/>
+      <w:r>
+        <w:t>LoginView</w:t>
+      </w:r>
+      <w:proofErr w:type="spellEnd"/>
+      <w:r>
+        <w:t xml:space="preserve">: </w:t>
+      </w:r>
+      <w:proofErr w:type="spellStart"/>
+      <w:r>
+        <w:t>attemptLogin</w:t>
+      </w:r>
+      <w:proofErr w:type="spellEnd"/>
+      <w:r>
+        <w:t>()</w:t>
+      </w:r>
+    </w:p>
+    <w:p>
+      <w:proofErr w:type="spellStart"/>
+      <w:r>
+        <w:t>LoginView</w:t>
+      </w:r>
+      <w:proofErr w:type="spellEnd"/>
+      <w:r>
+        <w:t xml:space="preserve"> -&gt; GUI: </w:t>
+      </w:r>
+      <w:proofErr w:type="spellStart"/>
+      <w:r>
+        <w:t>switchView</w:t>
+      </w:r>
+      <w:proofErr w:type="spellEnd"/>
+      <w:r>
+        <w:t>(LOGIN)</w:t>
+      </w:r>
+    </w:p>
+    <w:p/>
+    <w:p>
+      <w:r>
+        <w:t xml:space="preserve">GUI -&gt; </w:t>
+      </w:r>
+      <w:proofErr w:type="spellStart"/>
+      <w:r>
+        <w:t>ClientNetwork</w:t>
+      </w:r>
+      <w:proofErr w:type="spellEnd"/>
+      <w:r>
+        <w:t xml:space="preserve">: </w:t>
+      </w:r>
+      <w:proofErr w:type="spellStart"/>
+      <w:r>
+        <w:t>sendMessage</w:t>
+      </w:r>
+      <w:proofErr w:type="spellEnd"/>
+      <w:r>
+        <w:t>(</w:t>
+      </w:r>
+      <w:proofErr w:type="spellStart"/>
+      <w:r>
+        <w:t>loginRequest</w:t>
+      </w:r>
+      <w:proofErr w:type="spellEnd"/>
+      <w:r>
+        <w:t>)</w:t>
+      </w:r>
+    </w:p>
+    <w:p>
+      <w:proofErr w:type="spellStart"/>
+      <w:r>
+        <w:t>ClientNetwork</w:t>
+      </w:r>
+      <w:proofErr w:type="spellEnd"/>
+      <w:r>
+        <w:t xml:space="preserve"> -&gt; </w:t>
+      </w:r>
+      <w:proofErr w:type="spellStart"/>
+      <w:r>
+        <w:t>ServerNetwork</w:t>
+      </w:r>
+      <w:proofErr w:type="spellEnd"/>
+      <w:r>
+        <w:t xml:space="preserve">: </w:t>
+      </w:r>
+      <w:proofErr w:type="spellStart"/>
+      <w:r>
+        <w:t>routeMessageToTarget</w:t>
+      </w:r>
+      <w:proofErr w:type="spellEnd"/>
+      <w:r>
+        <w:t>(</w:t>
+      </w:r>
+      <w:proofErr w:type="spellStart"/>
+      <w:r>
+        <w:t>loginRequest</w:t>
+      </w:r>
+      <w:proofErr w:type="spellEnd"/>
+      <w:r>
+        <w:t xml:space="preserve">, </w:t>
+      </w:r>
+      <w:proofErr w:type="spellStart"/>
+      <w:r>
+        <w:t>serverID</w:t>
+      </w:r>
+      <w:proofErr w:type="spellEnd"/>
+      <w:r>
+        <w:t>)</w:t>
+      </w:r>
+    </w:p>
+    <w:p>
+      <w:proofErr w:type="spellStart"/>
+      <w:r>
+        <w:t>ServerNetwork</w:t>
+      </w:r>
+      <w:proofErr w:type="spellEnd"/>
+      <w:r>
+        <w:t xml:space="preserve"> -&gt; </w:t>
+      </w:r>
+      <w:proofErr w:type="spellStart"/>
+      <w:r>
+        <w:t>RequestHandler</w:t>
+      </w:r>
+      <w:proofErr w:type="spellEnd"/>
+      <w:r>
+        <w:t xml:space="preserve">: </w:t>
+      </w:r>
+      <w:proofErr w:type="spellStart"/>
+      <w:r>
+        <w:t>doLogin</w:t>
+      </w:r>
+      <w:proofErr w:type="spellEnd"/>
+      <w:r>
+        <w:t>()</w:t>
+      </w:r>
+    </w:p>
+    <w:p/>
+    <w:p>
+      <w:proofErr w:type="spellStart"/>
+      <w:r>
+        <w:t>RequestHandler</w:t>
+      </w:r>
+      <w:proofErr w:type="spellEnd"/>
+      <w:r>
+        <w:t xml:space="preserve"> -&gt; </w:t>
+      </w:r>
+      <w:proofErr w:type="spellStart"/>
+      <w:r>
+        <w:t>UserAuthenticator</w:t>
+      </w:r>
+      <w:proofErr w:type="spellEnd"/>
+      <w:r>
+        <w:t>: authenticate()</w:t>
+      </w:r>
+    </w:p>
+    <w:p>
+      <w:proofErr w:type="spellStart"/>
+      <w:r>
+        <w:t>UserAuthenticator</w:t>
+      </w:r>
+      <w:proofErr w:type="spellEnd"/>
+      <w:r>
+        <w:t xml:space="preserve"> --&gt; </w:t>
+      </w:r>
+      <w:proofErr w:type="spellStart"/>
+      <w:r>
+        <w:t>RequestHandler</w:t>
+      </w:r>
+      <w:proofErr w:type="spellEnd"/>
+      <w:r>
+        <w:t>: authenticated</w:t>
+      </w:r>
+    </w:p>
+    <w:p/>
+    <w:p>
+      <w:proofErr w:type="spellStart"/>
+      <w:r>
+        <w:t>RequestHandler</w:t>
+      </w:r>
+      <w:proofErr w:type="spellEnd"/>
+      <w:r>
+        <w:t xml:space="preserve"> -&gt; </w:t>
+      </w:r>
+      <w:proofErr w:type="spellStart"/>
+      <w:r>
+        <w:t>LoggingManager</w:t>
+      </w:r>
+      <w:proofErr w:type="spellEnd"/>
+      <w:r>
+        <w:t xml:space="preserve">: </w:t>
+      </w:r>
+      <w:proofErr w:type="spellStart"/>
+      <w:r>
+        <w:t>logLoginAttempt</w:t>
+      </w:r>
+      <w:proofErr w:type="spellEnd"/>
+      <w:r>
+        <w:t>()</w:t>
+      </w:r>
+    </w:p>
+    <w:p>
+      <w:proofErr w:type="spellStart"/>
+      <w:r>
+        <w:t>RequestHandler</w:t>
+      </w:r>
+      <w:proofErr w:type="spellEnd"/>
+      <w:r>
+        <w:t xml:space="preserve"> -&gt; </w:t>
+      </w:r>
+      <w:proofErr w:type="spellStart"/>
+      <w:r>
+        <w:t>ClientHandler</w:t>
+      </w:r>
+      <w:proofErr w:type="spellEnd"/>
+      <w:r>
+        <w:t xml:space="preserve">: </w:t>
+      </w:r>
+      <w:proofErr w:type="spellStart"/>
+      <w:r>
+        <w:t>sendResponse</w:t>
+      </w:r>
+      <w:proofErr w:type="spellEnd"/>
+      <w:r>
+        <w:t>(</w:t>
+      </w:r>
+      <w:proofErr w:type="spellStart"/>
+      <w:r>
+        <w:t>itUser</w:t>
+      </w:r>
+      <w:proofErr w:type="spellEnd"/>
+      <w:r>
+        <w:t>)</w:t>
+      </w:r>
+    </w:p>
+    <w:p/>
+    <w:p>
+      <w:proofErr w:type="spellStart"/>
+      <w:r>
+        <w:t>ClientHandler</w:t>
+      </w:r>
+      <w:proofErr w:type="spellEnd"/>
+      <w:r>
+        <w:t xml:space="preserve"> --&gt; </w:t>
+      </w:r>
+      <w:proofErr w:type="spellStart"/>
+      <w:r>
+        <w:t>ClientNetwork</w:t>
+      </w:r>
+      <w:proofErr w:type="spellEnd"/>
+      <w:r>
+        <w:t>: authenticated IT user</w:t>
+      </w:r>
+    </w:p>
+    <w:p>
+      <w:proofErr w:type="spellStart"/>
+      <w:r>
+        <w:t>ClientNetwork</w:t>
+      </w:r>
+      <w:proofErr w:type="spellEnd"/>
+      <w:r>
+        <w:t xml:space="preserve"> --&gt; GUI: authenticated IT user</w:t>
+      </w:r>
+    </w:p>
+    <w:p/>
+    <w:p>
+      <w:r>
+        <w:t xml:space="preserve">GUI -&gt; GUI: </w:t>
+      </w:r>
+      <w:proofErr w:type="spellStart"/>
+      <w:r>
+        <w:t>setCurrentUser</w:t>
+      </w:r>
+      <w:proofErr w:type="spellEnd"/>
+      <w:r>
+        <w:t>(</w:t>
+      </w:r>
+      <w:proofErr w:type="spellStart"/>
+      <w:r>
+        <w:t>itUser</w:t>
+      </w:r>
+      <w:proofErr w:type="spellEnd"/>
+      <w:r>
+        <w:t>)</w:t>
+      </w:r>
+    </w:p>
+    <w:p>
+      <w:r>
+        <w:t xml:space="preserve">GUI -&gt; GUI: </w:t>
+      </w:r>
+      <w:proofErr w:type="spellStart"/>
+      <w:r>
+        <w:t>switchView</w:t>
+      </w:r>
+      <w:proofErr w:type="spellEnd"/>
+      <w:r>
+        <w:t>(ITCONTROLPANEL)</w:t>
+      </w:r>
+    </w:p>
+    <w:p>
+      <w:r>
+        <w:t xml:space="preserve">GUI -&gt; </w:t>
+      </w:r>
+      <w:proofErr w:type="spellStart"/>
+      <w:r>
+        <w:t>ITControlPanelView</w:t>
+      </w:r>
+      <w:proofErr w:type="spellEnd"/>
+      <w:r>
+        <w:t>: display()</w:t>
+      </w:r>
+    </w:p>
+    <w:p/>
+    <w:p>
+      <w:r>
+        <w:t>== General IT Action ==</w:t>
+      </w:r>
+    </w:p>
+    <w:p/>
+    <w:p>
+      <w:proofErr w:type="spellStart"/>
+      <w:r>
+        <w:t>ITUser</w:t>
+      </w:r>
+      <w:proofErr w:type="spellEnd"/>
+      <w:r>
+        <w:t xml:space="preserve"> -&gt; </w:t>
+      </w:r>
+      <w:proofErr w:type="spellStart"/>
+      <w:r>
+        <w:t>ITControlPanelView</w:t>
+      </w:r>
+      <w:proofErr w:type="spellEnd"/>
+      <w:r>
+        <w:t xml:space="preserve">: </w:t>
+      </w:r>
+      <w:proofErr w:type="spellStart"/>
+      <w:r>
+        <w:t>performAction</w:t>
+      </w:r>
+      <w:proofErr w:type="spellEnd"/>
+      <w:r>
+        <w:t>()</w:t>
+      </w:r>
+    </w:p>
+    <w:p>
+      <w:proofErr w:type="spellStart"/>
+      <w:r>
+        <w:t>ITControlPanelView</w:t>
+      </w:r>
+      <w:proofErr w:type="spellEnd"/>
+      <w:r>
+        <w:t xml:space="preserve"> -&gt; GUI: </w:t>
+      </w:r>
+      <w:proofErr w:type="spellStart"/>
+      <w:r>
+        <w:t>switchView</w:t>
+      </w:r>
+      <w:proofErr w:type="spellEnd"/>
+      <w:r>
+        <w:t>(ITCONTROLPANEL)</w:t>
+      </w:r>
+    </w:p>
+    <w:p/>
+    <w:p>
+      <w:r>
+        <w:t xml:space="preserve">GUI -&gt; </w:t>
+      </w:r>
+      <w:proofErr w:type="spellStart"/>
+      <w:r>
+        <w:t>ClientNetwork</w:t>
+      </w:r>
+      <w:proofErr w:type="spellEnd"/>
+      <w:r>
+        <w:t xml:space="preserve">: </w:t>
+      </w:r>
+      <w:proofErr w:type="spellStart"/>
+      <w:r>
+        <w:t>sendMessage</w:t>
+      </w:r>
+      <w:proofErr w:type="spellEnd"/>
+      <w:r>
+        <w:t>(request)</w:t>
+      </w:r>
+    </w:p>
+    <w:p>
+      <w:proofErr w:type="spellStart"/>
+      <w:r>
+        <w:t>ClientNetwork</w:t>
+      </w:r>
+      <w:proofErr w:type="spellEnd"/>
+      <w:r>
+        <w:t xml:space="preserve"> -&gt; </w:t>
+      </w:r>
+      <w:proofErr w:type="spellStart"/>
+      <w:r>
+        <w:t>ServerNetwork</w:t>
+      </w:r>
+      <w:proofErr w:type="spellEnd"/>
+      <w:r>
+        <w:t xml:space="preserve">: </w:t>
+      </w:r>
+      <w:proofErr w:type="spellStart"/>
+      <w:r>
+        <w:t>routeMessageToTarget</w:t>
+      </w:r>
+      <w:proofErr w:type="spellEnd"/>
+      <w:r>
+        <w:t xml:space="preserve">(request, </w:t>
+      </w:r>
+      <w:proofErr w:type="spellStart"/>
+      <w:r>
+        <w:t>targetID</w:t>
+      </w:r>
+      <w:proofErr w:type="spellEnd"/>
+      <w:r>
+        <w:t>)</w:t>
+      </w:r>
+    </w:p>
+    <w:p>
+      <w:proofErr w:type="spellStart"/>
+      <w:r>
+        <w:t>ServerNetwork</w:t>
+      </w:r>
+      <w:proofErr w:type="spellEnd"/>
+      <w:r>
+        <w:t xml:space="preserve"> -&gt; </w:t>
+      </w:r>
+      <w:proofErr w:type="spellStart"/>
+      <w:r>
+        <w:t>RequestHandler</w:t>
+      </w:r>
+      <w:proofErr w:type="spellEnd"/>
+      <w:r>
+        <w:t xml:space="preserve">: </w:t>
+      </w:r>
+      <w:proofErr w:type="spellStart"/>
+      <w:r>
+        <w:t>processRequest</w:t>
+      </w:r>
+      <w:proofErr w:type="spellEnd"/>
+      <w:r>
+        <w:t>()</w:t>
+      </w:r>
+    </w:p>
+    <w:p/>
+    <w:p>
+      <w:r>
+        <w:t>alt action requires persistence</w:t>
+      </w:r>
+    </w:p>
+    <w:p>
+      <w:r>
+        <w:t xml:space="preserve">    </w:t>
+      </w:r>
+      <w:proofErr w:type="spellStart"/>
+      <w:r>
+        <w:t>RequestHandler</w:t>
+      </w:r>
+      <w:proofErr w:type="spellEnd"/>
+      <w:r>
+        <w:t xml:space="preserve"> -&gt; </w:t>
+      </w:r>
+      <w:proofErr w:type="spellStart"/>
+      <w:r>
+        <w:t>StorageManager</w:t>
+      </w:r>
+      <w:proofErr w:type="spellEnd"/>
+      <w:r>
+        <w:t xml:space="preserve">: </w:t>
+      </w:r>
+      <w:proofErr w:type="spellStart"/>
+      <w:r>
+        <w:t>saveMessage</w:t>
+      </w:r>
+      <w:proofErr w:type="spellEnd"/>
+      <w:r>
+        <w:t>()</w:t>
+      </w:r>
+    </w:p>
+    <w:p>
+      <w:r>
+        <w:t xml:space="preserve">    </w:t>
+      </w:r>
+      <w:proofErr w:type="spellStart"/>
+      <w:r>
+        <w:t>StorageManager</w:t>
+      </w:r>
+      <w:proofErr w:type="spellEnd"/>
+      <w:r>
+        <w:t xml:space="preserve"> --&gt; </w:t>
+      </w:r>
+      <w:proofErr w:type="spellStart"/>
+      <w:r>
+        <w:t>RequestHandler</w:t>
+      </w:r>
+      <w:proofErr w:type="spellEnd"/>
+      <w:r>
+        <w:t>: saved</w:t>
+      </w:r>
+    </w:p>
+    <w:p>
+      <w:r>
+        <w:lastRenderedPageBreak/>
+        <w:t>end</w:t>
+      </w:r>
+    </w:p>
+    <w:p/>
+    <w:p>
+      <w:r>
+        <w:t>alt action should be logged</w:t>
+      </w:r>
+    </w:p>
+    <w:p>
+      <w:r>
+        <w:t xml:space="preserve">    </w:t>
+      </w:r>
+      <w:proofErr w:type="spellStart"/>
+      <w:r>
+        <w:t>RequestHandler</w:t>
+      </w:r>
+      <w:proofErr w:type="spellEnd"/>
+      <w:r>
+        <w:t xml:space="preserve"> -&gt; </w:t>
+      </w:r>
+      <w:proofErr w:type="spellStart"/>
+      <w:r>
+        <w:t>LoggingManager</w:t>
+      </w:r>
+      <w:proofErr w:type="spellEnd"/>
+      <w:r>
+        <w:t>: log()</w:t>
+      </w:r>
+    </w:p>
+    <w:p>
+      <w:r>
+        <w:t>end</w:t>
+      </w:r>
+    </w:p>
+    <w:p/>
+    <w:p>
+      <w:proofErr w:type="spellStart"/>
+      <w:r>
+        <w:t>RequestHandler</w:t>
+      </w:r>
+      <w:proofErr w:type="spellEnd"/>
+      <w:r>
+        <w:t xml:space="preserve"> -&gt; </w:t>
+      </w:r>
+      <w:proofErr w:type="spellStart"/>
+      <w:r>
+        <w:t>ClientHandler</w:t>
+      </w:r>
+      <w:proofErr w:type="spellEnd"/>
+      <w:r>
+        <w:t xml:space="preserve">: </w:t>
+      </w:r>
+      <w:proofErr w:type="spellStart"/>
+      <w:r>
+        <w:t>sendResponse</w:t>
+      </w:r>
+      <w:proofErr w:type="spellEnd"/>
+      <w:r>
+        <w:t>(result)</w:t>
+      </w:r>
+    </w:p>
+    <w:p>
+      <w:proofErr w:type="spellStart"/>
+      <w:r>
+        <w:t>ClientHandler</w:t>
+      </w:r>
+      <w:proofErr w:type="spellEnd"/>
+      <w:r>
+        <w:t xml:space="preserve"> --&gt; </w:t>
+      </w:r>
+      <w:proofErr w:type="spellStart"/>
+      <w:r>
+        <w:t>ClientNetwork</w:t>
+      </w:r>
+      <w:proofErr w:type="spellEnd"/>
+      <w:r>
+        <w:t>: response</w:t>
+      </w:r>
+    </w:p>
+    <w:p>
+      <w:proofErr w:type="spellStart"/>
+      <w:r>
+        <w:t>ClientNetwork</w:t>
+      </w:r>
+      <w:proofErr w:type="spellEnd"/>
+      <w:r>
+        <w:t xml:space="preserve"> --&gt; GUI: </w:t>
+      </w:r>
+      <w:proofErr w:type="spellStart"/>
+      <w:r>
+        <w:t>switchView</w:t>
+      </w:r>
+      <w:proofErr w:type="spellEnd"/>
+      <w:r>
+        <w:t>(ITCONTROLPANEL)</w:t>
+      </w:r>
+    </w:p>
+    <w:p/>
+    <w:p>
+      <w:r>
+        <w:t>@enduml</w:t>
+      </w:r>
+    </w:p>
+    <w:p/>
     <w:p>
       <w:pPr>
         <w:pStyle w:val="Heading2"/>
@@ -10978,58 +13203,495 @@
       <w:bookmarkStart w:id="50" w:name="_Toc223255459"/>
       <w:bookmarkStart w:id="51" w:name="_Toc224291136"/>
       <w:r>
-        <w:lastRenderedPageBreak/>
         <w:t>Application</w:t>
       </w:r>
       <w:bookmarkEnd w:id="50"/>
       <w:bookmarkEnd w:id="51"/>
     </w:p>
     <w:p>
+      <w:pPr>
+        <w:rPr>
+          <w:b/>
+          <w:bCs/>
+        </w:rPr>
+      </w:pPr>
+      <w:r>
+        <w:rPr>
+          <w:b/>
+          <w:bCs/>
+        </w:rPr>
+        <w:t>Encoding:</w:t>
+      </w:r>
+    </w:p>
+    <w:p>
+      <w:r>
+        <w:t>RLF1JiCm3BtxAonEcyGEwx5IqT2GO1BZCBOFY5fJ8hga9Eac_XwdQJSyUcchF3_xlUTqvODoeJis47He21_Rjj6b2jeQ05K6w_3kuCdXyWwLn_YvX9OfkjIjCW6V3vi8y4kUhnjD9hnHE5lt9P1tSYToKyYElZlouKMPgY4dIQn4rRHLXfyIUhLrhKqz1IKHK_skiZDXCxlOp02A0hVaFRTbqKmg2e0-0Lmyz8vpz6IgeMOsXtWMCM5U5hdaSGwY9f94BZawsmKQM7kxLwwcCBBliOiADqzp4ApOHeQOO-jioLs6OnO9ig8VBT9bmUf4LrSInSN4a4YefZhBvUJOs7fQWbXLYcn7lhN6q-oOf8oPNLXf2nbdHINflvBZSO_tcypnfEcy_bIz_VzDRjPLKSFDt0-MrdneTqn_mys-BZTW43UoE8Pq2uRXopGy6WfZBS2AxV5Fzmi0</w:t>
+      </w:r>
+    </w:p>
+    <w:p>
+      <w:pPr>
+        <w:rPr>
+          <w:b/>
+          <w:bCs/>
+        </w:rPr>
+      </w:pPr>
+    </w:p>
+    <w:p>
+      <w:pPr>
+        <w:rPr>
+          <w:b/>
+          <w:bCs/>
+        </w:rPr>
+      </w:pPr>
+      <w:r>
+        <w:rPr>
+          <w:b/>
+          <w:bCs/>
+        </w:rPr>
+        <w:t>Image:</w:t>
+      </w:r>
+    </w:p>
+    <w:p>
+      <w:pPr>
+        <w:rPr>
+          <w:b/>
+          <w:bCs/>
+        </w:rPr>
+      </w:pPr>
+      <w:r>
+        <w:fldChar w:fldCharType="begin"/>
+      </w:r>
+      <w:r>
+        <w:instrText xml:space="preserve"> INCLUDEPICTURE "https://img.plantuml.biz/plantuml/png/RLF1JiCm3BtxAonEcyGEwx5IqT2GO1BZCBOFY5fJ8hga9Eac_XwdQJSyUcchF3_xlUTqvODoeJis47He21_Rjj6b2jeQ05K6w_3kuCdXyWwLn_YvX9OfkjIjCW6V3vi8y4kUhnjD9hnHE5lt9P1tSYToKyYElZlouKMPgY4dIQn4rRHLXfyIUhLrhKqz1IKHK_skiZDXCxlOp02A0hVaFRTbqKmg2e0-0Lmyz8vpz6IgeMOsXtWMCM5U5hdaSGwY9f94BZawsmKQM7kxLwwcCBBliOiADqzp4ApOHeQOO-jioLs6OnO9ig8VBT9bmUf4LrSInSN4a4YefZhBvUJOs7fQWbXLYcn7lhN6q-oOf8oPNLXf2nbdHINflvBZSO_tcypnfEcy_bIz_VzDRjPLKSFDt0-MrdneTqn_mys-BZTW43UoE8Pq2uRXopGy6WfZBS2AxV5Fzmi0" \* MERGEFORMATINET </w:instrText>
+      </w:r>
+      <w:r>
+        <w:fldChar w:fldCharType="separate"/>
+      </w:r>
       <w:r>
         <w:rPr>
           <w:noProof/>
         </w:rPr>
         <w:drawing>
-          <wp:inline distT="0" distB="0" distL="0" distR="0" wp14:anchorId="2D59F42F" wp14:editId="6EF97AF9">
-            <wp:extent cx="3914775" cy="5486400"/>
+          <wp:inline distT="0" distB="0" distL="0" distR="0" wp14:anchorId="22855BEF" wp14:editId="6B212509">
+            <wp:extent cx="5486400" cy="2409190"/>
             <wp:effectExtent l="0" t="0" r="0" b="0"/>
-            <wp:docPr id="131603598" name="drawing"/>
+            <wp:docPr id="1348700448" name="Picture 5" descr="A screenshot of a computer program&#10;&#10;AI-generated content may be incorrect."/>
             <wp:cNvGraphicFramePr>
-              <a:graphicFrameLocks xmlns:a="http://schemas.openxmlformats.org/drawingml/2006/main" noChangeAspect="1"/>
+              <a:graphicFrameLocks xmlns:a="http://schemas.openxmlformats.org/drawingml/2006/main"/>
             </wp:cNvGraphicFramePr>
             <a:graphic xmlns:a="http://schemas.openxmlformats.org/drawingml/2006/main">
               <a:graphicData uri="http://schemas.openxmlformats.org/drawingml/2006/picture">
                 <pic:pic xmlns:pic="http://schemas.openxmlformats.org/drawingml/2006/picture">
                   <pic:nvPicPr>
-                    <pic:cNvPr id="131603598" name="Picture 131603598"/>
-                    <pic:cNvPicPr/>
+                    <pic:cNvPr id="1348700448" name="Picture 5" descr="A screenshot of a computer program&#10;&#10;AI-generated content may be incorrect."/>
+                    <pic:cNvPicPr>
+                      <a:picLocks/>
+                    </pic:cNvPicPr>
                   </pic:nvPicPr>
                   <pic:blipFill>
-                    <a:blip r:embed="rId25">
+                    <a:blip r:embed="rId25" cstate="print">
                       <a:extLst>
                         <a:ext uri="{28A0092B-C50C-407E-A947-70E740481C1C}">
-                          <a14:useLocalDpi xmlns:a14="http://schemas.microsoft.com/office/drawing/2010/main"/>
+                          <a14:useLocalDpi xmlns:a14="http://schemas.microsoft.com/office/drawing/2010/main" val="0"/>
                         </a:ext>
                       </a:extLst>
                     </a:blip>
+                    <a:srcRect/>
                     <a:stretch>
                       <a:fillRect/>
                     </a:stretch>
                   </pic:blipFill>
-                  <pic:spPr>
+                  <pic:spPr bwMode="auto">
                     <a:xfrm>
                       <a:off x="0" y="0"/>
-                      <a:ext cx="3914775" cy="5486400"/>
+                      <a:ext cx="5486400" cy="2409190"/>
                     </a:xfrm>
                     <a:prstGeom prst="rect">
                       <a:avLst/>
                     </a:prstGeom>
+                    <a:noFill/>
+                    <a:ln>
+                      <a:noFill/>
+                    </a:ln>
                   </pic:spPr>
                 </pic:pic>
               </a:graphicData>
             </a:graphic>
           </wp:inline>
         </w:drawing>
+      </w:r>
+      <w:r>
+        <w:fldChar w:fldCharType="end"/>
+      </w:r>
+    </w:p>
+    <w:p>
+      <w:pPr>
+        <w:rPr>
+          <w:b/>
+          <w:bCs/>
+        </w:rPr>
+      </w:pPr>
+    </w:p>
+    <w:p>
+      <w:pPr>
+        <w:rPr>
+          <w:b/>
+          <w:bCs/>
+        </w:rPr>
+      </w:pPr>
+      <w:r>
+        <w:rPr>
+          <w:b/>
+          <w:bCs/>
+        </w:rPr>
+        <w:t>Code:</w:t>
+      </w:r>
+    </w:p>
+    <w:p>
+      <w:r>
+        <w:t>@startuml</w:t>
+      </w:r>
+    </w:p>
+    <w:p>
+      <w:r>
+        <w:t>title Application</w:t>
+      </w:r>
+    </w:p>
+    <w:p/>
+    <w:p>
+      <w:r>
+        <w:t>actor "User 1" as User1</w:t>
+      </w:r>
+    </w:p>
+    <w:p>
+      <w:r>
+        <w:t>participant GUI as GUI1</w:t>
+      </w:r>
+    </w:p>
+    <w:p>
+      <w:r>
+        <w:t xml:space="preserve">participant </w:t>
+      </w:r>
+      <w:proofErr w:type="spellStart"/>
+      <w:r>
+        <w:t>ClientNetwork</w:t>
+      </w:r>
+      <w:proofErr w:type="spellEnd"/>
+    </w:p>
+    <w:p>
+      <w:r>
+        <w:t xml:space="preserve">participant </w:t>
+      </w:r>
+      <w:proofErr w:type="spellStart"/>
+      <w:r>
+        <w:t>ServerNetwork</w:t>
+      </w:r>
+      <w:proofErr w:type="spellEnd"/>
+    </w:p>
+    <w:p>
+      <w:r>
+        <w:t xml:space="preserve">participant </w:t>
+      </w:r>
+      <w:proofErr w:type="spellStart"/>
+      <w:r>
+        <w:t>RequestHandler</w:t>
+      </w:r>
+      <w:proofErr w:type="spellEnd"/>
+    </w:p>
+    <w:p>
+      <w:r>
+        <w:t xml:space="preserve">participant </w:t>
+      </w:r>
+      <w:proofErr w:type="spellStart"/>
+      <w:r>
+        <w:t>StorageManager</w:t>
+      </w:r>
+      <w:proofErr w:type="spellEnd"/>
+    </w:p>
+    <w:p>
+      <w:r>
+        <w:t xml:space="preserve">participant </w:t>
+      </w:r>
+      <w:proofErr w:type="spellStart"/>
+      <w:r>
+        <w:t>LoggingManager</w:t>
+      </w:r>
+      <w:proofErr w:type="spellEnd"/>
+    </w:p>
+    <w:p>
+      <w:r>
+        <w:t xml:space="preserve">participant </w:t>
+      </w:r>
+      <w:proofErr w:type="spellStart"/>
+      <w:r>
+        <w:t>ClientHandler</w:t>
+      </w:r>
+      <w:proofErr w:type="spellEnd"/>
+    </w:p>
+    <w:p>
+      <w:r>
+        <w:lastRenderedPageBreak/>
+        <w:t>participant GUI as GUI2</w:t>
+      </w:r>
+    </w:p>
+    <w:p>
+      <w:r>
+        <w:t>actor "User 2" as User2</w:t>
+      </w:r>
+    </w:p>
+    <w:p/>
+    <w:p>
+      <w:r>
+        <w:t>== Message Sent ==</w:t>
+      </w:r>
+    </w:p>
+    <w:p/>
+    <w:p>
+      <w:r>
+        <w:t xml:space="preserve">User1 -&gt; GUI1: </w:t>
+      </w:r>
+      <w:proofErr w:type="spellStart"/>
+      <w:r>
+        <w:t>sendMessage</w:t>
+      </w:r>
+      <w:proofErr w:type="spellEnd"/>
+      <w:r>
+        <w:t>()</w:t>
+      </w:r>
+    </w:p>
+    <w:p>
+      <w:r>
+        <w:t xml:space="preserve">GUI1 -&gt; </w:t>
+      </w:r>
+      <w:proofErr w:type="spellStart"/>
+      <w:r>
+        <w:t>ClientNetwork</w:t>
+      </w:r>
+      <w:proofErr w:type="spellEnd"/>
+      <w:r>
+        <w:t xml:space="preserve">: </w:t>
+      </w:r>
+      <w:proofErr w:type="spellStart"/>
+      <w:r>
+        <w:t>sendMessage</w:t>
+      </w:r>
+      <w:proofErr w:type="spellEnd"/>
+      <w:r>
+        <w:t>(request)</w:t>
+      </w:r>
+    </w:p>
+    <w:p>
+      <w:proofErr w:type="spellStart"/>
+      <w:r>
+        <w:t>ClientNetwork</w:t>
+      </w:r>
+      <w:proofErr w:type="spellEnd"/>
+      <w:r>
+        <w:t xml:space="preserve"> -&gt; </w:t>
+      </w:r>
+      <w:proofErr w:type="spellStart"/>
+      <w:r>
+        <w:t>ServerNetwork</w:t>
+      </w:r>
+      <w:proofErr w:type="spellEnd"/>
+      <w:r>
+        <w:t xml:space="preserve">: </w:t>
+      </w:r>
+      <w:proofErr w:type="spellStart"/>
+      <w:r>
+        <w:t>routeMessageToTarget</w:t>
+      </w:r>
+      <w:proofErr w:type="spellEnd"/>
+      <w:r>
+        <w:t>(request, user2ID)</w:t>
+      </w:r>
+    </w:p>
+    <w:p>
+      <w:proofErr w:type="spellStart"/>
+      <w:r>
+        <w:t>ServerNetwork</w:t>
+      </w:r>
+      <w:proofErr w:type="spellEnd"/>
+      <w:r>
+        <w:t xml:space="preserve"> -&gt; </w:t>
+      </w:r>
+      <w:proofErr w:type="spellStart"/>
+      <w:r>
+        <w:t>RequestHandler</w:t>
+      </w:r>
+      <w:proofErr w:type="spellEnd"/>
+      <w:r>
+        <w:t xml:space="preserve">: </w:t>
+      </w:r>
+      <w:proofErr w:type="spellStart"/>
+      <w:r>
+        <w:t>processRequest</w:t>
+      </w:r>
+      <w:proofErr w:type="spellEnd"/>
+      <w:r>
+        <w:t>()</w:t>
+      </w:r>
+    </w:p>
+    <w:p/>
+    <w:p>
+      <w:proofErr w:type="spellStart"/>
+      <w:r>
+        <w:t>RequestHandler</w:t>
+      </w:r>
+      <w:proofErr w:type="spellEnd"/>
+      <w:r>
+        <w:t xml:space="preserve"> -&gt; </w:t>
+      </w:r>
+      <w:proofErr w:type="spellStart"/>
+      <w:r>
+        <w:t>StorageManager</w:t>
+      </w:r>
+      <w:proofErr w:type="spellEnd"/>
+      <w:r>
+        <w:t xml:space="preserve">: </w:t>
+      </w:r>
+      <w:proofErr w:type="spellStart"/>
+      <w:r>
+        <w:t>saveMessage</w:t>
+      </w:r>
+      <w:proofErr w:type="spellEnd"/>
+      <w:r>
+        <w:t>()</w:t>
+      </w:r>
+    </w:p>
+    <w:p>
+      <w:proofErr w:type="spellStart"/>
+      <w:r>
+        <w:t>StorageManager</w:t>
+      </w:r>
+      <w:proofErr w:type="spellEnd"/>
+      <w:r>
+        <w:t xml:space="preserve"> --&gt; </w:t>
+      </w:r>
+      <w:proofErr w:type="spellStart"/>
+      <w:r>
+        <w:t>RequestHandler</w:t>
+      </w:r>
+      <w:proofErr w:type="spellEnd"/>
+      <w:r>
+        <w:t>: saved</w:t>
+      </w:r>
+    </w:p>
+    <w:p/>
+    <w:p>
+      <w:proofErr w:type="spellStart"/>
+      <w:r>
+        <w:t>RequestHandler</w:t>
+      </w:r>
+      <w:proofErr w:type="spellEnd"/>
+      <w:r>
+        <w:t xml:space="preserve"> -&gt; </w:t>
+      </w:r>
+      <w:proofErr w:type="spellStart"/>
+      <w:r>
+        <w:t>LoggingManager</w:t>
+      </w:r>
+      <w:proofErr w:type="spellEnd"/>
+      <w:r>
+        <w:t>: log()</w:t>
+      </w:r>
+    </w:p>
+    <w:p/>
+    <w:p>
+      <w:proofErr w:type="spellStart"/>
+      <w:r>
+        <w:t>RequestHandler</w:t>
+      </w:r>
+      <w:proofErr w:type="spellEnd"/>
+      <w:r>
+        <w:t xml:space="preserve"> -&gt; </w:t>
+      </w:r>
+      <w:proofErr w:type="spellStart"/>
+      <w:r>
+        <w:t>ClientHandler</w:t>
+      </w:r>
+      <w:proofErr w:type="spellEnd"/>
+      <w:r>
+        <w:t xml:space="preserve">: </w:t>
+      </w:r>
+      <w:proofErr w:type="spellStart"/>
+      <w:r>
+        <w:t>sendResponse</w:t>
+      </w:r>
+      <w:proofErr w:type="spellEnd"/>
+      <w:r>
+        <w:t>(message)</w:t>
+      </w:r>
+    </w:p>
+    <w:p>
+      <w:proofErr w:type="spellStart"/>
+      <w:r>
+        <w:t>ClientHandler</w:t>
+      </w:r>
+      <w:proofErr w:type="spellEnd"/>
+      <w:r>
+        <w:t xml:space="preserve"> --&gt; GUI2: </w:t>
+      </w:r>
+      <w:proofErr w:type="spellStart"/>
+      <w:r>
+        <w:t>receiveMessage</w:t>
+      </w:r>
+      <w:proofErr w:type="spellEnd"/>
+      <w:r>
+        <w:t>()</w:t>
+      </w:r>
+    </w:p>
+    <w:p>
+      <w:r>
+        <w:t xml:space="preserve">GUI2 --&gt; User2: </w:t>
+      </w:r>
+      <w:proofErr w:type="spellStart"/>
+      <w:r>
+        <w:t>viewChat</w:t>
+      </w:r>
+      <w:proofErr w:type="spellEnd"/>
+      <w:r>
+        <w:t>()</w:t>
+      </w:r>
+    </w:p>
+    <w:p/>
+    <w:p>
+      <w:proofErr w:type="spellStart"/>
+      <w:r>
+        <w:t>ClientHandler</w:t>
+      </w:r>
+      <w:proofErr w:type="spellEnd"/>
+      <w:r>
+        <w:t xml:space="preserve"> --&gt; </w:t>
+      </w:r>
+      <w:proofErr w:type="spellStart"/>
+      <w:r>
+        <w:t>ClientNetwork</w:t>
+      </w:r>
+      <w:proofErr w:type="spellEnd"/>
+      <w:r>
+        <w:t>: delivery confirmation</w:t>
+      </w:r>
+    </w:p>
+    <w:p>
+      <w:proofErr w:type="spellStart"/>
+      <w:r>
+        <w:t>ClientNetwork</w:t>
+      </w:r>
+      <w:proofErr w:type="spellEnd"/>
+      <w:r>
+        <w:t xml:space="preserve"> --&gt; GUI1: message delivered</w:t>
+      </w:r>
+    </w:p>
+    <w:p>
+      <w:r>
+        <w:t>GUI1 --&gt; User1: view sent message</w:t>
+      </w:r>
+    </w:p>
+    <w:p/>
+    <w:p>
+      <w:r>
+        <w:t>@enduml</w:t>
       </w:r>
     </w:p>
     <w:p/>
@@ -11088,55 +13750,164 @@
       <w:rPr>
         <w:noProof/>
       </w:rPr>
-      <w:pict w14:anchorId="69DF42EA">
-        <v:rect id="Frame1" o:spid="_x0000_s1026" style="position:absolute;margin-left:0;margin-top:.05pt;width:4.65pt;height:9.35pt;z-index:-503316473;visibility:visible;mso-wrap-style:square;mso-wrap-distance-left:0;mso-wrap-distance-top:0;mso-wrap-distance-right:0;mso-wrap-distance-bottom:0;mso-position-horizontal:center;mso-position-horizontal-relative:margin;mso-position-vertical:absolute;mso-position-vertical-relative:text;v-text-anchor:top" o:gfxdata="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" o:allowincell="f" filled="f" stroked="f" strokeweight="0">
-          <v:textbox inset="0,0,0,0">
-            <w:txbxContent>
-              <w:p>
-                <w:pPr>
-                  <w:pStyle w:val="Footer"/>
-                </w:pPr>
-                <w:r>
-                  <w:rPr>
-                    <w:rStyle w:val="PageNumber"/>
-                    <w:color w:val="000000"/>
-                  </w:rPr>
-                  <w:fldChar w:fldCharType="begin"/>
-                </w:r>
-                <w:r>
-                  <w:rPr>
-                    <w:rStyle w:val="PageNumber"/>
-                    <w:color w:val="000000"/>
-                  </w:rPr>
-                  <w:instrText>PAGE</w:instrText>
-                </w:r>
-                <w:r>
-                  <w:rPr>
-                    <w:rStyle w:val="PageNumber"/>
-                    <w:color w:val="000000"/>
-                  </w:rPr>
-                  <w:fldChar w:fldCharType="separate"/>
-                </w:r>
-                <w:r>
-                  <w:rPr>
-                    <w:rStyle w:val="PageNumber"/>
-                    <w:color w:val="000000"/>
-                  </w:rPr>
-                  <w:t>ii</w:t>
-                </w:r>
-                <w:r>
-                  <w:rPr>
-                    <w:rStyle w:val="PageNumber"/>
-                    <w:color w:val="000000"/>
-                  </w:rPr>
-                  <w:fldChar w:fldCharType="end"/>
-                </w:r>
-              </w:p>
-            </w:txbxContent>
-          </v:textbox>
-          <w10:wrap type="square" side="largest" anchorx="margin"/>
-        </v:rect>
-      </w:pict>
+      <mc:AlternateContent>
+        <mc:Choice Requires="wps">
+          <w:drawing>
+            <wp:anchor distT="0" distB="0" distL="0" distR="0" simplePos="0" relativeHeight="7" behindDoc="1" locked="0" layoutInCell="0" allowOverlap="1" wp14:anchorId="6989005D" wp14:editId="3C1D58B1">
+              <wp:simplePos x="0" y="0"/>
+              <wp:positionH relativeFrom="margin">
+                <wp:align>center</wp:align>
+              </wp:positionH>
+              <wp:positionV relativeFrom="paragraph">
+                <wp:posOffset>635</wp:posOffset>
+              </wp:positionV>
+              <wp:extent cx="59055" cy="118745"/>
+              <wp:effectExtent l="0" t="0" r="0" b="0"/>
+              <wp:wrapSquare wrapText="largest"/>
+              <wp:docPr id="2000310669" name="Rectangle 15"/>
+              <wp:cNvGraphicFramePr>
+                <a:graphicFrameLocks xmlns:a="http://schemas.openxmlformats.org/drawingml/2006/main"/>
+              </wp:cNvGraphicFramePr>
+              <a:graphic xmlns:a="http://schemas.openxmlformats.org/drawingml/2006/main">
+                <a:graphicData uri="http://schemas.microsoft.com/office/word/2010/wordprocessingShape">
+                  <wps:wsp>
+                    <wps:cNvSpPr>
+                      <a:spLocks/>
+                    </wps:cNvSpPr>
+                    <wps:spPr>
+                      <a:xfrm>
+                        <a:off x="0" y="0"/>
+                        <a:ext cx="59055" cy="118745"/>
+                      </a:xfrm>
+                      <a:prstGeom prst="rect">
+                        <a:avLst/>
+                      </a:prstGeom>
+                      <a:noFill/>
+                      <a:ln w="0">
+                        <a:noFill/>
+                      </a:ln>
+                      <a:effectLst/>
+                    </wps:spPr>
+                    <wps:txbx>
+                      <w:txbxContent>
+                        <w:p>
+                          <w:pPr>
+                            <w:pStyle w:val="Footer"/>
+                          </w:pPr>
+                          <w:r>
+                            <w:rPr>
+                              <w:rStyle w:val="PageNumber"/>
+                              <w:color w:val="000000"/>
+                            </w:rPr>
+                            <w:fldChar w:fldCharType="begin"/>
+                          </w:r>
+                          <w:r>
+                            <w:rPr>
+                              <w:rStyle w:val="PageNumber"/>
+                              <w:color w:val="000000"/>
+                            </w:rPr>
+                            <w:instrText>PAGE</w:instrText>
+                          </w:r>
+                          <w:r>
+                            <w:rPr>
+                              <w:rStyle w:val="PageNumber"/>
+                              <w:color w:val="000000"/>
+                            </w:rPr>
+                            <w:fldChar w:fldCharType="separate"/>
+                          </w:r>
+                          <w:r>
+                            <w:rPr>
+                              <w:rStyle w:val="PageNumber"/>
+                              <w:color w:val="000000"/>
+                            </w:rPr>
+                            <w:t>ii</w:t>
+                          </w:r>
+                          <w:r>
+                            <w:rPr>
+                              <w:rStyle w:val="PageNumber"/>
+                              <w:color w:val="000000"/>
+                            </w:rPr>
+                            <w:fldChar w:fldCharType="end"/>
+                          </w:r>
+                        </w:p>
+                      </w:txbxContent>
+                    </wps:txbx>
+                    <wps:bodyPr lIns="0" tIns="0" rIns="0" bIns="0">
+                      <a:noAutofit/>
+                    </wps:bodyPr>
+                  </wps:wsp>
+                </a:graphicData>
+              </a:graphic>
+              <wp14:sizeRelH relativeFrom="page">
+                <wp14:pctWidth>0</wp14:pctWidth>
+              </wp14:sizeRelH>
+              <wp14:sizeRelV relativeFrom="page">
+                <wp14:pctHeight>0</wp14:pctHeight>
+              </wp14:sizeRelV>
+            </wp:anchor>
+          </w:drawing>
+        </mc:Choice>
+        <mc:Fallback>
+          <w:pict>
+            <v:rect w14:anchorId="6989005D" id="Rectangle 15" o:spid="_x0000_s1026" style="position:absolute;margin-left:0;margin-top:.05pt;width:4.65pt;height:9.35pt;z-index:-503316473;visibility:visible;mso-wrap-style:square;mso-width-percent:0;mso-height-percent:0;mso-wrap-distance-left:0;mso-wrap-distance-top:0;mso-wrap-distance-right:0;mso-wrap-distance-bottom:0;mso-position-horizontal:center;mso-position-horizontal-relative:margin;mso-position-vertical:absolute;mso-position-vertical-relative:text;mso-width-percent:0;mso-height-percent:0;mso-width-relative:page;mso-height-relative:page;v-text-anchor:top" o:gfxdata="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" o:allowincell="f" filled="f" stroked="f" strokeweight="0">
+              <v:textbox inset="0,0,0,0">
+                <w:txbxContent>
+                  <w:p>
+                    <w:pPr>
+                      <w:pStyle w:val="Footer"/>
+                    </w:pPr>
+                    <w:r>
+                      <w:rPr>
+                        <w:rStyle w:val="PageNumber"/>
+                        <w:color w:val="000000"/>
+                      </w:rPr>
+                      <w:fldChar w:fldCharType="begin"/>
+                    </w:r>
+                    <w:r>
+                      <w:rPr>
+                        <w:rStyle w:val="PageNumber"/>
+                        <w:color w:val="000000"/>
+                      </w:rPr>
+                      <w:instrText>PAGE</w:instrText>
+                    </w:r>
+                    <w:r>
+                      <w:rPr>
+                        <w:rStyle w:val="PageNumber"/>
+                        <w:color w:val="000000"/>
+                      </w:rPr>
+                      <w:fldChar w:fldCharType="separate"/>
+                    </w:r>
+                    <w:r>
+                      <w:rPr>
+                        <w:rStyle w:val="PageNumber"/>
+                        <w:color w:val="000000"/>
+                      </w:rPr>
+                      <w:t>i</w:t>
+                    </w:r>
+                    <w:proofErr w:type="spellStart"/>
+                    <w:r>
+                      <w:rPr>
+                        <w:rStyle w:val="PageNumber"/>
+                        <w:color w:val="000000"/>
+                      </w:rPr>
+                      <w:t>i</w:t>
+                    </w:r>
+                    <w:proofErr w:type="spellEnd"/>
+                    <w:r>
+                      <w:rPr>
+                        <w:rStyle w:val="PageNumber"/>
+                        <w:color w:val="000000"/>
+                      </w:rPr>
+                      <w:fldChar w:fldCharType="end"/>
+                    </w:r>
+                  </w:p>
+                </w:txbxContent>
+              </v:textbox>
+              <w10:wrap type="square" side="largest" anchorx="margin"/>
+            </v:rect>
+          </w:pict>
+        </mc:Fallback>
+      </mc:AlternateContent>
     </w:r>
   </w:p>
 </w:ftr>
@@ -11152,55 +13923,164 @@
       <w:rPr>
         <w:noProof/>
       </w:rPr>
-      <w:pict w14:anchorId="3D83149B">
-        <v:rect id="Frame2" o:spid="_x0000_s1025" style="position:absolute;margin-left:0;margin-top:.05pt;width:5.65pt;height:1.8pt;z-index:-503316474;visibility:visible;mso-wrap-style:square;mso-wrap-distance-left:0;mso-wrap-distance-top:0;mso-wrap-distance-right:0;mso-wrap-distance-bottom:0;mso-position-horizontal:center;mso-position-horizontal-relative:margin;mso-position-vertical:absolute;mso-position-vertical-relative:text;v-text-anchor:top" o:gfxdata="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" o:allowincell="f" filled="f" stroked="f" strokeweight="0">
-          <v:textbox inset="0,0,0,0">
-            <w:txbxContent>
-              <w:p>
-                <w:pPr>
-                  <w:pStyle w:val="Footer"/>
-                </w:pPr>
-                <w:r>
-                  <w:rPr>
-                    <w:rStyle w:val="PageNumber"/>
-                    <w:color w:val="000000"/>
-                  </w:rPr>
-                  <w:fldChar w:fldCharType="begin"/>
-                </w:r>
-                <w:r>
-                  <w:rPr>
-                    <w:rStyle w:val="PageNumber"/>
-                    <w:color w:val="000000"/>
-                  </w:rPr>
-                  <w:instrText>PAGE</w:instrText>
-                </w:r>
-                <w:r>
-                  <w:rPr>
-                    <w:rStyle w:val="PageNumber"/>
-                    <w:color w:val="000000"/>
-                  </w:rPr>
-                  <w:fldChar w:fldCharType="separate"/>
-                </w:r>
-                <w:r>
-                  <w:rPr>
-                    <w:rStyle w:val="PageNumber"/>
-                    <w:color w:val="000000"/>
-                  </w:rPr>
-                  <w:t>viii</w:t>
-                </w:r>
-                <w:r>
-                  <w:rPr>
-                    <w:rStyle w:val="PageNumber"/>
-                    <w:color w:val="000000"/>
-                  </w:rPr>
-                  <w:fldChar w:fldCharType="end"/>
-                </w:r>
-              </w:p>
-            </w:txbxContent>
-          </v:textbox>
-          <w10:wrap type="square" side="largest" anchorx="margin"/>
-        </v:rect>
-      </w:pict>
+      <mc:AlternateContent>
+        <mc:Choice Requires="wps">
+          <w:drawing>
+            <wp:anchor distT="0" distB="0" distL="0" distR="0" simplePos="0" relativeHeight="6" behindDoc="1" locked="0" layoutInCell="0" allowOverlap="1" wp14:anchorId="416A84A7" wp14:editId="65179284">
+              <wp:simplePos x="0" y="0"/>
+              <wp:positionH relativeFrom="margin">
+                <wp:align>center</wp:align>
+              </wp:positionH>
+              <wp:positionV relativeFrom="paragraph">
+                <wp:posOffset>635</wp:posOffset>
+              </wp:positionV>
+              <wp:extent cx="71755" cy="22860"/>
+              <wp:effectExtent l="0" t="0" r="0" b="0"/>
+              <wp:wrapSquare wrapText="largest"/>
+              <wp:docPr id="76443807" name="Rectangle 13"/>
+              <wp:cNvGraphicFramePr>
+                <a:graphicFrameLocks xmlns:a="http://schemas.openxmlformats.org/drawingml/2006/main"/>
+              </wp:cNvGraphicFramePr>
+              <a:graphic xmlns:a="http://schemas.openxmlformats.org/drawingml/2006/main">
+                <a:graphicData uri="http://schemas.microsoft.com/office/word/2010/wordprocessingShape">
+                  <wps:wsp>
+                    <wps:cNvSpPr>
+                      <a:spLocks/>
+                    </wps:cNvSpPr>
+                    <wps:spPr>
+                      <a:xfrm>
+                        <a:off x="0" y="0"/>
+                        <a:ext cx="71755" cy="22860"/>
+                      </a:xfrm>
+                      <a:prstGeom prst="rect">
+                        <a:avLst/>
+                      </a:prstGeom>
+                      <a:noFill/>
+                      <a:ln w="0">
+                        <a:noFill/>
+                      </a:ln>
+                      <a:effectLst/>
+                    </wps:spPr>
+                    <wps:txbx>
+                      <w:txbxContent>
+                        <w:p>
+                          <w:pPr>
+                            <w:pStyle w:val="Footer"/>
+                          </w:pPr>
+                          <w:r>
+                            <w:rPr>
+                              <w:rStyle w:val="PageNumber"/>
+                              <w:color w:val="000000"/>
+                            </w:rPr>
+                            <w:fldChar w:fldCharType="begin"/>
+                          </w:r>
+                          <w:r>
+                            <w:rPr>
+                              <w:rStyle w:val="PageNumber"/>
+                              <w:color w:val="000000"/>
+                            </w:rPr>
+                            <w:instrText>PAGE</w:instrText>
+                          </w:r>
+                          <w:r>
+                            <w:rPr>
+                              <w:rStyle w:val="PageNumber"/>
+                              <w:color w:val="000000"/>
+                            </w:rPr>
+                            <w:fldChar w:fldCharType="separate"/>
+                          </w:r>
+                          <w:r>
+                            <w:rPr>
+                              <w:rStyle w:val="PageNumber"/>
+                              <w:color w:val="000000"/>
+                            </w:rPr>
+                            <w:t>viii</w:t>
+                          </w:r>
+                          <w:r>
+                            <w:rPr>
+                              <w:rStyle w:val="PageNumber"/>
+                              <w:color w:val="000000"/>
+                            </w:rPr>
+                            <w:fldChar w:fldCharType="end"/>
+                          </w:r>
+                        </w:p>
+                      </w:txbxContent>
+                    </wps:txbx>
+                    <wps:bodyPr lIns="0" tIns="0" rIns="0" bIns="0">
+                      <a:noAutofit/>
+                    </wps:bodyPr>
+                  </wps:wsp>
+                </a:graphicData>
+              </a:graphic>
+              <wp14:sizeRelH relativeFrom="page">
+                <wp14:pctWidth>0</wp14:pctWidth>
+              </wp14:sizeRelH>
+              <wp14:sizeRelV relativeFrom="page">
+                <wp14:pctHeight>0</wp14:pctHeight>
+              </wp14:sizeRelV>
+            </wp:anchor>
+          </w:drawing>
+        </mc:Choice>
+        <mc:Fallback>
+          <w:pict>
+            <v:rect w14:anchorId="416A84A7" id="Rectangle 13" o:spid="_x0000_s1027" style="position:absolute;margin-left:0;margin-top:.05pt;width:5.65pt;height:1.8pt;z-index:-503316474;visibility:visible;mso-wrap-style:square;mso-width-percent:0;mso-height-percent:0;mso-wrap-distance-left:0;mso-wrap-distance-top:0;mso-wrap-distance-right:0;mso-wrap-distance-bottom:0;mso-position-horizontal:center;mso-position-horizontal-relative:margin;mso-position-vertical:absolute;mso-position-vertical-relative:text;mso-width-percent:0;mso-height-percent:0;mso-width-relative:page;mso-height-relative:page;v-text-anchor:top" o:gfxdata="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" o:allowincell="f" filled="f" stroked="f" strokeweight="0">
+              <v:textbox inset="0,0,0,0">
+                <w:txbxContent>
+                  <w:p>
+                    <w:pPr>
+                      <w:pStyle w:val="Footer"/>
+                    </w:pPr>
+                    <w:r>
+                      <w:rPr>
+                        <w:rStyle w:val="PageNumber"/>
+                        <w:color w:val="000000"/>
+                      </w:rPr>
+                      <w:fldChar w:fldCharType="begin"/>
+                    </w:r>
+                    <w:r>
+                      <w:rPr>
+                        <w:rStyle w:val="PageNumber"/>
+                        <w:color w:val="000000"/>
+                      </w:rPr>
+                      <w:instrText>PAGE</w:instrText>
+                    </w:r>
+                    <w:r>
+                      <w:rPr>
+                        <w:rStyle w:val="PageNumber"/>
+                        <w:color w:val="000000"/>
+                      </w:rPr>
+                      <w:fldChar w:fldCharType="separate"/>
+                    </w:r>
+                    <w:r>
+                      <w:rPr>
+                        <w:rStyle w:val="PageNumber"/>
+                        <w:color w:val="000000"/>
+                      </w:rPr>
+                      <w:t>vii</w:t>
+                    </w:r>
+                    <w:proofErr w:type="spellStart"/>
+                    <w:r>
+                      <w:rPr>
+                        <w:rStyle w:val="PageNumber"/>
+                        <w:color w:val="000000"/>
+                      </w:rPr>
+                      <w:t>i</w:t>
+                    </w:r>
+                    <w:proofErr w:type="spellEnd"/>
+                    <w:r>
+                      <w:rPr>
+                        <w:rStyle w:val="PageNumber"/>
+                        <w:color w:val="000000"/>
+                      </w:rPr>
+                      <w:fldChar w:fldCharType="end"/>
+                    </w:r>
+                  </w:p>
+                </w:txbxContent>
+              </v:textbox>
+              <w10:wrap type="square" side="largest" anchorx="margin"/>
+            </v:rect>
+          </w:pict>
+        </mc:Fallback>
+      </mc:AlternateContent>
     </w:r>
   </w:p>
 </w:ftr>

</xml_diff>